<commit_message>
docs: embed app demo success screenshot into submission reports
</commit_message>
<xml_diff>
--- a/docs/lab-01/LAB1_SUBMISSION_REPORT.docx
+++ b/docs/lab-01/LAB1_SUBMISSION_REPORT.docx
@@ -1741,6 +1741,8 @@
         <w:spacing w:before="120"/>
         <w:rPr>
           <w:rFonts w:ascii="CMU Serif" w:hAnsi="CMU Serif" w:cs="CMU Serif"/>
+          <w:b/>
+          <w:sz w:val="22"/>
         </w:rPr>
       </w:pPr>
       <w:proofErr w:type="gramStart"/>
@@ -1748,6 +1750,7 @@
         <w:rPr>
           <w:rFonts w:ascii="CMU Serif" w:hAnsi="CMU Serif" w:cs="CMU Serif"/>
           <w:b/>
+          <w:sz w:val="22"/>
         </w:rPr>
         <w:t>Reviewer</w:t>
       </w:r>
@@ -1756,13 +1759,71 @@
         <w:rPr>
           <w:rFonts w:ascii="CMU Serif" w:hAnsi="CMU Serif" w:cs="CMU Serif"/>
           <w:b/>
+          <w:sz w:val="22"/>
         </w:rPr>
         <w:t xml:space="preserve"> comment I received:</w:t>
       </w:r>
-      <w:r>
+    </w:p>
+    <w:p>
+      <w:pPr>
+        <w:spacing w:before="120"/>
         <w:rPr>
           <w:rFonts w:ascii="CMU Serif" w:hAnsi="CMU Serif" w:cs="CMU Serif"/>
           <w:b/>
+          <w:bCs/>
+          <w:sz w:val="22"/>
+        </w:rPr>
+      </w:pPr>
+      <w:r>
+        <w:rPr>
+          <w:rFonts w:ascii="CMU Serif" w:hAnsi="CMU Serif" w:cs="CMU Serif"/>
+          <w:b/>
+          <w:sz w:val="22"/>
+        </w:rPr>
+        <w:t>Feature 1:</w:t>
+      </w:r>
+      <w:r>
+        <w:rPr>
+          <w:rFonts w:ascii="CMU Serif" w:hAnsi="CMU Serif" w:cs="CMU Serif"/>
+          <w:b/>
+          <w:sz w:val="22"/>
+        </w:rPr>
+        <w:t xml:space="preserve"> </w:t>
+      </w:r>
+      <w:r>
+        <w:rPr>
+          <w:rFonts w:ascii="CMU Serif" w:hAnsi="CMU Serif" w:cs="CMU Serif"/>
+          <w:b/>
+          <w:bCs/>
+          <w:sz w:val="22"/>
+        </w:rPr>
+        <w:t xml:space="preserve">set up </w:t>
+      </w:r>
+      <w:proofErr w:type="spellStart"/>
+      <w:r>
+        <w:rPr>
+          <w:rFonts w:ascii="CMU Serif" w:hAnsi="CMU Serif" w:cs="CMU Serif"/>
+          <w:b/>
+          <w:bCs/>
+          <w:sz w:val="22"/>
+        </w:rPr>
+        <w:t>TokTickIT</w:t>
+      </w:r>
+      <w:proofErr w:type="spellEnd"/>
+      <w:r>
+        <w:rPr>
+          <w:rFonts w:ascii="CMU Serif" w:hAnsi="CMU Serif" w:cs="CMU Serif"/>
+          <w:b/>
+          <w:bCs/>
+          <w:sz w:val="22"/>
+        </w:rPr>
+        <w:t xml:space="preserve"> project foundation (Issue #1)</w:t>
+      </w:r>
+      <w:r>
+        <w:rPr>
+          <w:rFonts w:ascii="CMU Serif" w:hAnsi="CMU Serif" w:cs="CMU Serif"/>
+          <w:b/>
+          <w:sz w:val="22"/>
         </w:rPr>
         <w:br/>
       </w:r>
@@ -1771,907 +1832,716 @@
           <w:rFonts w:ascii="CMU Serif" w:hAnsi="CMU Serif" w:cs="CMU Serif"/>
           <w:i/>
         </w:rPr>
-        <w:t>“</w:t>
+        <w:drawing>
+          <wp:inline distT="0" distB="0" distL="0" distR="0" wp14:anchorId="3BAE8D1B" wp14:editId="64B13247">
+            <wp:extent cx="4539048" cy="2638641"/>
+            <wp:effectExtent l="0" t="0" r="0" b="9525"/>
+            <wp:docPr id="976454477" name="Picture 1"/>
+            <wp:cNvGraphicFramePr>
+              <a:graphicFrameLocks xmlns:a="http://schemas.openxmlformats.org/drawingml/2006/main" noChangeAspect="1"/>
+            </wp:cNvGraphicFramePr>
+            <a:graphic xmlns:a="http://schemas.openxmlformats.org/drawingml/2006/main">
+              <a:graphicData uri="http://schemas.openxmlformats.org/drawingml/2006/picture">
+                <pic:pic xmlns:pic="http://schemas.openxmlformats.org/drawingml/2006/picture">
+                  <pic:nvPicPr>
+                    <pic:cNvPr id="976454477" name=""/>
+                    <pic:cNvPicPr/>
+                  </pic:nvPicPr>
+                  <pic:blipFill>
+                    <a:blip r:embed="rId10"/>
+                    <a:stretch>
+                      <a:fillRect/>
+                    </a:stretch>
+                  </pic:blipFill>
+                  <pic:spPr>
+                    <a:xfrm>
+                      <a:off x="0" y="0"/>
+                      <a:ext cx="4598693" cy="2673314"/>
+                    </a:xfrm>
+                    <a:prstGeom prst="rect">
+                      <a:avLst/>
+                    </a:prstGeom>
+                  </pic:spPr>
+                </pic:pic>
+              </a:graphicData>
+            </a:graphic>
+          </wp:inline>
+        </w:drawing>
+      </w:r>
+    </w:p>
+    <w:p>
+      <w:pPr>
+        <w:spacing w:before="120"/>
+        <w:rPr>
+          <w:rFonts w:ascii="CMU Serif" w:hAnsi="CMU Serif" w:cs="CMU Serif"/>
+          <w:b/>
+          <w:bCs/>
+          <w:sz w:val="22"/>
+        </w:rPr>
+      </w:pPr>
+      <w:r>
+        <w:rPr>
+          <w:rFonts w:ascii="CMU Serif" w:hAnsi="CMU Serif" w:cs="CMU Serif"/>
+          <w:b/>
+          <w:bCs/>
+          <w:sz w:val="22"/>
+        </w:rPr>
+        <w:t>Feature 2: Implement GET /</w:t>
       </w:r>
       <w:proofErr w:type="spellStart"/>
       <w:r>
         <w:rPr>
-          <w:rFonts w:ascii="Browallia New" w:hAnsi="Browallia New" w:cs="Browallia New"/>
+          <w:rFonts w:ascii="CMU Serif" w:hAnsi="CMU Serif" w:cs="CMU Serif"/>
+          <w:b/>
+          <w:bCs/>
+          <w:sz w:val="22"/>
+        </w:rPr>
+        <w:t>api</w:t>
+      </w:r>
+      <w:proofErr w:type="spellEnd"/>
+      <w:r>
+        <w:rPr>
+          <w:rFonts w:ascii="CMU Serif" w:hAnsi="CMU Serif" w:cs="CMU Serif"/>
+          <w:b/>
+          <w:bCs/>
+          <w:sz w:val="22"/>
+        </w:rPr>
+        <w:t>/health endpoint (Issue #2)</w:t>
+      </w:r>
+    </w:p>
+    <w:p>
+      <w:pPr>
+        <w:spacing w:before="120"/>
+        <w:rPr>
+          <w:rFonts w:ascii="CMU Serif" w:hAnsi="CMU Serif" w:cs="CMU Serif"/>
           <w:i/>
-          <w:lang w:bidi="th-TH"/>
-        </w:rPr>
-        <w:t>โดยรวมทำได้ค่อนข้างครบตาม</w:t>
-      </w:r>
-      <w:proofErr w:type="spellEnd"/>
+        </w:rPr>
+      </w:pPr>
       <w:r>
         <w:rPr>
           <w:rFonts w:ascii="CMU Serif" w:hAnsi="CMU Serif" w:cs="CMU Serif"/>
           <w:i/>
         </w:rPr>
-        <w:t xml:space="preserve"> requirement </w:t>
-      </w:r>
-      <w:proofErr w:type="spellStart"/>
-      <w:r>
-        <w:rPr>
-          <w:rFonts w:ascii="Browallia New" w:hAnsi="Browallia New" w:cs="Browallia New"/>
+        <w:drawing>
+          <wp:inline distT="0" distB="0" distL="0" distR="0" wp14:anchorId="1D11C7F0" wp14:editId="0BA24C75">
+            <wp:extent cx="4893275" cy="1983348"/>
+            <wp:effectExtent l="0" t="0" r="3175" b="0"/>
+            <wp:docPr id="938093201" name="Picture 1"/>
+            <wp:cNvGraphicFramePr>
+              <a:graphicFrameLocks xmlns:a="http://schemas.openxmlformats.org/drawingml/2006/main" noChangeAspect="1"/>
+            </wp:cNvGraphicFramePr>
+            <a:graphic xmlns:a="http://schemas.openxmlformats.org/drawingml/2006/main">
+              <a:graphicData uri="http://schemas.openxmlformats.org/drawingml/2006/picture">
+                <pic:pic xmlns:pic="http://schemas.openxmlformats.org/drawingml/2006/picture">
+                  <pic:nvPicPr>
+                    <pic:cNvPr id="938093201" name=""/>
+                    <pic:cNvPicPr/>
+                  </pic:nvPicPr>
+                  <pic:blipFill rotWithShape="1">
+                    <a:blip r:embed="rId11"/>
+                    <a:srcRect t="3121"/>
+                    <a:stretch>
+                      <a:fillRect/>
+                    </a:stretch>
+                  </pic:blipFill>
+                  <pic:spPr bwMode="auto">
+                    <a:xfrm>
+                      <a:off x="0" y="0"/>
+                      <a:ext cx="4905206" cy="1988184"/>
+                    </a:xfrm>
+                    <a:prstGeom prst="rect">
+                      <a:avLst/>
+                    </a:prstGeom>
+                    <a:ln>
+                      <a:noFill/>
+                    </a:ln>
+                    <a:extLst>
+                      <a:ext uri="{53640926-AAD7-44D8-BBD7-CCE9431645EC}">
+                        <a14:shadowObscured xmlns:a14="http://schemas.microsoft.com/office/drawing/2010/main"/>
+                      </a:ext>
+                    </a:extLst>
+                  </pic:spPr>
+                </pic:pic>
+              </a:graphicData>
+            </a:graphic>
+          </wp:inline>
+        </w:drawing>
+      </w:r>
+    </w:p>
+    <w:p>
+      <w:pPr>
+        <w:spacing w:before="120"/>
+        <w:rPr>
+          <w:rFonts w:ascii="CMU Serif" w:hAnsi="CMU Serif" w:cs="CMU Serif"/>
+          <w:b/>
+          <w:bCs/>
+          <w:iCs/>
+          <w:sz w:val="22"/>
+        </w:rPr>
+      </w:pPr>
+      <w:r>
+        <w:rPr>
+          <w:rFonts w:ascii="CMU Serif" w:hAnsi="CMU Serif" w:cs="CMU Serif"/>
+          <w:b/>
+          <w:bCs/>
+          <w:iCs/>
+          <w:sz w:val="22"/>
+        </w:rPr>
+        <w:lastRenderedPageBreak/>
+        <w:t>Feature 3: Create Category model and seed IT request categories (Issue #3)</w:t>
+      </w:r>
+      <w:r>
+        <w:rPr>
+          <w:rFonts w:ascii="CMU Serif" w:hAnsi="CMU Serif" w:cs="CMU Serif"/>
           <w:i/>
-          <w:lang w:bidi="th-TH"/>
-        </w:rPr>
-        <w:t>ทั้ง</w:t>
-      </w:r>
-      <w:proofErr w:type="spellEnd"/>
+        </w:rPr>
+        <w:t xml:space="preserve"> </w:t>
+      </w:r>
       <w:r>
         <w:rPr>
           <w:rFonts w:ascii="CMU Serif" w:hAnsi="CMU Serif" w:cs="CMU Serif"/>
           <w:i/>
         </w:rPr>
-        <w:t xml:space="preserve"> API, </w:t>
-      </w:r>
-      <w:proofErr w:type="spellStart"/>
-      <w:r>
-        <w:rPr>
-          <w:rFonts w:ascii="Browallia New" w:hAnsi="Browallia New" w:cs="Browallia New"/>
+        <w:drawing>
+          <wp:inline distT="0" distB="0" distL="0" distR="0" wp14:anchorId="0F9F302B" wp14:editId="1AF3881F">
+            <wp:extent cx="6309360" cy="4253230"/>
+            <wp:effectExtent l="0" t="0" r="0" b="0"/>
+            <wp:docPr id="1584611708" name="Picture 1"/>
+            <wp:cNvGraphicFramePr>
+              <a:graphicFrameLocks xmlns:a="http://schemas.openxmlformats.org/drawingml/2006/main" noChangeAspect="1"/>
+            </wp:cNvGraphicFramePr>
+            <a:graphic xmlns:a="http://schemas.openxmlformats.org/drawingml/2006/main">
+              <a:graphicData uri="http://schemas.openxmlformats.org/drawingml/2006/picture">
+                <pic:pic xmlns:pic="http://schemas.openxmlformats.org/drawingml/2006/picture">
+                  <pic:nvPicPr>
+                    <pic:cNvPr id="1584611708" name=""/>
+                    <pic:cNvPicPr/>
+                  </pic:nvPicPr>
+                  <pic:blipFill>
+                    <a:blip r:embed="rId12"/>
+                    <a:stretch>
+                      <a:fillRect/>
+                    </a:stretch>
+                  </pic:blipFill>
+                  <pic:spPr>
+                    <a:xfrm>
+                      <a:off x="0" y="0"/>
+                      <a:ext cx="6309360" cy="4253230"/>
+                    </a:xfrm>
+                    <a:prstGeom prst="rect">
+                      <a:avLst/>
+                    </a:prstGeom>
+                  </pic:spPr>
+                </pic:pic>
+              </a:graphicData>
+            </a:graphic>
+          </wp:inline>
+        </w:drawing>
+      </w:r>
+    </w:p>
+    <w:p>
+      <w:pPr>
+        <w:spacing w:before="120"/>
+        <w:rPr>
+          <w:rFonts w:ascii="CMU Serif" w:hAnsi="CMU Serif" w:cs="CMU Serif"/>
+          <w:b/>
+          <w:bCs/>
+        </w:rPr>
+      </w:pPr>
+      <w:r>
+        <w:rPr>
+          <w:rFonts w:ascii="CMU Serif" w:hAnsi="CMU Serif" w:cs="CMU Serif"/>
+          <w:b/>
+        </w:rPr>
+        <w:t>Feature 4: Display IT request category list and system status UI (Issue #4)</w:t>
+      </w:r>
+    </w:p>
+    <w:p>
+      <w:pPr>
+        <w:spacing w:before="120"/>
+        <w:rPr>
+          <w:rFonts w:ascii="CMU Serif" w:hAnsi="CMU Serif" w:cs="CMU Serif"/>
+          <w:b/>
+        </w:rPr>
+      </w:pPr>
+      <w:r>
+        <w:rPr>
+          <w:rFonts w:ascii="CMU Serif" w:hAnsi="CMU Serif" w:cs="CMU Serif"/>
           <w:i/>
-          <w:lang w:bidi="th-TH"/>
-        </w:rPr>
-        <w:t>การดึง</w:t>
-      </w:r>
-      <w:proofErr w:type="spellEnd"/>
+        </w:rPr>
+        <w:drawing>
+          <wp:inline distT="0" distB="0" distL="0" distR="0" wp14:anchorId="0EE8208C" wp14:editId="1BD5735F">
+            <wp:extent cx="6309360" cy="3278505"/>
+            <wp:effectExtent l="0" t="0" r="0" b="0"/>
+            <wp:docPr id="293656845" name="Picture 1"/>
+            <wp:cNvGraphicFramePr>
+              <a:graphicFrameLocks xmlns:a="http://schemas.openxmlformats.org/drawingml/2006/main" noChangeAspect="1"/>
+            </wp:cNvGraphicFramePr>
+            <a:graphic xmlns:a="http://schemas.openxmlformats.org/drawingml/2006/main">
+              <a:graphicData uri="http://schemas.openxmlformats.org/drawingml/2006/picture">
+                <pic:pic xmlns:pic="http://schemas.openxmlformats.org/drawingml/2006/picture">
+                  <pic:nvPicPr>
+                    <pic:cNvPr id="293656845" name=""/>
+                    <pic:cNvPicPr/>
+                  </pic:nvPicPr>
+                  <pic:blipFill>
+                    <a:blip r:embed="rId13"/>
+                    <a:stretch>
+                      <a:fillRect/>
+                    </a:stretch>
+                  </pic:blipFill>
+                  <pic:spPr>
+                    <a:xfrm>
+                      <a:off x="0" y="0"/>
+                      <a:ext cx="6309360" cy="3278505"/>
+                    </a:xfrm>
+                    <a:prstGeom prst="rect">
+                      <a:avLst/>
+                    </a:prstGeom>
+                  </pic:spPr>
+                </pic:pic>
+              </a:graphicData>
+            </a:graphic>
+          </wp:inline>
+        </w:drawing>
+      </w:r>
+    </w:p>
+    <w:p>
+      <w:pPr>
+        <w:spacing w:before="120"/>
+        <w:rPr>
+          <w:rFonts w:ascii="CMU Serif" w:hAnsi="CMU Serif" w:cs="CMU Serif"/>
+          <w:b/>
+        </w:rPr>
+      </w:pPr>
+    </w:p>
+    <w:p>
+      <w:pPr>
+        <w:spacing w:before="120"/>
+        <w:rPr>
+          <w:rFonts w:ascii="CMU Serif" w:hAnsi="CMU Serif" w:cs="CMU Serif"/>
+          <w:b/>
+          <w:bCs/>
+        </w:rPr>
+      </w:pPr>
       <w:r>
         <w:rPr>
           <w:rFonts w:ascii="CMU Serif" w:hAnsi="CMU Serif" w:cs="CMU Serif"/>
           <w:i/>
         </w:rPr>
-        <w:t xml:space="preserve"> category </w:t>
-      </w:r>
-      <w:proofErr w:type="spellStart"/>
-      <w:r>
-        <w:rPr>
-          <w:rFonts w:ascii="Browallia New" w:hAnsi="Browallia New" w:cs="Browallia New"/>
+        <w:lastRenderedPageBreak/>
+        <w:drawing>
+          <wp:inline distT="0" distB="0" distL="0" distR="0" wp14:anchorId="52C6E0AE" wp14:editId="76E45BB8">
+            <wp:extent cx="5173362" cy="3437453"/>
+            <wp:effectExtent l="0" t="0" r="8255" b="0"/>
+            <wp:docPr id="1461260541" name="Picture 1"/>
+            <wp:cNvGraphicFramePr>
+              <a:graphicFrameLocks xmlns:a="http://schemas.openxmlformats.org/drawingml/2006/main" noChangeAspect="1"/>
+            </wp:cNvGraphicFramePr>
+            <a:graphic xmlns:a="http://schemas.openxmlformats.org/drawingml/2006/main">
+              <a:graphicData uri="http://schemas.openxmlformats.org/drawingml/2006/picture">
+                <pic:pic xmlns:pic="http://schemas.openxmlformats.org/drawingml/2006/picture">
+                  <pic:nvPicPr>
+                    <pic:cNvPr id="1461260541" name=""/>
+                    <pic:cNvPicPr/>
+                  </pic:nvPicPr>
+                  <pic:blipFill>
+                    <a:blip r:embed="rId14"/>
+                    <a:stretch>
+                      <a:fillRect/>
+                    </a:stretch>
+                  </pic:blipFill>
+                  <pic:spPr>
+                    <a:xfrm>
+                      <a:off x="0" y="0"/>
+                      <a:ext cx="5177664" cy="3440311"/>
+                    </a:xfrm>
+                    <a:prstGeom prst="rect">
+                      <a:avLst/>
+                    </a:prstGeom>
+                  </pic:spPr>
+                </pic:pic>
+              </a:graphicData>
+            </a:graphic>
+          </wp:inline>
+        </w:drawing>
+      </w:r>
+      <w:r>
+        <w:rPr>
+          <w:rFonts w:ascii="CMU Serif" w:hAnsi="CMU Serif" w:cs="CMU Serif"/>
           <w:i/>
-          <w:lang w:bidi="th-TH"/>
-        </w:rPr>
-        <w:t>มาแสดงใน</w:t>
-      </w:r>
-      <w:proofErr w:type="spellEnd"/>
+        </w:rPr>
+        <w:br/>
+      </w:r>
+      <w:r>
+        <w:rPr>
+          <w:rFonts w:ascii="CMU Serif" w:hAnsi="CMU Serif" w:cs="CMU Serif"/>
+          <w:b/>
+        </w:rPr>
+        <w:t>How I responded:</w:t>
+      </w:r>
+      <w:r>
+        <w:rPr>
+          <w:rFonts w:ascii="CMU Serif" w:hAnsi="CMU Serif" w:cs="CMU Serif"/>
+          <w:b/>
+        </w:rPr>
+        <w:br/>
+      </w:r>
       <w:r>
         <w:rPr>
           <w:rFonts w:ascii="CMU Serif" w:hAnsi="CMU Serif" w:cs="CMU Serif"/>
           <w:i/>
         </w:rPr>
-        <w:t xml:space="preserve"> UI </w:t>
-      </w:r>
-      <w:proofErr w:type="spellStart"/>
-      <w:r>
-        <w:rPr>
-          <w:rFonts w:ascii="Browallia New" w:hAnsi="Browallia New" w:cs="Browallia New"/>
+        <w:t>-</w:t>
+      </w:r>
+      <w:r>
+        <w:rPr>
+          <w:rFonts w:ascii="CMU Serif" w:hAnsi="CMU Serif" w:cs="CMU Serif"/>
           <w:i/>
-          <w:lang w:bidi="th-TH"/>
-        </w:rPr>
-        <w:t>และมีการรองรับ</w:t>
-      </w:r>
-      <w:proofErr w:type="spellEnd"/>
+        </w:rPr>
+        <w:br/>
+      </w:r>
+      <w:r>
+        <w:rPr>
+          <w:rFonts w:ascii="CMU Serif" w:hAnsi="CMU Serif" w:cs="CMU Serif"/>
+          <w:b/>
+        </w:rPr>
+        <w:t>Pull Requests I reviewed for my partner:</w:t>
+      </w:r>
+      <w:r>
+        <w:rPr>
+          <w:rFonts w:ascii="CMU Serif" w:hAnsi="CMU Serif" w:cs="CMU Serif"/>
+          <w:b/>
+        </w:rPr>
+        <w:br/>
+      </w:r>
       <w:r>
         <w:rPr>
           <w:rFonts w:ascii="CMU Serif" w:hAnsi="CMU Serif" w:cs="CMU Serif"/>
           <w:i/>
         </w:rPr>
-        <w:t xml:space="preserve"> Loading </w:t>
-      </w:r>
-      <w:proofErr w:type="spellStart"/>
-      <w:r>
-        <w:rPr>
-          <w:rFonts w:ascii="Browallia New" w:hAnsi="Browallia New" w:cs="Browallia New"/>
+        <w:drawing>
+          <wp:inline distT="0" distB="0" distL="0" distR="0" wp14:anchorId="09AAE8B7" wp14:editId="63FA2369">
+            <wp:extent cx="5321643" cy="2273053"/>
+            <wp:effectExtent l="0" t="0" r="0" b="0"/>
+            <wp:docPr id="1251105968" name="Picture 1"/>
+            <wp:cNvGraphicFramePr>
+              <a:graphicFrameLocks xmlns:a="http://schemas.openxmlformats.org/drawingml/2006/main" noChangeAspect="1"/>
+            </wp:cNvGraphicFramePr>
+            <a:graphic xmlns:a="http://schemas.openxmlformats.org/drawingml/2006/main">
+              <a:graphicData uri="http://schemas.openxmlformats.org/drawingml/2006/picture">
+                <pic:pic xmlns:pic="http://schemas.openxmlformats.org/drawingml/2006/picture">
+                  <pic:nvPicPr>
+                    <pic:cNvPr id="1251105968" name=""/>
+                    <pic:cNvPicPr/>
+                  </pic:nvPicPr>
+                  <pic:blipFill>
+                    <a:blip r:embed="rId15"/>
+                    <a:stretch>
+                      <a:fillRect/>
+                    </a:stretch>
+                  </pic:blipFill>
+                  <pic:spPr>
+                    <a:xfrm>
+                      <a:off x="0" y="0"/>
+                      <a:ext cx="5327858" cy="2275707"/>
+                    </a:xfrm>
+                    <a:prstGeom prst="rect">
+                      <a:avLst/>
+                    </a:prstGeom>
+                  </pic:spPr>
+                </pic:pic>
+              </a:graphicData>
+            </a:graphic>
+          </wp:inline>
+        </w:drawing>
+      </w:r>
+    </w:p>
+    <w:p>
+      <w:pPr>
+        <w:spacing w:before="120"/>
+        <w:rPr>
+          <w:rFonts w:ascii="CMU Serif" w:hAnsi="CMU Serif" w:cs="CMU Serif"/>
           <w:i/>
-          <w:lang w:bidi="th-TH"/>
-        </w:rPr>
-        <w:t>กับ</w:t>
-      </w:r>
-      <w:proofErr w:type="spellEnd"/>
+        </w:rPr>
+      </w:pPr>
       <w:r>
         <w:rPr>
           <w:rFonts w:ascii="CMU Serif" w:hAnsi="CMU Serif" w:cs="CMU Serif"/>
           <w:i/>
         </w:rPr>
-        <w:t xml:space="preserve"> Error state </w:t>
-      </w:r>
-      <w:proofErr w:type="spellStart"/>
-      <w:r>
-        <w:rPr>
-          <w:rFonts w:ascii="Browallia New" w:hAnsi="Browallia New" w:cs="Browallia New"/>
+        <w:drawing>
+          <wp:inline distT="0" distB="0" distL="0" distR="0" wp14:anchorId="754410BE" wp14:editId="6A5D6B7F">
+            <wp:extent cx="6309360" cy="2032000"/>
+            <wp:effectExtent l="0" t="0" r="0" b="6350"/>
+            <wp:docPr id="2132451295" name="Picture 1"/>
+            <wp:cNvGraphicFramePr>
+              <a:graphicFrameLocks xmlns:a="http://schemas.openxmlformats.org/drawingml/2006/main" noChangeAspect="1"/>
+            </wp:cNvGraphicFramePr>
+            <a:graphic xmlns:a="http://schemas.openxmlformats.org/drawingml/2006/main">
+              <a:graphicData uri="http://schemas.openxmlformats.org/drawingml/2006/picture">
+                <pic:pic xmlns:pic="http://schemas.openxmlformats.org/drawingml/2006/picture">
+                  <pic:nvPicPr>
+                    <pic:cNvPr id="2132451295" name=""/>
+                    <pic:cNvPicPr/>
+                  </pic:nvPicPr>
+                  <pic:blipFill>
+                    <a:blip r:embed="rId16"/>
+                    <a:stretch>
+                      <a:fillRect/>
+                    </a:stretch>
+                  </pic:blipFill>
+                  <pic:spPr>
+                    <a:xfrm>
+                      <a:off x="0" y="0"/>
+                      <a:ext cx="6309360" cy="2032000"/>
+                    </a:xfrm>
+                    <a:prstGeom prst="rect">
+                      <a:avLst/>
+                    </a:prstGeom>
+                  </pic:spPr>
+                </pic:pic>
+              </a:graphicData>
+            </a:graphic>
+          </wp:inline>
+        </w:drawing>
+      </w:r>
+    </w:p>
+    <w:p>
+      <w:pPr>
+        <w:spacing w:before="120"/>
+        <w:rPr>
+          <w:rFonts w:ascii="CMU Serif" w:hAnsi="CMU Serif" w:cs="CMU Serif"/>
           <w:i/>
-          <w:lang w:bidi="th-TH"/>
-        </w:rPr>
-        <w:t>ด้วย</w:t>
-      </w:r>
-      <w:proofErr w:type="spellEnd"/>
+        </w:rPr>
+      </w:pPr>
       <w:r>
         <w:rPr>
           <w:rFonts w:ascii="CMU Serif" w:hAnsi="CMU Serif" w:cs="CMU Serif"/>
           <w:i/>
         </w:rPr>
-        <w:t xml:space="preserve"> </w:t>
-      </w:r>
-      <w:proofErr w:type="spellStart"/>
-      <w:r>
-        <w:rPr>
-          <w:rFonts w:ascii="Browallia New" w:hAnsi="Browallia New" w:cs="Browallia New"/>
+        <w:lastRenderedPageBreak/>
+        <w:drawing>
+          <wp:inline distT="0" distB="0" distL="0" distR="0" wp14:anchorId="7164ECEF" wp14:editId="1682056A">
+            <wp:extent cx="4983891" cy="1890026"/>
+            <wp:effectExtent l="0" t="0" r="7620" b="0"/>
+            <wp:docPr id="533093269" name="Picture 1"/>
+            <wp:cNvGraphicFramePr>
+              <a:graphicFrameLocks xmlns:a="http://schemas.openxmlformats.org/drawingml/2006/main" noChangeAspect="1"/>
+            </wp:cNvGraphicFramePr>
+            <a:graphic xmlns:a="http://schemas.openxmlformats.org/drawingml/2006/main">
+              <a:graphicData uri="http://schemas.openxmlformats.org/drawingml/2006/picture">
+                <pic:pic xmlns:pic="http://schemas.openxmlformats.org/drawingml/2006/picture">
+                  <pic:nvPicPr>
+                    <pic:cNvPr id="533093269" name=""/>
+                    <pic:cNvPicPr/>
+                  </pic:nvPicPr>
+                  <pic:blipFill>
+                    <a:blip r:embed="rId17"/>
+                    <a:stretch>
+                      <a:fillRect/>
+                    </a:stretch>
+                  </pic:blipFill>
+                  <pic:spPr>
+                    <a:xfrm>
+                      <a:off x="0" y="0"/>
+                      <a:ext cx="4995656" cy="1894488"/>
+                    </a:xfrm>
+                    <a:prstGeom prst="rect">
+                      <a:avLst/>
+                    </a:prstGeom>
+                  </pic:spPr>
+                </pic:pic>
+              </a:graphicData>
+            </a:graphic>
+          </wp:inline>
+        </w:drawing>
+      </w:r>
+    </w:p>
+    <w:p>
+      <w:pPr>
+        <w:spacing w:before="120"/>
+        <w:rPr>
+          <w:rFonts w:ascii="CMU Serif" w:hAnsi="CMU Serif" w:cs="CMU Serif"/>
           <w:i/>
-          <w:lang w:bidi="th-TH"/>
-        </w:rPr>
-        <w:t>แนะนำเพิ่มเติมว่าอาจลองทดสอบกรณี</w:t>
-      </w:r>
-      <w:proofErr w:type="spellEnd"/>
+        </w:rPr>
+      </w:pPr>
       <w:r>
         <w:rPr>
           <w:rFonts w:ascii="CMU Serif" w:hAnsi="CMU Serif" w:cs="CMU Serif"/>
           <w:i/>
         </w:rPr>
-        <w:t xml:space="preserve"> API </w:t>
-      </w:r>
-      <w:proofErr w:type="spellStart"/>
-      <w:r>
-        <w:rPr>
-          <w:rFonts w:ascii="Browallia New" w:hAnsi="Browallia New" w:cs="Browallia New"/>
+        <w:drawing>
+          <wp:inline distT="0" distB="0" distL="0" distR="0" wp14:anchorId="3758060C" wp14:editId="1D22BF84">
+            <wp:extent cx="4786183" cy="1744722"/>
+            <wp:effectExtent l="0" t="0" r="0" b="8255"/>
+            <wp:docPr id="619359284" name="Picture 1"/>
+            <wp:cNvGraphicFramePr>
+              <a:graphicFrameLocks xmlns:a="http://schemas.openxmlformats.org/drawingml/2006/main" noChangeAspect="1"/>
+            </wp:cNvGraphicFramePr>
+            <a:graphic xmlns:a="http://schemas.openxmlformats.org/drawingml/2006/main">
+              <a:graphicData uri="http://schemas.openxmlformats.org/drawingml/2006/picture">
+                <pic:pic xmlns:pic="http://schemas.openxmlformats.org/drawingml/2006/picture">
+                  <pic:nvPicPr>
+                    <pic:cNvPr id="619359284" name=""/>
+                    <pic:cNvPicPr/>
+                  </pic:nvPicPr>
+                  <pic:blipFill>
+                    <a:blip r:embed="rId18"/>
+                    <a:stretch>
+                      <a:fillRect/>
+                    </a:stretch>
+                  </pic:blipFill>
+                  <pic:spPr>
+                    <a:xfrm>
+                      <a:off x="0" y="0"/>
+                      <a:ext cx="4805725" cy="1751846"/>
+                    </a:xfrm>
+                    <a:prstGeom prst="rect">
+                      <a:avLst/>
+                    </a:prstGeom>
+                  </pic:spPr>
+                </pic:pic>
+              </a:graphicData>
+            </a:graphic>
+          </wp:inline>
+        </w:drawing>
+      </w:r>
+    </w:p>
+    <w:p>
+      <w:pPr>
+        <w:spacing w:before="120"/>
+        <w:rPr>
+          <w:rFonts w:ascii="CMU Serif" w:hAnsi="CMU Serif" w:cs="CMU Serif"/>
           <w:i/>
-          <w:lang w:bidi="th-TH"/>
-        </w:rPr>
-        <w:t>ตอบข้อมูลว่าง</w:t>
-      </w:r>
-      <w:proofErr w:type="spellEnd"/>
+        </w:rPr>
+      </w:pPr>
       <w:r>
         <w:rPr>
           <w:rFonts w:ascii="CMU Serif" w:hAnsi="CMU Serif" w:cs="CMU Serif"/>
           <w:i/>
         </w:rPr>
-        <w:t xml:space="preserve"> </w:t>
-      </w:r>
-      <w:proofErr w:type="spellStart"/>
-      <w:r>
-        <w:rPr>
-          <w:rFonts w:ascii="Browallia New" w:hAnsi="Browallia New" w:cs="Browallia New"/>
+        <w:drawing>
+          <wp:inline distT="0" distB="0" distL="0" distR="0" wp14:anchorId="7AD7F388" wp14:editId="00CDDA69">
+            <wp:extent cx="4184821" cy="1917621"/>
+            <wp:effectExtent l="0" t="0" r="6350" b="6985"/>
+            <wp:docPr id="61447258" name="Picture 1"/>
+            <wp:cNvGraphicFramePr>
+              <a:graphicFrameLocks xmlns:a="http://schemas.openxmlformats.org/drawingml/2006/main" noChangeAspect="1"/>
+            </wp:cNvGraphicFramePr>
+            <a:graphic xmlns:a="http://schemas.openxmlformats.org/drawingml/2006/main">
+              <a:graphicData uri="http://schemas.openxmlformats.org/drawingml/2006/picture">
+                <pic:pic xmlns:pic="http://schemas.openxmlformats.org/drawingml/2006/picture">
+                  <pic:nvPicPr>
+                    <pic:cNvPr id="61447258" name=""/>
+                    <pic:cNvPicPr/>
+                  </pic:nvPicPr>
+                  <pic:blipFill>
+                    <a:blip r:embed="rId19"/>
+                    <a:stretch>
+                      <a:fillRect/>
+                    </a:stretch>
+                  </pic:blipFill>
+                  <pic:spPr>
+                    <a:xfrm>
+                      <a:off x="0" y="0"/>
+                      <a:ext cx="4203627" cy="1926238"/>
+                    </a:xfrm>
+                    <a:prstGeom prst="rect">
+                      <a:avLst/>
+                    </a:prstGeom>
+                  </pic:spPr>
+                </pic:pic>
+              </a:graphicData>
+            </a:graphic>
+          </wp:inline>
+        </w:drawing>
+      </w:r>
+    </w:p>
+    <w:p>
+      <w:pPr>
+        <w:spacing w:before="120"/>
+        <w:rPr>
+          <w:rFonts w:ascii="CMU Serif" w:hAnsi="CMU Serif" w:cs="CMU Serif"/>
+          <w:b/>
+          <w:bCs/>
+        </w:rPr>
+      </w:pPr>
+      <w:r>
+        <w:rPr>
+          <w:rFonts w:ascii="CMU Serif" w:hAnsi="CMU Serif" w:cs="CMU Serif"/>
           <w:i/>
-          <w:lang w:bidi="th-TH"/>
-        </w:rPr>
-        <w:t>หรือไม่มี</w:t>
-      </w:r>
-      <w:proofErr w:type="spellEnd"/>
+        </w:rPr>
+        <w:drawing>
+          <wp:inline distT="0" distB="0" distL="0" distR="0" wp14:anchorId="03A89052" wp14:editId="536BB5D6">
+            <wp:extent cx="4160108" cy="1339809"/>
+            <wp:effectExtent l="0" t="0" r="0" b="0"/>
+            <wp:docPr id="1956485962" name="Picture 1"/>
+            <wp:cNvGraphicFramePr>
+              <a:graphicFrameLocks xmlns:a="http://schemas.openxmlformats.org/drawingml/2006/main" noChangeAspect="1"/>
+            </wp:cNvGraphicFramePr>
+            <a:graphic xmlns:a="http://schemas.openxmlformats.org/drawingml/2006/main">
+              <a:graphicData uri="http://schemas.openxmlformats.org/drawingml/2006/picture">
+                <pic:pic xmlns:pic="http://schemas.openxmlformats.org/drawingml/2006/picture">
+                  <pic:nvPicPr>
+                    <pic:cNvPr id="1956485962" name=""/>
+                    <pic:cNvPicPr/>
+                  </pic:nvPicPr>
+                  <pic:blipFill>
+                    <a:blip r:embed="rId16"/>
+                    <a:stretch>
+                      <a:fillRect/>
+                    </a:stretch>
+                  </pic:blipFill>
+                  <pic:spPr>
+                    <a:xfrm>
+                      <a:off x="0" y="0"/>
+                      <a:ext cx="4181986" cy="1346855"/>
+                    </a:xfrm>
+                    <a:prstGeom prst="rect">
+                      <a:avLst/>
+                    </a:prstGeom>
+                  </pic:spPr>
+                </pic:pic>
+              </a:graphicData>
+            </a:graphic>
+          </wp:inline>
+        </w:drawing>
+      </w:r>
       <w:r>
         <w:rPr>
           <w:rFonts w:ascii="CMU Serif" w:hAnsi="CMU Serif" w:cs="CMU Serif"/>
           <w:i/>
         </w:rPr>
-        <w:t xml:space="preserve"> category </w:t>
-      </w:r>
-      <w:proofErr w:type="spellStart"/>
-      <w:r>
-        <w:rPr>
-          <w:rFonts w:ascii="Browallia New" w:hAnsi="Browallia New" w:cs="Browallia New"/>
+        <w:br/>
+      </w:r>
+      <w:r>
+        <w:rPr>
+          <w:rFonts w:ascii="CMU Serif" w:hAnsi="CMU Serif" w:cs="CMU Serif"/>
           <w:i/>
-          <w:lang w:bidi="th-TH"/>
-        </w:rPr>
-        <w:t>เพื่อดูว่า</w:t>
-      </w:r>
-      <w:proofErr w:type="spellEnd"/>
+        </w:rPr>
+        <w:br/>
+      </w:r>
+      <w:r>
+        <w:rPr>
+          <w:rFonts w:ascii="CMU Serif" w:hAnsi="CMU Serif" w:cs="CMU Serif"/>
+          <w:b/>
+        </w:rPr>
+        <w:t>Partner's response:</w:t>
+      </w:r>
+      <w:r>
+        <w:rPr>
+          <w:rFonts w:ascii="CMU Serif" w:hAnsi="CMU Serif" w:cs="CMU Serif"/>
+          <w:b/>
+        </w:rPr>
+        <w:br/>
+      </w:r>
       <w:r>
         <w:rPr>
           <w:rFonts w:ascii="CMU Serif" w:hAnsi="CMU Serif" w:cs="CMU Serif"/>
           <w:i/>
         </w:rPr>
-        <w:t xml:space="preserve"> UI </w:t>
-      </w:r>
-      <w:proofErr w:type="spellStart"/>
-      <w:r>
-        <w:rPr>
-          <w:rFonts w:ascii="Browallia New" w:hAnsi="Browallia New" w:cs="Browallia New"/>
-          <w:i/>
-          <w:lang w:bidi="th-TH"/>
-        </w:rPr>
-        <w:t>จะแสดงผลอย่างไร</w:t>
-      </w:r>
-      <w:proofErr w:type="spellEnd"/>
-      <w:r>
-        <w:rPr>
-          <w:rFonts w:ascii="CMU Serif" w:hAnsi="CMU Serif" w:cs="CMU Serif"/>
-          <w:i/>
-        </w:rPr>
-        <w:t xml:space="preserve"> </w:t>
-      </w:r>
-      <w:proofErr w:type="spellStart"/>
-      <w:r>
-        <w:rPr>
-          <w:rFonts w:ascii="Browallia New" w:hAnsi="Browallia New" w:cs="Browallia New"/>
-          <w:i/>
-          <w:lang w:bidi="th-TH"/>
-        </w:rPr>
-        <w:t>จะช่วยให้รองรับ</w:t>
-      </w:r>
-      <w:proofErr w:type="spellEnd"/>
-      <w:r>
-        <w:rPr>
-          <w:rFonts w:ascii="CMU Serif" w:hAnsi="CMU Serif" w:cs="CMU Serif"/>
-          <w:i/>
-        </w:rPr>
-        <w:t xml:space="preserve"> edge case </w:t>
-      </w:r>
-      <w:proofErr w:type="spellStart"/>
-      <w:r>
-        <w:rPr>
-          <w:rFonts w:ascii="Browallia New" w:hAnsi="Browallia New" w:cs="Browallia New"/>
-          <w:i/>
-          <w:lang w:bidi="th-TH"/>
-        </w:rPr>
-        <w:t>ได้ครบขึ้น</w:t>
-      </w:r>
-      <w:proofErr w:type="spellEnd"/>
-      <w:r>
-        <w:rPr>
-          <w:rFonts w:ascii="CMU Serif" w:hAnsi="CMU Serif" w:cs="CMU Serif"/>
-          <w:i/>
-        </w:rPr>
-        <w:t>”</w:t>
-      </w:r>
-      <w:r>
-        <w:rPr>
-          <w:rFonts w:ascii="CMU Serif" w:hAnsi="CMU Serif" w:cs="CMU Serif"/>
-          <w:i/>
-        </w:rPr>
-        <w:br/>
-      </w:r>
-      <w:r>
-        <w:rPr>
-          <w:rFonts w:ascii="CMU Serif" w:hAnsi="CMU Serif" w:cs="CMU Serif"/>
-          <w:i/>
-        </w:rPr>
-        <w:br/>
-      </w:r>
-      <w:r>
-        <w:rPr>
-          <w:rFonts w:ascii="CMU Serif" w:hAnsi="CMU Serif" w:cs="CMU Serif"/>
-          <w:b/>
-        </w:rPr>
-        <w:t>How I responded:</w:t>
-      </w:r>
-      <w:r>
-        <w:rPr>
-          <w:rFonts w:ascii="CMU Serif" w:hAnsi="CMU Serif" w:cs="CMU Serif"/>
-          <w:b/>
-        </w:rPr>
-        <w:br/>
-      </w:r>
-      <w:r>
-        <w:rPr>
-          <w:rFonts w:ascii="CMU Serif" w:hAnsi="CMU Serif" w:cs="CMU Serif"/>
-          <w:i/>
-        </w:rPr>
-        <w:t>“</w:t>
-      </w:r>
-      <w:proofErr w:type="spellStart"/>
-      <w:r>
-        <w:rPr>
-          <w:rFonts w:ascii="Browallia New" w:hAnsi="Browallia New" w:cs="Browallia New"/>
-          <w:i/>
-          <w:lang w:bidi="th-TH"/>
-        </w:rPr>
-        <w:t>ขอบคุณสำหรับคำแนะนำ</w:t>
-      </w:r>
-      <w:proofErr w:type="spellEnd"/>
-      <w:r>
-        <w:rPr>
-          <w:rFonts w:ascii="CMU Serif" w:hAnsi="CMU Serif" w:cs="CMU Serif"/>
-          <w:i/>
-        </w:rPr>
-        <w:t xml:space="preserve"> </w:t>
-      </w:r>
-      <w:proofErr w:type="spellStart"/>
-      <w:r>
-        <w:rPr>
-          <w:rFonts w:ascii="Browallia New" w:hAnsi="Browallia New" w:cs="Browallia New"/>
-          <w:i/>
-          <w:lang w:bidi="th-TH"/>
-        </w:rPr>
-        <w:t>ได้อัปเดตไฟล์</w:t>
-      </w:r>
-      <w:proofErr w:type="spellEnd"/>
-      <w:r>
-        <w:rPr>
-          <w:rFonts w:ascii="CMU Serif" w:hAnsi="CMU Serif" w:cs="CMU Serif"/>
-          <w:i/>
-        </w:rPr>
-        <w:t xml:space="preserve"> client/</w:t>
-      </w:r>
-      <w:proofErr w:type="spellStart"/>
-      <w:r>
-        <w:rPr>
-          <w:rFonts w:ascii="CMU Serif" w:hAnsi="CMU Serif" w:cs="CMU Serif"/>
-          <w:i/>
-        </w:rPr>
-        <w:t>src</w:t>
-      </w:r>
-      <w:proofErr w:type="spellEnd"/>
-      <w:r>
-        <w:rPr>
-          <w:rFonts w:ascii="CMU Serif" w:hAnsi="CMU Serif" w:cs="CMU Serif"/>
-          <w:i/>
-        </w:rPr>
-        <w:t>/</w:t>
-      </w:r>
-      <w:proofErr w:type="spellStart"/>
-      <w:r>
-        <w:rPr>
-          <w:rFonts w:ascii="CMU Serif" w:hAnsi="CMU Serif" w:cs="CMU Serif"/>
-          <w:i/>
-        </w:rPr>
-        <w:t>App.tsx</w:t>
-      </w:r>
-      <w:proofErr w:type="spellEnd"/>
-      <w:r>
-        <w:rPr>
-          <w:rFonts w:ascii="CMU Serif" w:hAnsi="CMU Serif" w:cs="CMU Serif"/>
-          <w:i/>
-        </w:rPr>
-        <w:t xml:space="preserve"> </w:t>
-      </w:r>
-      <w:proofErr w:type="spellStart"/>
-      <w:r>
-        <w:rPr>
-          <w:rFonts w:ascii="Browallia New" w:hAnsi="Browallia New" w:cs="Browallia New"/>
-          <w:i/>
-          <w:lang w:bidi="th-TH"/>
-        </w:rPr>
-        <w:t>ให้รองรับกรณี</w:t>
-      </w:r>
-      <w:proofErr w:type="spellEnd"/>
-      <w:r>
-        <w:rPr>
-          <w:rFonts w:ascii="CMU Serif" w:hAnsi="CMU Serif" w:cs="CMU Serif"/>
-          <w:i/>
-        </w:rPr>
-        <w:t xml:space="preserve"> categories </w:t>
-      </w:r>
-      <w:proofErr w:type="spellStart"/>
-      <w:r>
-        <w:rPr>
-          <w:rFonts w:ascii="Browallia New" w:hAnsi="Browallia New" w:cs="Browallia New"/>
-          <w:i/>
-          <w:lang w:bidi="th-TH"/>
-        </w:rPr>
-        <w:t>เป็นลิสต์ว่าง</w:t>
-      </w:r>
-      <w:proofErr w:type="spellEnd"/>
-      <w:r>
-        <w:rPr>
-          <w:rFonts w:ascii="CMU Serif" w:hAnsi="CMU Serif" w:cs="CMU Serif"/>
-          <w:i/>
-        </w:rPr>
-        <w:t xml:space="preserve"> </w:t>
-      </w:r>
-      <w:proofErr w:type="spellStart"/>
-      <w:r>
-        <w:rPr>
-          <w:rFonts w:ascii="Browallia New" w:hAnsi="Browallia New" w:cs="Browallia New"/>
-          <w:i/>
-          <w:lang w:bidi="th-TH"/>
-        </w:rPr>
-        <w:t>โดยแสดงผลข้อความ</w:t>
-      </w:r>
-      <w:proofErr w:type="spellEnd"/>
-      <w:r>
-        <w:rPr>
-          <w:rFonts w:ascii="CMU Serif" w:hAnsi="CMU Serif" w:cs="CMU Serif"/>
-          <w:i/>
-        </w:rPr>
-        <w:t xml:space="preserve"> 'No categories found.' </w:t>
-      </w:r>
-      <w:proofErr w:type="spellStart"/>
-      <w:r>
-        <w:rPr>
-          <w:rFonts w:ascii="Browallia New" w:hAnsi="Browallia New" w:cs="Browallia New"/>
-          <w:i/>
-          <w:lang w:bidi="th-TH"/>
-        </w:rPr>
-        <w:t>พร้อมเพิ่ม</w:t>
-      </w:r>
-      <w:proofErr w:type="spellEnd"/>
-      <w:r>
-        <w:rPr>
-          <w:rFonts w:ascii="CMU Serif" w:hAnsi="CMU Serif" w:cs="CMU Serif"/>
-          <w:i/>
-        </w:rPr>
-        <w:t xml:space="preserve"> Unit Test </w:t>
-      </w:r>
-      <w:proofErr w:type="spellStart"/>
-      <w:r>
-        <w:rPr>
-          <w:rFonts w:ascii="Browallia New" w:hAnsi="Browallia New" w:cs="Browallia New"/>
-          <w:i/>
-          <w:lang w:bidi="th-TH"/>
-        </w:rPr>
-        <w:t>ตรวจสอบ</w:t>
-      </w:r>
-      <w:proofErr w:type="spellEnd"/>
-      <w:r>
-        <w:rPr>
-          <w:rFonts w:ascii="CMU Serif" w:hAnsi="CMU Serif" w:cs="CMU Serif"/>
-          <w:i/>
-        </w:rPr>
-        <w:t xml:space="preserve"> Edge case </w:t>
-      </w:r>
-      <w:proofErr w:type="spellStart"/>
-      <w:r>
-        <w:rPr>
-          <w:rFonts w:ascii="Browallia New" w:hAnsi="Browallia New" w:cs="Browallia New"/>
-          <w:i/>
-          <w:lang w:bidi="th-TH"/>
-        </w:rPr>
-        <w:t>นี้ใน</w:t>
-      </w:r>
-      <w:proofErr w:type="spellEnd"/>
-      <w:r>
-        <w:rPr>
-          <w:rFonts w:ascii="CMU Serif" w:hAnsi="CMU Serif" w:cs="CMU Serif"/>
-          <w:i/>
-        </w:rPr>
-        <w:t xml:space="preserve"> </w:t>
-      </w:r>
-      <w:proofErr w:type="spellStart"/>
-      <w:r>
-        <w:rPr>
-          <w:rFonts w:ascii="CMU Serif" w:hAnsi="CMU Serif" w:cs="CMU Serif"/>
-          <w:i/>
-        </w:rPr>
-        <w:t>App.test.tsx</w:t>
-      </w:r>
-      <w:proofErr w:type="spellEnd"/>
-      <w:r>
-        <w:rPr>
-          <w:rFonts w:ascii="CMU Serif" w:hAnsi="CMU Serif" w:cs="CMU Serif"/>
-          <w:i/>
-        </w:rPr>
-        <w:t xml:space="preserve"> </w:t>
-      </w:r>
-      <w:proofErr w:type="spellStart"/>
-      <w:r>
-        <w:rPr>
-          <w:rFonts w:ascii="Browallia New" w:hAnsi="Browallia New" w:cs="Browallia New"/>
-          <w:i/>
-          <w:lang w:bidi="th-TH"/>
-        </w:rPr>
-        <w:t>และ</w:t>
-      </w:r>
-      <w:proofErr w:type="spellEnd"/>
-      <w:r>
-        <w:rPr>
-          <w:rFonts w:ascii="CMU Serif" w:hAnsi="CMU Serif" w:cs="CMU Serif"/>
-          <w:i/>
-        </w:rPr>
-        <w:t xml:space="preserve"> push </w:t>
-      </w:r>
-      <w:proofErr w:type="spellStart"/>
-      <w:r>
-        <w:rPr>
-          <w:rFonts w:ascii="Browallia New" w:hAnsi="Browallia New" w:cs="Browallia New"/>
-          <w:i/>
-          <w:lang w:bidi="th-TH"/>
-        </w:rPr>
-        <w:t>ขึ้น</w:t>
-      </w:r>
-      <w:proofErr w:type="spellEnd"/>
-      <w:r>
-        <w:rPr>
-          <w:rFonts w:ascii="CMU Serif" w:hAnsi="CMU Serif" w:cs="CMU Serif"/>
-          <w:i/>
-        </w:rPr>
-        <w:t xml:space="preserve"> GitHub </w:t>
-      </w:r>
-      <w:proofErr w:type="spellStart"/>
-      <w:r>
-        <w:rPr>
-          <w:rFonts w:ascii="Browallia New" w:hAnsi="Browallia New" w:cs="Browallia New"/>
-          <w:i/>
-          <w:lang w:bidi="th-TH"/>
-        </w:rPr>
-        <w:t>เรียบร้อยแล้ว</w:t>
-      </w:r>
-      <w:proofErr w:type="spellEnd"/>
-      <w:r>
-        <w:rPr>
-          <w:rFonts w:ascii="CMU Serif" w:hAnsi="CMU Serif" w:cs="CMU Serif"/>
-          <w:i/>
-        </w:rPr>
-        <w:t>”</w:t>
-      </w:r>
-      <w:r>
-        <w:rPr>
-          <w:rFonts w:ascii="CMU Serif" w:hAnsi="CMU Serif" w:cs="CMU Serif"/>
-          <w:i/>
-        </w:rPr>
-        <w:br/>
-      </w:r>
-      <w:r>
-        <w:rPr>
-          <w:rFonts w:ascii="CMU Serif" w:hAnsi="CMU Serif" w:cs="CMU Serif"/>
-          <w:i/>
-        </w:rPr>
-        <w:br/>
-      </w:r>
-      <w:r>
-        <w:rPr>
-          <w:rFonts w:ascii="CMU Serif" w:hAnsi="CMU Serif" w:cs="CMU Serif"/>
-          <w:b/>
-        </w:rPr>
-        <w:t>Pull Requests I reviewed for my partner:</w:t>
-      </w:r>
-      <w:r>
-        <w:rPr>
-          <w:rFonts w:ascii="CMU Serif" w:hAnsi="CMU Serif" w:cs="CMU Serif"/>
-          <w:b/>
-        </w:rPr>
-        <w:br/>
-      </w:r>
-      <w:r>
-        <w:rPr>
-          <w:rFonts w:ascii="CMU Serif" w:hAnsi="CMU Serif" w:cs="CMU Serif"/>
-          <w:i/>
-        </w:rPr>
-        <w:t>“</w:t>
-      </w:r>
-      <w:proofErr w:type="spellStart"/>
-      <w:r>
-        <w:rPr>
-          <w:rFonts w:ascii="Browallia New" w:hAnsi="Browallia New" w:cs="Browallia New"/>
-          <w:i/>
-          <w:lang w:bidi="th-TH"/>
-        </w:rPr>
-        <w:t>ตรวจสอบโค้ดและเอกสารใน</w:t>
-      </w:r>
-      <w:proofErr w:type="spellEnd"/>
-      <w:r>
-        <w:rPr>
-          <w:rFonts w:ascii="CMU Serif" w:hAnsi="CMU Serif" w:cs="CMU Serif"/>
-          <w:i/>
-        </w:rPr>
-        <w:t xml:space="preserve"> PR (Issue 4) </w:t>
-      </w:r>
-      <w:proofErr w:type="spellStart"/>
-      <w:r>
-        <w:rPr>
-          <w:rFonts w:ascii="Browallia New" w:hAnsi="Browallia New" w:cs="Browallia New"/>
-          <w:i/>
-          <w:lang w:bidi="th-TH"/>
-        </w:rPr>
-        <w:t>ทั้งหมดแล้วครับ</w:t>
-      </w:r>
-      <w:proofErr w:type="spellEnd"/>
-      <w:r>
-        <w:rPr>
-          <w:rFonts w:ascii="CMU Serif" w:hAnsi="CMU Serif" w:cs="CMU Serif"/>
-          <w:i/>
-        </w:rPr>
-        <w:t xml:space="preserve"> </w:t>
-      </w:r>
-      <w:proofErr w:type="spellStart"/>
-      <w:r>
-        <w:rPr>
-          <w:rFonts w:ascii="Browallia New" w:hAnsi="Browallia New" w:cs="Browallia New"/>
-          <w:i/>
-          <w:lang w:bidi="th-TH"/>
-        </w:rPr>
-        <w:t>พัฒนาได้สมบูรณ์แบบมาก</w:t>
-      </w:r>
-      <w:proofErr w:type="spellEnd"/>
-      <w:r>
-        <w:rPr>
-          <w:rFonts w:ascii="CMU Serif" w:hAnsi="CMU Serif" w:cs="CMU Serif"/>
-          <w:i/>
-        </w:rPr>
-        <w:t xml:space="preserve"> Endpoint GET /</w:t>
-      </w:r>
-      <w:proofErr w:type="spellStart"/>
-      <w:r>
-        <w:rPr>
-          <w:rFonts w:ascii="CMU Serif" w:hAnsi="CMU Serif" w:cs="CMU Serif"/>
-          <w:i/>
-        </w:rPr>
-        <w:t>api</w:t>
-      </w:r>
-      <w:proofErr w:type="spellEnd"/>
-      <w:r>
-        <w:rPr>
-          <w:rFonts w:ascii="CMU Serif" w:hAnsi="CMU Serif" w:cs="CMU Serif"/>
-          <w:i/>
-        </w:rPr>
-        <w:t xml:space="preserve">/categories </w:t>
-      </w:r>
-      <w:proofErr w:type="spellStart"/>
-      <w:r>
-        <w:rPr>
-          <w:rFonts w:ascii="Browallia New" w:hAnsi="Browallia New" w:cs="Browallia New"/>
-          <w:i/>
-          <w:lang w:bidi="th-TH"/>
-        </w:rPr>
-        <w:t>ดึงข้อมูลและเรียงตาม</w:t>
-      </w:r>
-      <w:proofErr w:type="spellEnd"/>
-      <w:r>
-        <w:rPr>
-          <w:rFonts w:ascii="CMU Serif" w:hAnsi="CMU Serif" w:cs="CMU Serif"/>
-          <w:i/>
-        </w:rPr>
-        <w:t xml:space="preserve"> id </w:t>
-      </w:r>
-      <w:proofErr w:type="spellStart"/>
-      <w:r>
-        <w:rPr>
-          <w:rFonts w:ascii="Browallia New" w:hAnsi="Browallia New" w:cs="Browallia New"/>
-          <w:i/>
-          <w:lang w:bidi="th-TH"/>
-        </w:rPr>
-        <w:t>ถูกต้อง</w:t>
-      </w:r>
-      <w:proofErr w:type="spellEnd"/>
-      <w:r>
-        <w:rPr>
-          <w:rFonts w:ascii="CMU Serif" w:hAnsi="CMU Serif" w:cs="CMU Serif"/>
-          <w:i/>
-        </w:rPr>
-        <w:t xml:space="preserve">, </w:t>
-      </w:r>
-      <w:proofErr w:type="spellStart"/>
-      <w:r>
-        <w:rPr>
-          <w:rFonts w:ascii="Browallia New" w:hAnsi="Browallia New" w:cs="Browallia New"/>
-          <w:i/>
-          <w:lang w:bidi="th-TH"/>
-        </w:rPr>
-        <w:t>หน้าจอ</w:t>
-      </w:r>
-      <w:proofErr w:type="spellEnd"/>
-      <w:r>
-        <w:rPr>
-          <w:rFonts w:ascii="CMU Serif" w:hAnsi="CMU Serif" w:cs="CMU Serif"/>
-          <w:i/>
-        </w:rPr>
-        <w:t xml:space="preserve"> React UI </w:t>
-      </w:r>
-      <w:proofErr w:type="spellStart"/>
-      <w:r>
-        <w:rPr>
-          <w:rFonts w:ascii="Browallia New" w:hAnsi="Browallia New" w:cs="Browallia New"/>
-          <w:i/>
-          <w:lang w:bidi="th-TH"/>
-        </w:rPr>
-        <w:t>และ</w:t>
-      </w:r>
-      <w:proofErr w:type="spellEnd"/>
-      <w:r>
-        <w:rPr>
-          <w:rFonts w:ascii="CMU Serif" w:hAnsi="CMU Serif" w:cs="CMU Serif"/>
-          <w:i/>
-        </w:rPr>
-        <w:t xml:space="preserve"> Unit Tests </w:t>
-      </w:r>
-      <w:proofErr w:type="spellStart"/>
-      <w:r>
-        <w:rPr>
-          <w:rFonts w:ascii="Browallia New" w:hAnsi="Browallia New" w:cs="Browallia New"/>
-          <w:i/>
-          <w:lang w:bidi="th-TH"/>
-        </w:rPr>
-        <w:t>ครอบคลุมทั้ง</w:t>
-      </w:r>
-      <w:proofErr w:type="spellEnd"/>
-      <w:r>
-        <w:rPr>
-          <w:rFonts w:ascii="CMU Serif" w:hAnsi="CMU Serif" w:cs="CMU Serif"/>
-          <w:i/>
-        </w:rPr>
-        <w:t xml:space="preserve"> Online, Offline </w:t>
-      </w:r>
-      <w:proofErr w:type="spellStart"/>
-      <w:r>
-        <w:rPr>
-          <w:rFonts w:ascii="Browallia New" w:hAnsi="Browallia New" w:cs="Browallia New"/>
-          <w:i/>
-          <w:lang w:bidi="th-TH"/>
-        </w:rPr>
-        <w:t>และ</w:t>
-      </w:r>
-      <w:proofErr w:type="spellEnd"/>
-      <w:r>
-        <w:rPr>
-          <w:rFonts w:ascii="CMU Serif" w:hAnsi="CMU Serif" w:cs="CMU Serif"/>
-          <w:i/>
-        </w:rPr>
-        <w:t xml:space="preserve"> Loading, </w:t>
-      </w:r>
-      <w:proofErr w:type="spellStart"/>
-      <w:r>
-        <w:rPr>
-          <w:rFonts w:ascii="Browallia New" w:hAnsi="Browallia New" w:cs="Browallia New"/>
-          <w:i/>
-          <w:lang w:bidi="th-TH"/>
-        </w:rPr>
-        <w:t>บันทึกผลเทสต์ใน</w:t>
-      </w:r>
-      <w:proofErr w:type="spellEnd"/>
-      <w:r>
-        <w:rPr>
-          <w:rFonts w:ascii="CMU Serif" w:hAnsi="CMU Serif" w:cs="CMU Serif"/>
-          <w:i/>
-        </w:rPr>
-        <w:t xml:space="preserve"> tests.md </w:t>
-      </w:r>
-      <w:proofErr w:type="spellStart"/>
-      <w:r>
-        <w:rPr>
-          <w:rFonts w:ascii="Browallia New" w:hAnsi="Browallia New" w:cs="Browallia New"/>
-          <w:i/>
-          <w:lang w:bidi="th-TH"/>
-        </w:rPr>
-        <w:t>และ</w:t>
-      </w:r>
-      <w:proofErr w:type="spellEnd"/>
-      <w:r>
-        <w:rPr>
-          <w:rFonts w:ascii="CMU Serif" w:hAnsi="CMU Serif" w:cs="CMU Serif"/>
-          <w:i/>
-        </w:rPr>
-        <w:t xml:space="preserve"> Prompts </w:t>
-      </w:r>
-      <w:proofErr w:type="spellStart"/>
-      <w:r>
-        <w:rPr>
-          <w:rFonts w:ascii="Browallia New" w:hAnsi="Browallia New" w:cs="Browallia New"/>
-          <w:i/>
-          <w:lang w:bidi="th-TH"/>
-        </w:rPr>
-        <w:t>ใน</w:t>
-      </w:r>
-      <w:proofErr w:type="spellEnd"/>
-      <w:r>
-        <w:rPr>
-          <w:rFonts w:ascii="CMU Serif" w:hAnsi="CMU Serif" w:cs="CMU Serif"/>
-          <w:i/>
-        </w:rPr>
-        <w:t xml:space="preserve"> ai_use.md </w:t>
-      </w:r>
-      <w:proofErr w:type="spellStart"/>
-      <w:r>
-        <w:rPr>
-          <w:rFonts w:ascii="Browallia New" w:hAnsi="Browallia New" w:cs="Browallia New"/>
-          <w:i/>
-          <w:lang w:bidi="th-TH"/>
-        </w:rPr>
-        <w:t>ได้ละเอียดครบถ้วน</w:t>
-      </w:r>
-      <w:proofErr w:type="spellEnd"/>
-      <w:r>
-        <w:rPr>
-          <w:rFonts w:ascii="CMU Serif" w:hAnsi="CMU Serif" w:cs="CMU Serif"/>
-          <w:i/>
-        </w:rPr>
-        <w:t xml:space="preserve"> Approved!”</w:t>
-      </w:r>
-      <w:r>
-        <w:rPr>
-          <w:rFonts w:ascii="CMU Serif" w:hAnsi="CMU Serif" w:cs="CMU Serif"/>
-          <w:i/>
-        </w:rPr>
-        <w:br/>
-      </w:r>
-      <w:r>
-        <w:rPr>
-          <w:rFonts w:ascii="CMU Serif" w:hAnsi="CMU Serif" w:cs="CMU Serif"/>
-          <w:i/>
-        </w:rPr>
-        <w:br/>
-      </w:r>
-      <w:r>
-        <w:rPr>
-          <w:rFonts w:ascii="CMU Serif" w:hAnsi="CMU Serif" w:cs="CMU Serif"/>
-          <w:b/>
-        </w:rPr>
-        <w:t>Partner's response:</w:t>
-      </w:r>
-      <w:r>
-        <w:rPr>
-          <w:rFonts w:ascii="CMU Serif" w:hAnsi="CMU Serif" w:cs="CMU Serif"/>
-          <w:b/>
-        </w:rPr>
-        <w:br/>
-      </w:r>
-      <w:r>
-        <w:rPr>
-          <w:rFonts w:ascii="CMU Serif" w:hAnsi="CMU Serif" w:cs="CMU Serif"/>
-          <w:i/>
-        </w:rPr>
-        <w:t>“</w:t>
-      </w:r>
-      <w:proofErr w:type="spellStart"/>
-      <w:r>
-        <w:rPr>
-          <w:rFonts w:ascii="Browallia New" w:hAnsi="Browallia New" w:cs="Browallia New"/>
-          <w:i/>
-          <w:lang w:bidi="th-TH"/>
-        </w:rPr>
-        <w:t>ขอบคุณสำหรับ</w:t>
-      </w:r>
-      <w:proofErr w:type="spellEnd"/>
-      <w:r>
-        <w:rPr>
-          <w:rFonts w:ascii="CMU Serif" w:hAnsi="CMU Serif" w:cs="CMU Serif"/>
-          <w:i/>
-        </w:rPr>
-        <w:t xml:space="preserve"> Review </w:t>
-      </w:r>
-      <w:proofErr w:type="spellStart"/>
-      <w:r>
-        <w:rPr>
-          <w:rFonts w:ascii="Browallia New" w:hAnsi="Browallia New" w:cs="Browallia New"/>
-          <w:i/>
-          <w:lang w:bidi="th-TH"/>
-        </w:rPr>
-        <w:t>และคำแนะนำครับ</w:t>
-      </w:r>
-      <w:proofErr w:type="spellEnd"/>
-      <w:r>
-        <w:rPr>
-          <w:rFonts w:ascii="CMU Serif" w:hAnsi="CMU Serif" w:cs="CMU Serif"/>
-          <w:i/>
-        </w:rPr>
-        <w:t xml:space="preserve"> </w:t>
-      </w:r>
-      <w:proofErr w:type="spellStart"/>
-      <w:r>
-        <w:rPr>
-          <w:rFonts w:ascii="Browallia New" w:hAnsi="Browallia New" w:cs="Browallia New"/>
-          <w:i/>
-          <w:lang w:bidi="th-TH"/>
-        </w:rPr>
-        <w:t>ได้ตรวจสอบผลการรันเทสต์และเตรียม</w:t>
-      </w:r>
-      <w:proofErr w:type="spellEnd"/>
-      <w:r>
-        <w:rPr>
-          <w:rFonts w:ascii="CMU Serif" w:hAnsi="CMU Serif" w:cs="CMU Serif"/>
-          <w:i/>
-        </w:rPr>
-        <w:t xml:space="preserve"> Merge </w:t>
-      </w:r>
-      <w:proofErr w:type="spellStart"/>
-      <w:r>
-        <w:rPr>
-          <w:rFonts w:ascii="Browallia New" w:hAnsi="Browallia New" w:cs="Browallia New"/>
-          <w:i/>
-          <w:lang w:bidi="th-TH"/>
-        </w:rPr>
-        <w:t>เข้า</w:t>
-      </w:r>
-      <w:proofErr w:type="spellEnd"/>
-      <w:r>
-        <w:rPr>
-          <w:rFonts w:ascii="CMU Serif" w:hAnsi="CMU Serif" w:cs="CMU Serif"/>
-          <w:i/>
-        </w:rPr>
-        <w:t xml:space="preserve"> lab1-staging </w:t>
-      </w:r>
-      <w:proofErr w:type="spellStart"/>
-      <w:r>
-        <w:rPr>
-          <w:rFonts w:ascii="Browallia New" w:hAnsi="Browallia New" w:cs="Browallia New"/>
-          <w:i/>
-          <w:lang w:bidi="th-TH"/>
-        </w:rPr>
-        <w:t>เรียบร้อยครับ</w:t>
-      </w:r>
-      <w:proofErr w:type="spellEnd"/>
-      <w:r>
-        <w:rPr>
-          <w:rFonts w:ascii="CMU Serif" w:hAnsi="CMU Serif" w:cs="CMU Serif"/>
-          <w:i/>
-        </w:rPr>
-        <w:t>”</w:t>
+        <w:t>-</w:t>
       </w:r>
     </w:p>
     <w:p>
@@ -2687,6 +2557,7 @@
           <w:rFonts w:ascii="CMU Serif" w:hAnsi="CMU Serif" w:cs="CMU Serif"/>
           <w:color w:val="0F766E"/>
         </w:rPr>
+        <w:lastRenderedPageBreak/>
         <w:t>Answer Part 2: Tests</w:t>
       </w:r>
     </w:p>
@@ -3035,14 +2906,7 @@
               <w:rPr>
                 <w:rFonts w:ascii="CMU Serif" w:hAnsi="CMU Serif" w:cs="CMU Serif"/>
               </w:rPr>
-              <w:t>server/tests/lab-01/categories.test.t</w:t>
-            </w:r>
-            <w:r>
-              <w:rPr>
-                <w:rFonts w:ascii="CMU Serif" w:hAnsi="CMU Serif" w:cs="CMU Serif"/>
-              </w:rPr>
-              <w:lastRenderedPageBreak/>
-              <w:t>s</w:t>
+              <w:t>server/tests/lab-01/categories.test.ts</w:t>
             </w:r>
           </w:p>
         </w:tc>
@@ -3067,7 +2931,6 @@
               <w:rPr>
                 <w:rFonts w:ascii="CMU Serif" w:hAnsi="CMU Serif" w:cs="CMU Serif"/>
               </w:rPr>
-              <w:lastRenderedPageBreak/>
               <w:t>Supertest</w:t>
             </w:r>
           </w:p>
@@ -3093,14 +2956,7 @@
               <w:rPr>
                 <w:rFonts w:ascii="CMU Serif" w:hAnsi="CMU Serif" w:cs="CMU Serif"/>
               </w:rPr>
-              <w:t xml:space="preserve">Categories endpoint returns 4 </w:t>
-            </w:r>
-            <w:r>
-              <w:rPr>
-                <w:rFonts w:ascii="CMU Serif" w:hAnsi="CMU Serif" w:cs="CMU Serif"/>
-              </w:rPr>
-              <w:lastRenderedPageBreak/>
-              <w:t>seeded categories in ID order</w:t>
+              <w:t>Categories endpoint returns 4 seeded categories in ID order</w:t>
             </w:r>
           </w:p>
         </w:tc>
@@ -3127,7 +2983,6 @@
                 <w:b/>
                 <w:color w:val="15803D"/>
               </w:rPr>
-              <w:lastRenderedPageBreak/>
               <w:t>Pass</w:t>
             </w:r>
           </w:p>
@@ -3681,7 +3536,9 @@
       <w:pPr>
         <w:spacing w:before="40" w:after="120"/>
         <w:rPr>
-          <w:rFonts w:ascii="CMU Serif" w:hAnsi="CMU Serif" w:cs="CMU Serif"/>
+          <w:rFonts w:ascii="CMU Serif" w:hAnsi="CMU Serif" w:cs="Cordia New" w:hint="cs"/>
+          <w:cs/>
+          <w:lang w:bidi="th-TH"/>
         </w:rPr>
       </w:pPr>
       <w:r>
@@ -3690,6 +3547,265 @@
           <w:sz w:val="17"/>
         </w:rPr>
         <w:t>&gt; toktickit-server@1.0.0 test</w:t>
+      </w:r>
+      <w:r>
+        <w:rPr>
+          <w:rFonts w:ascii="CMU Serif" w:hAnsi="CMU Serif" w:cs="CMU Serif"/>
+          <w:sz w:val="17"/>
+        </w:rPr>
+        <w:br/>
+        <w:t xml:space="preserve">&gt; </w:t>
+      </w:r>
+      <w:proofErr w:type="spellStart"/>
+      <w:r>
+        <w:rPr>
+          <w:rFonts w:ascii="CMU Serif" w:hAnsi="CMU Serif" w:cs="CMU Serif"/>
+          <w:sz w:val="17"/>
+        </w:rPr>
+        <w:t>vitest</w:t>
+      </w:r>
+      <w:proofErr w:type="spellEnd"/>
+      <w:r>
+        <w:rPr>
+          <w:rFonts w:ascii="CMU Serif" w:hAnsi="CMU Serif" w:cs="CMU Serif"/>
+          <w:sz w:val="17"/>
+        </w:rPr>
+        <w:t xml:space="preserve"> run</w:t>
+      </w:r>
+      <w:r>
+        <w:rPr>
+          <w:rFonts w:ascii="CMU Serif" w:hAnsi="CMU Serif" w:cs="CMU Serif"/>
+          <w:sz w:val="17"/>
+        </w:rPr>
+        <w:br/>
+      </w:r>
+      <w:r>
+        <w:rPr>
+          <w:rFonts w:ascii="CMU Serif" w:hAnsi="CMU Serif" w:cs="CMU Serif"/>
+          <w:sz w:val="17"/>
+        </w:rPr>
+        <w:br/>
+        <w:t xml:space="preserve"> </w:t>
+      </w:r>
+      <w:r>
+        <w:rPr>
+          <w:rFonts w:ascii="Segoe UI Symbol" w:hAnsi="Segoe UI Symbol" w:cs="Segoe UI Symbol"/>
+          <w:sz w:val="17"/>
+        </w:rPr>
+        <w:t>✓</w:t>
+      </w:r>
+      <w:r>
+        <w:rPr>
+          <w:rFonts w:ascii="CMU Serif" w:hAnsi="CMU Serif" w:cs="CMU Serif"/>
+          <w:sz w:val="17"/>
+        </w:rPr>
+        <w:t xml:space="preserve"> tests/lab-01/</w:t>
+      </w:r>
+      <w:proofErr w:type="spellStart"/>
+      <w:r>
+        <w:rPr>
+          <w:rFonts w:ascii="CMU Serif" w:hAnsi="CMU Serif" w:cs="CMU Serif"/>
+          <w:sz w:val="17"/>
+        </w:rPr>
+        <w:t>health.test.ts</w:t>
+      </w:r>
+      <w:proofErr w:type="spellEnd"/>
+      <w:r>
+        <w:rPr>
+          <w:rFonts w:ascii="CMU Serif" w:hAnsi="CMU Serif" w:cs="CMU Serif"/>
+          <w:sz w:val="17"/>
+        </w:rPr>
+        <w:t xml:space="preserve"> (1 test) 20ms</w:t>
+      </w:r>
+      <w:r>
+        <w:rPr>
+          <w:rFonts w:ascii="CMU Serif" w:hAnsi="CMU Serif" w:cs="CMU Serif"/>
+          <w:sz w:val="17"/>
+        </w:rPr>
+        <w:br/>
+        <w:t xml:space="preserve"> </w:t>
+      </w:r>
+      <w:r>
+        <w:rPr>
+          <w:rFonts w:ascii="Segoe UI Symbol" w:hAnsi="Segoe UI Symbol" w:cs="Segoe UI Symbol"/>
+          <w:sz w:val="17"/>
+        </w:rPr>
+        <w:t>✓</w:t>
+      </w:r>
+      <w:r>
+        <w:rPr>
+          <w:rFonts w:ascii="CMU Serif" w:hAnsi="CMU Serif" w:cs="CMU Serif"/>
+          <w:sz w:val="17"/>
+        </w:rPr>
+        <w:t xml:space="preserve"> tests/lab-01/</w:t>
+      </w:r>
+      <w:proofErr w:type="spellStart"/>
+      <w:r>
+        <w:rPr>
+          <w:rFonts w:ascii="CMU Serif" w:hAnsi="CMU Serif" w:cs="CMU Serif"/>
+          <w:sz w:val="17"/>
+        </w:rPr>
+        <w:t>categories.test.ts</w:t>
+      </w:r>
+      <w:proofErr w:type="spellEnd"/>
+      <w:r>
+        <w:rPr>
+          <w:rFonts w:ascii="CMU Serif" w:hAnsi="CMU Serif" w:cs="CMU Serif"/>
+          <w:sz w:val="17"/>
+        </w:rPr>
+        <w:t xml:space="preserve"> (1 test) 194ms</w:t>
+      </w:r>
+      <w:r>
+        <w:rPr>
+          <w:rFonts w:ascii="CMU Serif" w:hAnsi="CMU Serif" w:cs="CMU Serif"/>
+          <w:sz w:val="17"/>
+        </w:rPr>
+        <w:br/>
+      </w:r>
+      <w:r>
+        <w:rPr>
+          <w:rFonts w:ascii="CMU Serif" w:hAnsi="CMU Serif" w:cs="CMU Serif"/>
+          <w:sz w:val="17"/>
+        </w:rPr>
+        <w:br/>
+        <w:t xml:space="preserve"> Test </w:t>
+      </w:r>
+      <w:proofErr w:type="gramStart"/>
+      <w:r>
+        <w:rPr>
+          <w:rFonts w:ascii="CMU Serif" w:hAnsi="CMU Serif" w:cs="CMU Serif"/>
+          <w:sz w:val="17"/>
+        </w:rPr>
+        <w:t>Files  2</w:t>
+      </w:r>
+      <w:proofErr w:type="gramEnd"/>
+      <w:r>
+        <w:rPr>
+          <w:rFonts w:ascii="CMU Serif" w:hAnsi="CMU Serif" w:cs="CMU Serif"/>
+          <w:sz w:val="17"/>
+        </w:rPr>
+        <w:t xml:space="preserve"> passed (2)</w:t>
+      </w:r>
+      <w:r>
+        <w:rPr>
+          <w:rFonts w:ascii="CMU Serif" w:hAnsi="CMU Serif" w:cs="CMU Serif"/>
+          <w:sz w:val="17"/>
+        </w:rPr>
+        <w:br/>
+        <w:t xml:space="preserve">      </w:t>
+      </w:r>
+      <w:proofErr w:type="gramStart"/>
+      <w:r>
+        <w:rPr>
+          <w:rFonts w:ascii="CMU Serif" w:hAnsi="CMU Serif" w:cs="CMU Serif"/>
+          <w:sz w:val="17"/>
+        </w:rPr>
+        <w:t>Tests  2</w:t>
+      </w:r>
+      <w:proofErr w:type="gramEnd"/>
+      <w:r>
+        <w:rPr>
+          <w:rFonts w:ascii="CMU Serif" w:hAnsi="CMU Serif" w:cs="CMU Serif"/>
+          <w:sz w:val="17"/>
+        </w:rPr>
+        <w:t xml:space="preserve"> passed (2)</w:t>
+      </w:r>
+      <w:r>
+        <w:rPr>
+          <w:rFonts w:ascii="CMU Serif" w:hAnsi="CMU Serif" w:cs="CMU Serif"/>
+          <w:sz w:val="17"/>
+        </w:rPr>
+        <w:br/>
+        <w:t xml:space="preserve">   </w:t>
+      </w:r>
+      <w:proofErr w:type="gramStart"/>
+      <w:r>
+        <w:rPr>
+          <w:rFonts w:ascii="CMU Serif" w:hAnsi="CMU Serif" w:cs="CMU Serif"/>
+          <w:sz w:val="17"/>
+        </w:rPr>
+        <w:t>Duration  10</w:t>
+      </w:r>
+      <w:proofErr w:type="gramEnd"/>
+      <w:r>
+        <w:rPr>
+          <w:rFonts w:ascii="CMU Serif" w:hAnsi="CMU Serif" w:cs="CMU Serif"/>
+          <w:sz w:val="17"/>
+        </w:rPr>
+        <w:t>.68s</w:t>
+      </w:r>
+      <w:r>
+        <w:rPr>
+          <w:rFonts w:ascii="CMU Serif" w:hAnsi="CMU Serif" w:cs="CMU Serif"/>
+          <w:sz w:val="17"/>
+        </w:rPr>
+        <w:br/>
+      </w:r>
+      <w:r>
+        <w:rPr>
+          <w:rFonts w:ascii="CMU Serif" w:hAnsi="CMU Serif" w:cs="Cordia New"/>
+          <w:cs/>
+          <w:lang w:bidi="th-TH"/>
+        </w:rPr>
+        <w:lastRenderedPageBreak/>
+        <w:drawing>
+          <wp:inline distT="0" distB="0" distL="0" distR="0" wp14:anchorId="3A6D2947" wp14:editId="08D558AC">
+            <wp:extent cx="4703805" cy="2074484"/>
+            <wp:effectExtent l="0" t="0" r="1905" b="2540"/>
+            <wp:docPr id="1858246470" name="Picture 1"/>
+            <wp:cNvGraphicFramePr>
+              <a:graphicFrameLocks xmlns:a="http://schemas.openxmlformats.org/drawingml/2006/main" noChangeAspect="1"/>
+            </wp:cNvGraphicFramePr>
+            <a:graphic xmlns:a="http://schemas.openxmlformats.org/drawingml/2006/main">
+              <a:graphicData uri="http://schemas.openxmlformats.org/drawingml/2006/picture">
+                <pic:pic xmlns:pic="http://schemas.openxmlformats.org/drawingml/2006/picture">
+                  <pic:nvPicPr>
+                    <pic:cNvPr id="1858246470" name=""/>
+                    <pic:cNvPicPr/>
+                  </pic:nvPicPr>
+                  <pic:blipFill>
+                    <a:blip r:embed="rId20"/>
+                    <a:stretch>
+                      <a:fillRect/>
+                    </a:stretch>
+                  </pic:blipFill>
+                  <pic:spPr>
+                    <a:xfrm>
+                      <a:off x="0" y="0"/>
+                      <a:ext cx="4713687" cy="2078842"/>
+                    </a:xfrm>
+                    <a:prstGeom prst="rect">
+                      <a:avLst/>
+                    </a:prstGeom>
+                  </pic:spPr>
+                </pic:pic>
+              </a:graphicData>
+            </a:graphic>
+          </wp:inline>
+        </w:drawing>
+      </w:r>
+      <w:r>
+        <w:rPr>
+          <w:rFonts w:ascii="CMU Serif" w:hAnsi="CMU Serif" w:cs="CMU Serif"/>
+          <w:sz w:val="17"/>
+        </w:rPr>
+        <w:br/>
+        <w:t>--------------------------------------------------</w:t>
+      </w:r>
+      <w:r>
+        <w:rPr>
+          <w:rFonts w:ascii="CMU Serif" w:hAnsi="CMU Serif" w:cs="CMU Serif"/>
+          <w:sz w:val="17"/>
+        </w:rPr>
+        <w:br/>
+      </w:r>
+      <w:r>
+        <w:rPr>
+          <w:rFonts w:ascii="CMU Serif" w:hAnsi="CMU Serif" w:cs="CMU Serif"/>
+          <w:sz w:val="17"/>
+        </w:rPr>
+        <w:br/>
+        <w:t>&gt; toktickit-client@1.0.0 test</w:t>
       </w:r>
       <w:r>
         <w:rPr>
@@ -3726,7 +3842,7 @@
           <w:rFonts w:ascii="CMU Serif" w:hAnsi="CMU Serif" w:cs="CMU Serif"/>
           <w:sz w:val="17"/>
         </w:rPr>
-        <w:t xml:space="preserve"> tests/lab-01/health.test.ts (1 test) 20ms</w:t>
+        <w:t xml:space="preserve"> tests/lab-01/App.test.tsx (4 tests) 249ms</w:t>
       </w:r>
       <w:r>
         <w:rPr>
@@ -3734,332 +3850,123 @@
           <w:sz w:val="17"/>
         </w:rPr>
         <w:br/>
-        <w:t xml:space="preserve"> </w:t>
-      </w:r>
-      <w:r>
-        <w:rPr>
-          <w:rFonts w:ascii="Segoe UI Symbol" w:hAnsi="Segoe UI Symbol" w:cs="Segoe UI Symbol"/>
+      </w:r>
+      <w:r>
+        <w:rPr>
+          <w:rFonts w:ascii="CMU Serif" w:hAnsi="CMU Serif" w:cs="CMU Serif"/>
           <w:sz w:val="17"/>
         </w:rPr>
-        <w:t>✓</w:t>
-      </w:r>
+        <w:br/>
+        <w:t xml:space="preserve"> Test </w:t>
+      </w:r>
+      <w:proofErr w:type="gramStart"/>
       <w:r>
         <w:rPr>
           <w:rFonts w:ascii="CMU Serif" w:hAnsi="CMU Serif" w:cs="CMU Serif"/>
           <w:sz w:val="17"/>
         </w:rPr>
-        <w:t xml:space="preserve"> tests/lab-01/categories.test.ts (1 test) 194ms</w:t>
-      </w:r>
+        <w:t>Files  1</w:t>
+      </w:r>
+      <w:proofErr w:type="gramEnd"/>
       <w:r>
         <w:rPr>
           <w:rFonts w:ascii="CMU Serif" w:hAnsi="CMU Serif" w:cs="CMU Serif"/>
           <w:sz w:val="17"/>
         </w:rPr>
+        <w:t xml:space="preserve"> passed (1)</w:t>
+      </w:r>
+      <w:r>
+        <w:rPr>
+          <w:rFonts w:ascii="CMU Serif" w:hAnsi="CMU Serif" w:cs="CMU Serif"/>
+          <w:sz w:val="17"/>
+        </w:rPr>
         <w:br/>
-      </w:r>
+        <w:t xml:space="preserve">      </w:t>
+      </w:r>
+      <w:proofErr w:type="gramStart"/>
       <w:r>
         <w:rPr>
           <w:rFonts w:ascii="CMU Serif" w:hAnsi="CMU Serif" w:cs="CMU Serif"/>
           <w:sz w:val="17"/>
         </w:rPr>
+        <w:t>Tests  4</w:t>
+      </w:r>
+      <w:proofErr w:type="gramEnd"/>
+      <w:r>
+        <w:rPr>
+          <w:rFonts w:ascii="CMU Serif" w:hAnsi="CMU Serif" w:cs="CMU Serif"/>
+          <w:sz w:val="17"/>
+        </w:rPr>
+        <w:t xml:space="preserve"> passed (4)</w:t>
+      </w:r>
+      <w:r>
+        <w:rPr>
+          <w:rFonts w:ascii="CMU Serif" w:hAnsi="CMU Serif" w:cs="CMU Serif"/>
+          <w:sz w:val="17"/>
+        </w:rPr>
         <w:br/>
-        <w:t xml:space="preserve"> Test Files  2 passed (2)</w:t>
-      </w:r>
+        <w:t xml:space="preserve">   </w:t>
+      </w:r>
+      <w:proofErr w:type="gramStart"/>
       <w:r>
         <w:rPr>
           <w:rFonts w:ascii="CMU Serif" w:hAnsi="CMU Serif" w:cs="CMU Serif"/>
           <w:sz w:val="17"/>
         </w:rPr>
-        <w:br/>
-        <w:t xml:space="preserve">      Tests  2 passed (2)</w:t>
-      </w:r>
-      <w:r>
-        <w:rPr>
-          <w:rFonts w:ascii="CMU Serif" w:hAnsi="CMU Serif" w:cs="CMU Serif"/>
-          <w:sz w:val="17"/>
-        </w:rPr>
-        <w:br/>
-        <w:t xml:space="preserve">   Duration  10.68s</w:t>
-      </w:r>
-      <w:r>
-        <w:rPr>
-          <w:rFonts w:ascii="CMU Serif" w:hAnsi="CMU Serif" w:cs="CMU Serif"/>
-          <w:sz w:val="17"/>
-        </w:rPr>
-        <w:br/>
-      </w:r>
-      <w:r>
-        <w:rPr>
-          <w:rFonts w:ascii="CMU Serif" w:hAnsi="CMU Serif" w:cs="CMU Serif"/>
-          <w:sz w:val="17"/>
-        </w:rPr>
-        <w:br/>
-        <w:t>--------------------------------------------------</w:t>
-      </w:r>
-      <w:r>
-        <w:rPr>
-          <w:rFonts w:ascii="CMU Serif" w:hAnsi="CMU Serif" w:cs="CMU Serif"/>
-          <w:sz w:val="17"/>
-        </w:rPr>
-        <w:br/>
-      </w:r>
-      <w:r>
-        <w:rPr>
-          <w:rFonts w:ascii="CMU Serif" w:hAnsi="CMU Serif" w:cs="CMU Serif"/>
-          <w:sz w:val="17"/>
-        </w:rPr>
-        <w:br/>
-        <w:t>&gt; toktickit-client@1.0.0 test</w:t>
-      </w:r>
-      <w:r>
-        <w:rPr>
-          <w:rFonts w:ascii="CMU Serif" w:hAnsi="CMU Serif" w:cs="CMU Serif"/>
-          <w:sz w:val="17"/>
-        </w:rPr>
-        <w:br/>
-        <w:t>&gt; vitest run</w:t>
-      </w:r>
-      <w:r>
-        <w:rPr>
-          <w:rFonts w:ascii="CMU Serif" w:hAnsi="CMU Serif" w:cs="CMU Serif"/>
-          <w:sz w:val="17"/>
-        </w:rPr>
-        <w:br/>
-      </w:r>
-      <w:r>
-        <w:rPr>
-          <w:rFonts w:ascii="CMU Serif" w:hAnsi="CMU Serif" w:cs="CMU Serif"/>
-          <w:sz w:val="17"/>
-        </w:rPr>
-        <w:br/>
-        <w:t xml:space="preserve"> </w:t>
-      </w:r>
-      <w:r>
-        <w:rPr>
-          <w:rFonts w:ascii="Segoe UI Symbol" w:hAnsi="Segoe UI Symbol" w:cs="Segoe UI Symbol"/>
-          <w:sz w:val="17"/>
-        </w:rPr>
-        <w:t>✓</w:t>
-      </w:r>
-      <w:r>
-        <w:rPr>
-          <w:rFonts w:ascii="CMU Serif" w:hAnsi="CMU Serif" w:cs="CMU Serif"/>
-          <w:sz w:val="17"/>
-        </w:rPr>
-        <w:t xml:space="preserve"> tests/lab-01/App.test.tsx (4 tests) 249ms</w:t>
-      </w:r>
-      <w:r>
-        <w:rPr>
-          <w:rFonts w:ascii="CMU Serif" w:hAnsi="CMU Serif" w:cs="CMU Serif"/>
-          <w:sz w:val="17"/>
-        </w:rPr>
-        <w:br/>
-      </w:r>
-      <w:r>
-        <w:rPr>
-          <w:rFonts w:ascii="CMU Serif" w:hAnsi="CMU Serif" w:cs="CMU Serif"/>
-          <w:sz w:val="17"/>
-        </w:rPr>
-        <w:br/>
-        <w:t xml:space="preserve"> Test Files  1 passed (1)</w:t>
-      </w:r>
-      <w:r>
-        <w:rPr>
-          <w:rFonts w:ascii="CMU Serif" w:hAnsi="CMU Serif" w:cs="CMU Serif"/>
-          <w:sz w:val="17"/>
-        </w:rPr>
-        <w:br/>
-        <w:t xml:space="preserve">      Tests  4 passed (4)</w:t>
-      </w:r>
-      <w:r>
-        <w:rPr>
-          <w:rFonts w:ascii="CMU Serif" w:hAnsi="CMU Serif" w:cs="CMU Serif"/>
-          <w:sz w:val="17"/>
-        </w:rPr>
-        <w:br/>
-        <w:t xml:space="preserve">   Duration  35.21s</w:t>
-      </w:r>
+        <w:t>Duration  35.21s</w:t>
+      </w:r>
+      <w:proofErr w:type="gramEnd"/>
     </w:p>
-    <w:tbl>
-      <w:tblPr>
-        <w:tblW w:w="0" w:type="auto"/>
-        <w:jc w:val="center"/>
-        <w:tblLayout w:type="fixed"/>
-        <w:tblLook w:val="04A0" w:firstRow="1" w:lastRow="0" w:firstColumn="1" w:lastColumn="0" w:noHBand="0" w:noVBand="1"/>
-      </w:tblPr>
-      <w:tblGrid>
-        <w:gridCol w:w="9360"/>
-      </w:tblGrid>
-      <w:tr>
-        <w:trPr>
-          <w:jc w:val="center"/>
-        </w:trPr>
-        <w:tc>
-          <w:tcPr>
-            <w:tcW w:w="9360" w:type="dxa"/>
-            <w:tcBorders>
-              <w:top w:val="dashed" w:sz="12" w:space="0" w:color="94A3B8"/>
-              <w:left w:val="dashed" w:sz="12" w:space="0" w:color="94A3B8"/>
-              <w:bottom w:val="dashed" w:sz="12" w:space="0" w:color="94A3B8"/>
-              <w:right w:val="dashed" w:sz="12" w:space="0" w:color="94A3B8"/>
-            </w:tcBorders>
-            <w:shd w:val="clear" w:color="auto" w:fill="F8FAFC"/>
-            <w:tcMar>
-              <w:top w:w="240" w:type="dxa"/>
-              <w:left w:w="200" w:type="dxa"/>
-              <w:bottom w:w="240" w:type="dxa"/>
-              <w:right w:w="200" w:type="dxa"/>
-            </w:tcMar>
-          </w:tcPr>
-          <w:p>
-            <w:pPr>
-              <w:spacing w:before="160" w:after="160"/>
-              <w:jc w:val="center"/>
-              <w:rPr>
-                <w:rFonts w:ascii="CMU Serif" w:hAnsi="CMU Serif" w:cs="CMU Serif"/>
-              </w:rPr>
-            </w:pPr>
-            <w:r>
-              <w:rPr>
-                <w:rFonts w:ascii="Segoe UI Emoji" w:hAnsi="Segoe UI Emoji" w:cs="Segoe UI Emoji"/>
-                <w:sz w:val="28"/>
-              </w:rPr>
-              <w:t>📷</w:t>
-            </w:r>
-            <w:r>
-              <w:rPr>
-                <w:rFonts w:ascii="CMU Serif" w:hAnsi="CMU Serif" w:cs="CMU Serif"/>
-                <w:sz w:val="28"/>
-              </w:rPr>
-              <w:t xml:space="preserve"> </w:t>
-            </w:r>
-            <w:r>
-              <w:rPr>
-                <w:rFonts w:ascii="CMU Serif" w:hAnsi="CMU Serif" w:cs="CMU Serif"/>
-                <w:b/>
-                <w:color w:val="64748B"/>
-                <w:sz w:val="20"/>
-              </w:rPr>
-              <w:t xml:space="preserve">[ </w:t>
-            </w:r>
-            <w:r>
-              <w:rPr>
-                <w:rFonts w:ascii="Browallia New" w:hAnsi="Browallia New" w:cs="Browallia New"/>
-                <w:b/>
-                <w:color w:val="64748B"/>
-                <w:sz w:val="20"/>
-              </w:rPr>
-              <w:t>แนบภาพ</w:t>
-            </w:r>
-            <w:r>
-              <w:rPr>
-                <w:rFonts w:ascii="CMU Serif" w:hAnsi="CMU Serif" w:cs="CMU Serif"/>
-                <w:b/>
-                <w:color w:val="64748B"/>
-                <w:sz w:val="20"/>
-              </w:rPr>
-              <w:t xml:space="preserve"> Screenshot: Terminal </w:t>
-            </w:r>
-            <w:r>
-              <w:rPr>
-                <w:rFonts w:ascii="Browallia New" w:hAnsi="Browallia New" w:cs="Browallia New"/>
-                <w:b/>
-                <w:color w:val="64748B"/>
-                <w:sz w:val="20"/>
-              </w:rPr>
-              <w:t>แสดงผลการรัน</w:t>
-            </w:r>
-            <w:r>
-              <w:rPr>
-                <w:rFonts w:ascii="CMU Serif" w:hAnsi="CMU Serif" w:cs="CMU Serif"/>
-                <w:b/>
-                <w:color w:val="64748B"/>
-                <w:sz w:val="20"/>
-              </w:rPr>
-              <w:t xml:space="preserve"> npm test </w:t>
-            </w:r>
-            <w:r>
-              <w:rPr>
-                <w:rFonts w:ascii="Browallia New" w:hAnsi="Browallia New" w:cs="Browallia New"/>
-                <w:b/>
-                <w:color w:val="64748B"/>
-                <w:sz w:val="20"/>
-              </w:rPr>
-              <w:t>ทั้งฝั่ง</w:t>
-            </w:r>
-            <w:r>
-              <w:rPr>
-                <w:rFonts w:ascii="CMU Serif" w:hAnsi="CMU Serif" w:cs="CMU Serif"/>
-                <w:b/>
-                <w:color w:val="64748B"/>
-                <w:sz w:val="20"/>
-              </w:rPr>
-              <w:t xml:space="preserve"> Server </w:t>
-            </w:r>
-            <w:r>
-              <w:rPr>
-                <w:rFonts w:ascii="Browallia New" w:hAnsi="Browallia New" w:cs="Browallia New"/>
-                <w:b/>
-                <w:color w:val="64748B"/>
-                <w:sz w:val="20"/>
-              </w:rPr>
-              <w:t>และ</w:t>
-            </w:r>
-            <w:r>
-              <w:rPr>
-                <w:rFonts w:ascii="CMU Serif" w:hAnsi="CMU Serif" w:cs="CMU Serif"/>
-                <w:b/>
-                <w:color w:val="64748B"/>
-                <w:sz w:val="20"/>
-              </w:rPr>
-              <w:t xml:space="preserve"> Client </w:t>
-            </w:r>
-            <w:r>
-              <w:rPr>
-                <w:rFonts w:ascii="Browallia New" w:hAnsi="Browallia New" w:cs="Browallia New"/>
-                <w:b/>
-                <w:color w:val="64748B"/>
-                <w:sz w:val="20"/>
-              </w:rPr>
-              <w:t>ผ่าน</w:t>
-            </w:r>
-            <w:r>
-              <w:rPr>
-                <w:rFonts w:ascii="CMU Serif" w:hAnsi="CMU Serif" w:cs="CMU Serif"/>
-                <w:b/>
-                <w:color w:val="64748B"/>
-                <w:sz w:val="20"/>
-              </w:rPr>
-              <w:t xml:space="preserve"> 100% </w:t>
-            </w:r>
-            <w:r>
-              <w:rPr>
-                <w:rFonts w:ascii="Browallia New" w:hAnsi="Browallia New" w:cs="Browallia New"/>
-                <w:b/>
-                <w:color w:val="64748B"/>
-                <w:sz w:val="20"/>
-              </w:rPr>
-              <w:t>บน</w:t>
-            </w:r>
-            <w:r>
-              <w:rPr>
-                <w:rFonts w:ascii="CMU Serif" w:hAnsi="CMU Serif" w:cs="CMU Serif"/>
-                <w:b/>
-                <w:color w:val="64748B"/>
-                <w:sz w:val="20"/>
-              </w:rPr>
-              <w:t xml:space="preserve"> branch main ]</w:t>
-            </w:r>
-          </w:p>
-        </w:tc>
-      </w:tr>
-    </w:tbl>
     <w:p>
       <w:pPr>
         <w:rPr>
-          <w:rFonts w:ascii="CMU Serif" w:hAnsi="CMU Serif" w:cs="CMU Serif"/>
+          <w:rFonts w:ascii="CMU Serif" w:hAnsi="CMU Serif" w:cs="Cordia New" w:hint="cs"/>
+          <w:cs/>
+          <w:lang w:bidi="th-TH"/>
         </w:rPr>
       </w:pPr>
+      <w:r>
+        <w:rPr>
+          <w:rFonts w:ascii="CMU Serif" w:hAnsi="CMU Serif" w:cs="Cordia New"/>
+          <w:cs/>
+          <w:lang w:bidi="th-TH"/>
+        </w:rPr>
+        <w:drawing>
+          <wp:inline distT="0" distB="0" distL="0" distR="0" wp14:anchorId="36539E92" wp14:editId="2EC611DA">
+            <wp:extent cx="4670854" cy="1649560"/>
+            <wp:effectExtent l="0" t="0" r="0" b="8255"/>
+            <wp:docPr id="2077349615" name="Picture 1"/>
+            <wp:cNvGraphicFramePr>
+              <a:graphicFrameLocks xmlns:a="http://schemas.openxmlformats.org/drawingml/2006/main" noChangeAspect="1"/>
+            </wp:cNvGraphicFramePr>
+            <a:graphic xmlns:a="http://schemas.openxmlformats.org/drawingml/2006/main">
+              <a:graphicData uri="http://schemas.openxmlformats.org/drawingml/2006/picture">
+                <pic:pic xmlns:pic="http://schemas.openxmlformats.org/drawingml/2006/picture">
+                  <pic:nvPicPr>
+                    <pic:cNvPr id="2077349615" name=""/>
+                    <pic:cNvPicPr/>
+                  </pic:nvPicPr>
+                  <pic:blipFill>
+                    <a:blip r:embed="rId21"/>
+                    <a:stretch>
+                      <a:fillRect/>
+                    </a:stretch>
+                  </pic:blipFill>
+                  <pic:spPr>
+                    <a:xfrm>
+                      <a:off x="0" y="0"/>
+                      <a:ext cx="4679782" cy="1652713"/>
+                    </a:xfrm>
+                    <a:prstGeom prst="rect">
+                      <a:avLst/>
+                    </a:prstGeom>
+                  </pic:spPr>
+                </pic:pic>
+              </a:graphicData>
+            </a:graphic>
+          </wp:inline>
+        </w:drawing>
+      </w:r>
     </w:p>
     <w:p>
       <w:pPr>
@@ -4074,7 +3981,6 @@
           <w:rFonts w:ascii="CMU Serif" w:hAnsi="CMU Serif" w:cs="CMU Serif"/>
           <w:color w:val="0F766E"/>
         </w:rPr>
-        <w:lastRenderedPageBreak/>
         <w:t>Answer Part 3: AI Use and Reflection</w:t>
       </w:r>
     </w:p>
@@ -4295,7 +4201,14 @@
               <w:rPr>
                 <w:rFonts w:ascii="CMU Serif" w:hAnsi="CMU Serif" w:cs="CMU Serif"/>
               </w:rPr>
-              <w:t>Read the enclosed TokTickIT Lab 1 requirements. Summarize the four GitHub Issues, their dependencies, required outputs, and required automated tests. Propose an implementation order, but do not write code yet.</w:t>
+              <w:t xml:space="preserve">Read the enclosed TokTickIT Lab 1 requirements. Summarize the four GitHub Issues, their dependencies, required outputs, and required </w:t>
+            </w:r>
+            <w:r>
+              <w:rPr>
+                <w:rFonts w:ascii="CMU Serif" w:hAnsi="CMU Serif" w:cs="CMU Serif"/>
+              </w:rPr>
+              <w:lastRenderedPageBreak/>
+              <w:t>automated tests. Propose an implementation order, but do not write code yet.</w:t>
             </w:r>
           </w:p>
         </w:tc>
@@ -4320,6 +4233,7 @@
               <w:rPr>
                 <w:rFonts w:ascii="CMU Serif" w:hAnsi="CMU Serif" w:cs="CMU Serif"/>
               </w:rPr>
+              <w:lastRenderedPageBreak/>
               <w:t>Reviewed the proposed implementation steps and approved the execution plan.</w:t>
             </w:r>
           </w:p>
@@ -4350,6 +4264,7 @@
               <w:rPr>
                 <w:rFonts w:ascii="CMU Serif" w:hAnsi="CMU Serif" w:cs="CMU Serif"/>
               </w:rPr>
+              <w:lastRenderedPageBreak/>
               <w:t>2</w:t>
             </w:r>
           </w:p>
@@ -4610,14 +4525,7 @@
               <w:rPr>
                 <w:rFonts w:ascii="CMU Serif" w:hAnsi="CMU Serif" w:cs="CMU Serif"/>
               </w:rPr>
-              <w:t xml:space="preserve">Define Category model in Prisma schema, run migration, and implement idempotent </w:t>
-            </w:r>
-            <w:r>
-              <w:rPr>
-                <w:rFonts w:ascii="CMU Serif" w:hAnsi="CMU Serif" w:cs="CMU Serif"/>
-              </w:rPr>
-              <w:lastRenderedPageBreak/>
-              <w:t>database seeding using upsert for the 4 required categories.</w:t>
+              <w:t>Define Category model in Prisma schema, run migration, and implement idempotent database seeding using upsert for the 4 required categories.</w:t>
             </w:r>
           </w:p>
         </w:tc>
@@ -4642,15 +4550,7 @@
               <w:rPr>
                 <w:rFonts w:ascii="CMU Serif" w:hAnsi="CMU Serif" w:cs="CMU Serif"/>
               </w:rPr>
-              <w:lastRenderedPageBreak/>
-              <w:t xml:space="preserve">Ran Prisma migrations against PostgreSQL, verified seed idempotency, and </w:t>
-            </w:r>
-            <w:r>
-              <w:rPr>
-                <w:rFonts w:ascii="CMU Serif" w:hAnsi="CMU Serif" w:cs="CMU Serif"/>
-              </w:rPr>
-              <w:lastRenderedPageBreak/>
-              <w:t>opened PR #7.</w:t>
+              <w:t>Ran Prisma migrations against PostgreSQL, verified seed idempotency, and opened PR #7.</w:t>
             </w:r>
           </w:p>
         </w:tc>
@@ -4680,7 +4580,6 @@
               <w:rPr>
                 <w:rFonts w:ascii="CMU Serif" w:hAnsi="CMU Serif" w:cs="CMU Serif"/>
               </w:rPr>
-              <w:lastRenderedPageBreak/>
               <w:t>5</w:t>
             </w:r>
           </w:p>
@@ -4836,7 +4735,14 @@
               <w:rPr>
                 <w:rFonts w:ascii="CMU Serif" w:hAnsi="CMU Serif" w:cs="CMU Serif"/>
               </w:rPr>
-              <w:t>Create a Bootstrap-based page with [Check System] button. When clicked, show a loading state, call backend APIs, and render status badge and category list.</w:t>
+              <w:t xml:space="preserve">Create a Bootstrap-based page with [Check </w:t>
+            </w:r>
+            <w:r>
+              <w:rPr>
+                <w:rFonts w:ascii="CMU Serif" w:hAnsi="CMU Serif" w:cs="CMU Serif"/>
+              </w:rPr>
+              <w:lastRenderedPageBreak/>
+              <w:t>System] button. When clicked, show a loading state, call backend APIs, and render status badge and category list.</w:t>
             </w:r>
           </w:p>
         </w:tc>
@@ -4861,7 +4767,15 @@
               <w:rPr>
                 <w:rFonts w:ascii="CMU Serif" w:hAnsi="CMU Serif" w:cs="CMU Serif"/>
               </w:rPr>
-              <w:t>Implemented App.tsx and api.ts, connected frontend with backend API.</w:t>
+              <w:lastRenderedPageBreak/>
+              <w:t xml:space="preserve">Implemented App.tsx and api.ts, connected </w:t>
+            </w:r>
+            <w:r>
+              <w:rPr>
+                <w:rFonts w:ascii="CMU Serif" w:hAnsi="CMU Serif" w:cs="CMU Serif"/>
+              </w:rPr>
+              <w:lastRenderedPageBreak/>
+              <w:t>frontend with backend API.</w:t>
             </w:r>
           </w:p>
         </w:tc>
@@ -4891,6 +4805,7 @@
               <w:rPr>
                 <w:rFonts w:ascii="CMU Serif" w:hAnsi="CMU Serif" w:cs="CMU Serif"/>
               </w:rPr>
+              <w:lastRenderedPageBreak/>
               <w:t>7</w:t>
             </w:r>
           </w:p>
@@ -5119,7 +5034,6 @@
           <w:rFonts w:ascii="CMU Serif" w:hAnsi="CMU Serif" w:cs="CMU Serif"/>
           <w:color w:val="0F766E"/>
         </w:rPr>
-        <w:lastRenderedPageBreak/>
         <w:t>Answer Part 4: App Demo</w:t>
       </w:r>
     </w:p>
@@ -5140,7 +5054,8 @@
     <w:p>
       <w:pPr>
         <w:rPr>
-          <w:rFonts w:ascii="CMU Serif" w:hAnsi="CMU Serif" w:cs="CMU Serif"/>
+          <w:rFonts w:ascii="CMU Serif" w:hAnsi="CMU Serif" w:cs="Cordia New" w:hint="cs"/>
+          <w:lang w:bidi="th-TH"/>
         </w:rPr>
       </w:pPr>
       <w:r>
@@ -5179,186 +5094,62 @@
         </w:rPr>
         <w:t xml:space="preserve"> [Check System]</w:t>
       </w:r>
-    </w:p>
-    <w:tbl>
-      <w:tblPr>
-        <w:tblW w:w="0" w:type="auto"/>
-        <w:jc w:val="center"/>
-        <w:tblLayout w:type="fixed"/>
-        <w:tblLook w:val="04A0" w:firstRow="1" w:lastRow="0" w:firstColumn="1" w:lastColumn="0" w:noHBand="0" w:noVBand="1"/>
-      </w:tblPr>
-      <w:tblGrid>
-        <w:gridCol w:w="9360"/>
-      </w:tblGrid>
-      <w:tr>
-        <w:trPr>
-          <w:jc w:val="center"/>
-        </w:trPr>
-        <w:tc>
-          <w:tcPr>
-            <w:tcW w:w="9360" w:type="dxa"/>
-            <w:tcBorders>
-              <w:top w:val="dashed" w:sz="12" w:space="0" w:color="94A3B8"/>
-              <w:left w:val="dashed" w:sz="12" w:space="0" w:color="94A3B8"/>
-              <w:bottom w:val="dashed" w:sz="12" w:space="0" w:color="94A3B8"/>
-              <w:right w:val="dashed" w:sz="12" w:space="0" w:color="94A3B8"/>
-            </w:tcBorders>
-            <w:shd w:val="clear" w:color="auto" w:fill="F8FAFC"/>
-            <w:tcMar>
-              <w:top w:w="240" w:type="dxa"/>
-              <w:left w:w="200" w:type="dxa"/>
-              <w:bottom w:w="240" w:type="dxa"/>
-              <w:right w:w="200" w:type="dxa"/>
-            </w:tcMar>
-          </w:tcPr>
-          <w:p>
-            <w:pPr>
-              <w:spacing w:before="160" w:after="160"/>
-              <w:jc w:val="center"/>
-              <w:rPr>
-                <w:rFonts w:ascii="CMU Serif" w:hAnsi="CMU Serif" w:cs="CMU Serif"/>
-              </w:rPr>
-            </w:pPr>
-            <w:r>
-              <w:rPr>
-                <w:rFonts w:ascii="Segoe UI Emoji" w:hAnsi="Segoe UI Emoji" w:cs="Segoe UI Emoji"/>
-                <w:sz w:val="28"/>
-              </w:rPr>
-              <w:t>📷</w:t>
-            </w:r>
-            <w:r>
-              <w:rPr>
-                <w:rFonts w:ascii="CMU Serif" w:hAnsi="CMU Serif" w:cs="CMU Serif"/>
-                <w:sz w:val="28"/>
-              </w:rPr>
-              <w:t xml:space="preserve"> </w:t>
-            </w:r>
-            <w:r>
-              <w:rPr>
-                <w:rFonts w:ascii="CMU Serif" w:hAnsi="CMU Serif" w:cs="CMU Serif"/>
-                <w:b/>
-                <w:color w:val="64748B"/>
-                <w:sz w:val="20"/>
-              </w:rPr>
-              <w:t xml:space="preserve">[ </w:t>
-            </w:r>
-            <w:proofErr w:type="spellStart"/>
-            <w:r>
-              <w:rPr>
-                <w:rFonts w:ascii="Browallia New" w:hAnsi="Browallia New" w:cs="Browallia New"/>
-                <w:b/>
-                <w:color w:val="64748B"/>
-                <w:sz w:val="20"/>
-                <w:lang w:bidi="th-TH"/>
-              </w:rPr>
-              <w:t>แนบภาพ</w:t>
-            </w:r>
-            <w:proofErr w:type="spellEnd"/>
-            <w:r>
-              <w:rPr>
-                <w:rFonts w:ascii="CMU Serif" w:hAnsi="CMU Serif" w:cs="CMU Serif"/>
-                <w:b/>
-                <w:color w:val="64748B"/>
-                <w:sz w:val="20"/>
-              </w:rPr>
-              <w:t xml:space="preserve"> Screenshot: </w:t>
-            </w:r>
-            <w:proofErr w:type="spellStart"/>
-            <w:r>
-              <w:rPr>
-                <w:rFonts w:ascii="Browallia New" w:hAnsi="Browallia New" w:cs="Browallia New"/>
-                <w:b/>
-                <w:color w:val="64748B"/>
-                <w:sz w:val="20"/>
-                <w:lang w:bidi="th-TH"/>
-              </w:rPr>
-              <w:t>หน้าจอเริ่มต้นแสดงหัวข้อ</w:t>
-            </w:r>
-            <w:proofErr w:type="spellEnd"/>
-            <w:r>
-              <w:rPr>
-                <w:rFonts w:ascii="CMU Serif" w:hAnsi="CMU Serif" w:cs="CMU Serif"/>
-                <w:b/>
-                <w:color w:val="64748B"/>
-                <w:sz w:val="20"/>
-              </w:rPr>
-              <w:t xml:space="preserve"> </w:t>
-            </w:r>
-            <w:proofErr w:type="spellStart"/>
-            <w:r>
-              <w:rPr>
-                <w:rFonts w:ascii="CMU Serif" w:hAnsi="CMU Serif" w:cs="CMU Serif"/>
-                <w:b/>
-                <w:color w:val="64748B"/>
-                <w:sz w:val="20"/>
-              </w:rPr>
-              <w:t>TokTickIT</w:t>
-            </w:r>
-            <w:proofErr w:type="spellEnd"/>
-            <w:r>
-              <w:rPr>
-                <w:rFonts w:ascii="CMU Serif" w:hAnsi="CMU Serif" w:cs="CMU Serif"/>
-                <w:b/>
-                <w:color w:val="64748B"/>
-                <w:sz w:val="20"/>
-              </w:rPr>
-              <w:t xml:space="preserve"> </w:t>
-            </w:r>
-            <w:proofErr w:type="spellStart"/>
-            <w:r>
-              <w:rPr>
-                <w:rFonts w:ascii="Browallia New" w:hAnsi="Browallia New" w:cs="Browallia New"/>
-                <w:b/>
-                <w:color w:val="64748B"/>
-                <w:sz w:val="20"/>
-                <w:lang w:bidi="th-TH"/>
-              </w:rPr>
-              <w:t>และปุ่ม</w:t>
-            </w:r>
-            <w:proofErr w:type="spellEnd"/>
-            <w:r>
-              <w:rPr>
-                <w:rFonts w:ascii="CMU Serif" w:hAnsi="CMU Serif" w:cs="CMU Serif"/>
-                <w:b/>
-                <w:color w:val="64748B"/>
-                <w:sz w:val="20"/>
-              </w:rPr>
-              <w:t xml:space="preserve"> Check </w:t>
-            </w:r>
-            <w:proofErr w:type="gramStart"/>
-            <w:r>
-              <w:rPr>
-                <w:rFonts w:ascii="CMU Serif" w:hAnsi="CMU Serif" w:cs="CMU Serif"/>
-                <w:b/>
-                <w:color w:val="64748B"/>
-                <w:sz w:val="20"/>
-              </w:rPr>
-              <w:t>System ]</w:t>
-            </w:r>
-            <w:proofErr w:type="gramEnd"/>
-          </w:p>
-        </w:tc>
-      </w:tr>
-    </w:tbl>
-    <w:p>
-      <w:pPr>
-        <w:rPr>
-          <w:rFonts w:ascii="CMU Serif" w:hAnsi="CMU Serif" w:cs="CMU Serif"/>
-        </w:rPr>
-      </w:pPr>
     </w:p>
     <w:p>
       <w:pPr>
         <w:rPr>
-          <w:rFonts w:ascii="CMU Serif" w:hAnsi="CMU Serif" w:cs="CMU Serif"/>
+          <w:rFonts w:ascii="CMU Serif" w:hAnsi="CMU Serif" w:cs="Cordia New" w:hint="cs"/>
+          <w:lang w:bidi="th-TH"/>
         </w:rPr>
       </w:pPr>
       <w:r>
         <w:rPr>
           <w:rFonts w:ascii="CMU Serif" w:hAnsi="CMU Serif" w:cs="CMU Serif"/>
-          <w:b/>
-        </w:rPr>
-        <w:t>2. Success Case (Backend Online &amp; Database Connected)</w:t>
+        </w:rPr>
+        <w:drawing>
+          <wp:inline distT="0" distB="0" distL="0" distR="0" wp14:anchorId="24680F55" wp14:editId="4B538EE3">
+            <wp:extent cx="2466747" cy="617564"/>
+            <wp:effectExtent l="0" t="0" r="0" b="0"/>
+            <wp:docPr id="1296933632" name="Picture 1"/>
+            <wp:cNvGraphicFramePr>
+              <a:graphicFrameLocks xmlns:a="http://schemas.openxmlformats.org/drawingml/2006/main" noChangeAspect="1"/>
+            </wp:cNvGraphicFramePr>
+            <a:graphic xmlns:a="http://schemas.openxmlformats.org/drawingml/2006/main">
+              <a:graphicData uri="http://schemas.openxmlformats.org/drawingml/2006/picture">
+                <pic:pic xmlns:pic="http://schemas.openxmlformats.org/drawingml/2006/picture">
+                  <pic:nvPicPr>
+                    <pic:cNvPr id="1296933632" name=""/>
+                    <pic:cNvPicPr/>
+                  </pic:nvPicPr>
+                  <pic:blipFill rotWithShape="1">
+                    <a:blip r:embed="rId22"/>
+                    <a:srcRect t="8225" b="60944"/>
+                    <a:stretch>
+                      <a:fillRect/>
+                    </a:stretch>
+                  </pic:blipFill>
+                  <pic:spPr bwMode="auto">
+                    <a:xfrm>
+                      <a:off x="0" y="0"/>
+                      <a:ext cx="2474680" cy="619550"/>
+                    </a:xfrm>
+                    <a:prstGeom prst="rect">
+                      <a:avLst/>
+                    </a:prstGeom>
+                    <a:ln>
+                      <a:noFill/>
+                    </a:ln>
+                    <a:extLst>
+                      <a:ext uri="{53640926-AAD7-44D8-BBD7-CCE9431645EC}">
+                        <a14:shadowObscured xmlns:a14="http://schemas.microsoft.com/office/drawing/2010/main"/>
+                      </a:ext>
+                    </a:extLst>
+                  </pic:spPr>
+                </pic:pic>
+              </a:graphicData>
+            </a:graphic>
+          </wp:inline>
+        </w:drawing>
       </w:r>
     </w:p>
     <w:p>
@@ -5367,270 +5158,13 @@
           <w:rFonts w:ascii="CMU Serif" w:hAnsi="CMU Serif" w:cs="CMU Serif"/>
         </w:rPr>
       </w:pPr>
-      <w:proofErr w:type="spellStart"/>
-      <w:r>
-        <w:rPr>
-          <w:rFonts w:ascii="Browallia New" w:hAnsi="Browallia New" w:cs="Browallia New"/>
-          <w:lang w:bidi="th-TH"/>
-        </w:rPr>
-        <w:t>เมื่อกดปุ่ม</w:t>
-      </w:r>
-      <w:proofErr w:type="spellEnd"/>
-      <w:r>
-        <w:rPr>
-          <w:rFonts w:ascii="CMU Serif" w:hAnsi="CMU Serif" w:cs="CMU Serif"/>
-        </w:rPr>
-        <w:t xml:space="preserve"> [Check System] </w:t>
-      </w:r>
-      <w:proofErr w:type="spellStart"/>
-      <w:r>
-        <w:rPr>
-          <w:rFonts w:ascii="Browallia New" w:hAnsi="Browallia New" w:cs="Browallia New"/>
-          <w:lang w:bidi="th-TH"/>
-        </w:rPr>
-        <w:t>โดยเปิด</w:t>
-      </w:r>
-      <w:proofErr w:type="spellEnd"/>
-      <w:r>
-        <w:rPr>
-          <w:rFonts w:ascii="CMU Serif" w:hAnsi="CMU Serif" w:cs="CMU Serif"/>
-        </w:rPr>
-        <w:t xml:space="preserve"> Backend Server </w:t>
-      </w:r>
-      <w:proofErr w:type="spellStart"/>
-      <w:r>
-        <w:rPr>
-          <w:rFonts w:ascii="Browallia New" w:hAnsi="Browallia New" w:cs="Browallia New"/>
-          <w:lang w:bidi="th-TH"/>
-        </w:rPr>
-        <w:t>และ</w:t>
-      </w:r>
-      <w:proofErr w:type="spellEnd"/>
-      <w:r>
-        <w:rPr>
-          <w:rFonts w:ascii="CMU Serif" w:hAnsi="CMU Serif" w:cs="CMU Serif"/>
-        </w:rPr>
-        <w:t xml:space="preserve"> Database </w:t>
-      </w:r>
-      <w:proofErr w:type="spellStart"/>
-      <w:r>
-        <w:rPr>
-          <w:rFonts w:ascii="Browallia New" w:hAnsi="Browallia New" w:cs="Browallia New"/>
-          <w:lang w:bidi="th-TH"/>
-        </w:rPr>
-        <w:t>ปกติ</w:t>
-      </w:r>
-      <w:proofErr w:type="spellEnd"/>
-      <w:r>
-        <w:rPr>
-          <w:rFonts w:ascii="CMU Serif" w:hAnsi="CMU Serif" w:cs="CMU Serif"/>
-        </w:rPr>
-        <w:t xml:space="preserve"> </w:t>
-      </w:r>
-      <w:proofErr w:type="spellStart"/>
-      <w:r>
-        <w:rPr>
-          <w:rFonts w:ascii="Browallia New" w:hAnsi="Browallia New" w:cs="Browallia New"/>
-          <w:lang w:bidi="th-TH"/>
-        </w:rPr>
-        <w:t>ระบบแสดงผลสถานะ</w:t>
-      </w:r>
-      <w:proofErr w:type="spellEnd"/>
-      <w:r>
-        <w:rPr>
-          <w:rFonts w:ascii="CMU Serif" w:hAnsi="CMU Serif" w:cs="CMU Serif"/>
-        </w:rPr>
-        <w:t xml:space="preserve"> System Status: Online </w:t>
-      </w:r>
-      <w:proofErr w:type="spellStart"/>
-      <w:r>
-        <w:rPr>
-          <w:rFonts w:ascii="Browallia New" w:hAnsi="Browallia New" w:cs="Browallia New"/>
-          <w:lang w:bidi="th-TH"/>
-        </w:rPr>
-        <w:t>พร้อมรายการ</w:t>
-      </w:r>
-      <w:proofErr w:type="spellEnd"/>
-      <w:r>
-        <w:rPr>
-          <w:rFonts w:ascii="CMU Serif" w:hAnsi="CMU Serif" w:cs="CMU Serif"/>
-        </w:rPr>
-        <w:t xml:space="preserve"> 4 </w:t>
-      </w:r>
-      <w:proofErr w:type="spellStart"/>
-      <w:r>
-        <w:rPr>
-          <w:rFonts w:ascii="Browallia New" w:hAnsi="Browallia New" w:cs="Browallia New"/>
-          <w:lang w:bidi="th-TH"/>
-        </w:rPr>
-        <w:t>หมวดหมู่</w:t>
-      </w:r>
-      <w:proofErr w:type="spellEnd"/>
-      <w:r>
-        <w:rPr>
-          <w:rFonts w:ascii="CMU Serif" w:hAnsi="CMU Serif" w:cs="CMU Serif"/>
-        </w:rPr>
-        <w:t xml:space="preserve"> (1. Account and Access, 2. Hardware, 3. Software, 4. Network)</w:t>
-      </w:r>
-    </w:p>
-    <w:tbl>
-      <w:tblPr>
-        <w:tblW w:w="0" w:type="auto"/>
-        <w:jc w:val="center"/>
-        <w:tblLayout w:type="fixed"/>
-        <w:tblLook w:val="04A0" w:firstRow="1" w:lastRow="0" w:firstColumn="1" w:lastColumn="0" w:noHBand="0" w:noVBand="1"/>
-      </w:tblPr>
-      <w:tblGrid>
-        <w:gridCol w:w="9360"/>
-      </w:tblGrid>
-      <w:tr>
-        <w:trPr>
-          <w:jc w:val="center"/>
-        </w:trPr>
-        <w:tc>
-          <w:tcPr>
-            <w:tcW w:w="9360" w:type="dxa"/>
-            <w:tcBorders>
-              <w:top w:val="dashed" w:sz="12" w:space="0" w:color="94A3B8"/>
-              <w:left w:val="dashed" w:sz="12" w:space="0" w:color="94A3B8"/>
-              <w:bottom w:val="dashed" w:sz="12" w:space="0" w:color="94A3B8"/>
-              <w:right w:val="dashed" w:sz="12" w:space="0" w:color="94A3B8"/>
-            </w:tcBorders>
-            <w:shd w:val="clear" w:color="auto" w:fill="F8FAFC"/>
-            <w:tcMar>
-              <w:top w:w="240" w:type="dxa"/>
-              <w:left w:w="200" w:type="dxa"/>
-              <w:bottom w:w="240" w:type="dxa"/>
-              <w:right w:w="200" w:type="dxa"/>
-            </w:tcMar>
-          </w:tcPr>
-          <w:p>
-            <w:pPr>
-              <w:spacing w:before="160" w:after="160"/>
-              <w:jc w:val="center"/>
-              <w:rPr>
-                <w:rFonts w:ascii="CMU Serif" w:hAnsi="CMU Serif" w:cs="CMU Serif"/>
-              </w:rPr>
-            </w:pPr>
-            <w:r>
-              <w:rPr>
-                <w:rFonts w:ascii="Segoe UI Emoji" w:hAnsi="Segoe UI Emoji" w:cs="Segoe UI Emoji"/>
-                <w:sz w:val="28"/>
-              </w:rPr>
-              <w:t>📷</w:t>
-            </w:r>
-            <w:r>
-              <w:rPr>
-                <w:rFonts w:ascii="CMU Serif" w:hAnsi="CMU Serif" w:cs="CMU Serif"/>
-                <w:sz w:val="28"/>
-              </w:rPr>
-              <w:t xml:space="preserve"> </w:t>
-            </w:r>
-            <w:r>
-              <w:rPr>
-                <w:rFonts w:ascii="CMU Serif" w:hAnsi="CMU Serif" w:cs="CMU Serif"/>
-                <w:b/>
-                <w:color w:val="64748B"/>
-                <w:sz w:val="20"/>
-              </w:rPr>
-              <w:t xml:space="preserve">[ </w:t>
-            </w:r>
-            <w:proofErr w:type="spellStart"/>
-            <w:r>
-              <w:rPr>
-                <w:rFonts w:ascii="Browallia New" w:hAnsi="Browallia New" w:cs="Browallia New"/>
-                <w:b/>
-                <w:color w:val="64748B"/>
-                <w:sz w:val="20"/>
-                <w:lang w:bidi="th-TH"/>
-              </w:rPr>
-              <w:t>แนบภาพ</w:t>
-            </w:r>
-            <w:proofErr w:type="spellEnd"/>
-            <w:r>
-              <w:rPr>
-                <w:rFonts w:ascii="CMU Serif" w:hAnsi="CMU Serif" w:cs="CMU Serif"/>
-                <w:b/>
-                <w:color w:val="64748B"/>
-                <w:sz w:val="20"/>
-              </w:rPr>
-              <w:t xml:space="preserve"> Screenshot: </w:t>
-            </w:r>
-            <w:proofErr w:type="spellStart"/>
-            <w:r>
-              <w:rPr>
-                <w:rFonts w:ascii="Browallia New" w:hAnsi="Browallia New" w:cs="Browallia New"/>
-                <w:b/>
-                <w:color w:val="64748B"/>
-                <w:sz w:val="20"/>
-                <w:lang w:bidi="th-TH"/>
-              </w:rPr>
-              <w:t>หน้าจอแสดง</w:t>
-            </w:r>
-            <w:proofErr w:type="spellEnd"/>
-            <w:r>
-              <w:rPr>
-                <w:rFonts w:ascii="CMU Serif" w:hAnsi="CMU Serif" w:cs="CMU Serif"/>
-                <w:b/>
-                <w:color w:val="64748B"/>
-                <w:sz w:val="20"/>
-              </w:rPr>
-              <w:t xml:space="preserve"> System Status: Online </w:t>
-            </w:r>
-            <w:proofErr w:type="spellStart"/>
-            <w:r>
-              <w:rPr>
-                <w:rFonts w:ascii="Browallia New" w:hAnsi="Browallia New" w:cs="Browallia New"/>
-                <w:b/>
-                <w:color w:val="64748B"/>
-                <w:sz w:val="20"/>
-                <w:lang w:bidi="th-TH"/>
-              </w:rPr>
-              <w:t>พร้อมรายการ</w:t>
-            </w:r>
-            <w:proofErr w:type="spellEnd"/>
-            <w:r>
-              <w:rPr>
-                <w:rFonts w:ascii="CMU Serif" w:hAnsi="CMU Serif" w:cs="CMU Serif"/>
-                <w:b/>
-                <w:color w:val="64748B"/>
-                <w:sz w:val="20"/>
-              </w:rPr>
-              <w:t xml:space="preserve"> 4 </w:t>
-            </w:r>
-            <w:proofErr w:type="spellStart"/>
-            <w:proofErr w:type="gramStart"/>
-            <w:r>
-              <w:rPr>
-                <w:rFonts w:ascii="Browallia New" w:hAnsi="Browallia New" w:cs="Browallia New"/>
-                <w:b/>
-                <w:color w:val="64748B"/>
-                <w:sz w:val="20"/>
-                <w:lang w:bidi="th-TH"/>
-              </w:rPr>
-              <w:t>หมวดหมู่</w:t>
-            </w:r>
-            <w:proofErr w:type="spellEnd"/>
-            <w:r>
-              <w:rPr>
-                <w:rFonts w:ascii="CMU Serif" w:hAnsi="CMU Serif" w:cs="CMU Serif"/>
-                <w:b/>
-                <w:color w:val="64748B"/>
-                <w:sz w:val="20"/>
-              </w:rPr>
-              <w:t xml:space="preserve"> ]</w:t>
-            </w:r>
-            <w:proofErr w:type="gramEnd"/>
-          </w:p>
-        </w:tc>
-      </w:tr>
-    </w:tbl>
-    <w:p>
-      <w:pPr>
-        <w:rPr>
-          <w:rFonts w:ascii="CMU Serif" w:hAnsi="CMU Serif" w:cs="CMU Serif"/>
-        </w:rPr>
-      </w:pPr>
+      <w:r>
+        <w:rPr>
+          <w:rFonts w:ascii="CMU Serif" w:hAnsi="CMU Serif" w:cs="CMU Serif"/>
+          <w:b/>
+        </w:rPr>
+        <w:t>2. Success Case (Backend Online &amp; Database Connected)</w:t>
+      </w:r>
     </w:p>
     <w:p>
       <w:pPr>
@@ -5638,12 +5172,110 @@
           <w:rFonts w:ascii="CMU Serif" w:hAnsi="CMU Serif" w:cs="CMU Serif"/>
         </w:rPr>
       </w:pPr>
-      <w:r>
-        <w:rPr>
-          <w:rFonts w:ascii="CMU Serif" w:hAnsi="CMU Serif" w:cs="CMU Serif"/>
-          <w:b/>
-        </w:rPr>
-        <w:t>3. Failure Case (Backend Offline / API Unavailable)</w:t>
+      <w:proofErr w:type="spellStart"/>
+      <w:r>
+        <w:rPr>
+          <w:rFonts w:ascii="Browallia New" w:hAnsi="Browallia New" w:cs="Browallia New"/>
+          <w:lang w:bidi="th-TH"/>
+        </w:rPr>
+        <w:t>เมื่อกดปุ่ม</w:t>
+      </w:r>
+      <w:proofErr w:type="spellEnd"/>
+      <w:r>
+        <w:rPr>
+          <w:rFonts w:ascii="CMU Serif" w:hAnsi="CMU Serif" w:cs="CMU Serif"/>
+        </w:rPr>
+        <w:t xml:space="preserve"> [Check System] </w:t>
+      </w:r>
+      <w:proofErr w:type="spellStart"/>
+      <w:r>
+        <w:rPr>
+          <w:rFonts w:ascii="Browallia New" w:hAnsi="Browallia New" w:cs="Browallia New"/>
+          <w:lang w:bidi="th-TH"/>
+        </w:rPr>
+        <w:t>โดยเปิด</w:t>
+      </w:r>
+      <w:proofErr w:type="spellEnd"/>
+      <w:r>
+        <w:rPr>
+          <w:rFonts w:ascii="CMU Serif" w:hAnsi="CMU Serif" w:cs="CMU Serif"/>
+        </w:rPr>
+        <w:t xml:space="preserve"> Backend Server </w:t>
+      </w:r>
+      <w:proofErr w:type="spellStart"/>
+      <w:r>
+        <w:rPr>
+          <w:rFonts w:ascii="Browallia New" w:hAnsi="Browallia New" w:cs="Browallia New"/>
+          <w:lang w:bidi="th-TH"/>
+        </w:rPr>
+        <w:t>และ</w:t>
+      </w:r>
+      <w:proofErr w:type="spellEnd"/>
+      <w:r>
+        <w:rPr>
+          <w:rFonts w:ascii="CMU Serif" w:hAnsi="CMU Serif" w:cs="CMU Serif"/>
+        </w:rPr>
+        <w:t xml:space="preserve"> Database </w:t>
+      </w:r>
+      <w:proofErr w:type="spellStart"/>
+      <w:r>
+        <w:rPr>
+          <w:rFonts w:ascii="Browallia New" w:hAnsi="Browallia New" w:cs="Browallia New"/>
+          <w:lang w:bidi="th-TH"/>
+        </w:rPr>
+        <w:t>ปกติ</w:t>
+      </w:r>
+      <w:proofErr w:type="spellEnd"/>
+      <w:r>
+        <w:rPr>
+          <w:rFonts w:ascii="CMU Serif" w:hAnsi="CMU Serif" w:cs="CMU Serif"/>
+        </w:rPr>
+        <w:t xml:space="preserve"> </w:t>
+      </w:r>
+      <w:proofErr w:type="spellStart"/>
+      <w:r>
+        <w:rPr>
+          <w:rFonts w:ascii="Browallia New" w:hAnsi="Browallia New" w:cs="Browallia New"/>
+          <w:lang w:bidi="th-TH"/>
+        </w:rPr>
+        <w:t>ระบบแสดงผลสถานะ</w:t>
+      </w:r>
+      <w:proofErr w:type="spellEnd"/>
+      <w:r>
+        <w:rPr>
+          <w:rFonts w:ascii="CMU Serif" w:hAnsi="CMU Serif" w:cs="CMU Serif"/>
+        </w:rPr>
+        <w:t xml:space="preserve"> System Status: Online </w:t>
+      </w:r>
+      <w:proofErr w:type="spellStart"/>
+      <w:r>
+        <w:rPr>
+          <w:rFonts w:ascii="Browallia New" w:hAnsi="Browallia New" w:cs="Browallia New"/>
+          <w:lang w:bidi="th-TH"/>
+        </w:rPr>
+        <w:t>พร้อมรายการ</w:t>
+      </w:r>
+      <w:proofErr w:type="spellEnd"/>
+      <w:r>
+        <w:rPr>
+          <w:rFonts w:ascii="CMU Serif" w:hAnsi="CMU Serif" w:cs="CMU Serif"/>
+        </w:rPr>
+        <w:t xml:space="preserve"> 4 </w:t>
+      </w:r>
+      <w:proofErr w:type="spellStart"/>
+      <w:r>
+        <w:rPr>
+          <w:rFonts w:ascii="Browallia New" w:hAnsi="Browallia New" w:cs="Browallia New"/>
+          <w:lang w:bidi="th-TH"/>
+        </w:rPr>
+        <w:t>หมวดหมู่</w:t>
+      </w:r>
+      <w:proofErr w:type="spellEnd"/>
+      <w:r>
+        <w:rPr>
+          <w:rFonts w:ascii="CMU Serif" w:hAnsi="CMU Serif" w:cs="CMU Serif"/>
+        </w:rPr>
+        <w:t xml:space="preserve"> (1. Account and Access, 2. Hardware, 3. Software, 4. Network)</w:t>
       </w:r>
     </w:p>
     <w:p>
@@ -5654,6 +5286,68 @@
       </w:pPr>
       <w:r>
         <w:rPr>
+          <w:rFonts w:ascii="CMU Serif" w:hAnsi="CMU Serif" w:cs="CMU Serif"/>
+        </w:rPr>
+        <w:lastRenderedPageBreak/>
+        <w:drawing>
+          <wp:inline distT="0" distB="0" distL="0" distR="0" wp14:anchorId="1FFA30E2" wp14:editId="7DB17487">
+            <wp:extent cx="2435311" cy="1977510"/>
+            <wp:effectExtent l="0" t="0" r="3175" b="3810"/>
+            <wp:docPr id="2011047818" name="Picture 1"/>
+            <wp:cNvGraphicFramePr>
+              <a:graphicFrameLocks xmlns:a="http://schemas.openxmlformats.org/drawingml/2006/main" noChangeAspect="1"/>
+            </wp:cNvGraphicFramePr>
+            <a:graphic xmlns:a="http://schemas.openxmlformats.org/drawingml/2006/main">
+              <a:graphicData uri="http://schemas.openxmlformats.org/drawingml/2006/picture">
+                <pic:pic xmlns:pic="http://schemas.openxmlformats.org/drawingml/2006/picture">
+                  <pic:nvPicPr>
+                    <pic:cNvPr id="2011047818" name=""/>
+                    <pic:cNvPicPr/>
+                  </pic:nvPicPr>
+                  <pic:blipFill>
+                    <a:blip r:embed="rId22"/>
+                    <a:stretch>
+                      <a:fillRect/>
+                    </a:stretch>
+                  </pic:blipFill>
+                  <pic:spPr>
+                    <a:xfrm>
+                      <a:off x="0" y="0"/>
+                      <a:ext cx="2445969" cy="1986165"/>
+                    </a:xfrm>
+                    <a:prstGeom prst="rect">
+                      <a:avLst/>
+                    </a:prstGeom>
+                  </pic:spPr>
+                </pic:pic>
+              </a:graphicData>
+            </a:graphic>
+          </wp:inline>
+        </w:drawing>
+      </w:r>
+    </w:p>
+    <w:p>
+      <w:pPr>
+        <w:rPr>
+          <w:rFonts w:ascii="CMU Serif" w:hAnsi="CMU Serif" w:cs="CMU Serif"/>
+        </w:rPr>
+      </w:pPr>
+      <w:r>
+        <w:rPr>
+          <w:rFonts w:ascii="CMU Serif" w:hAnsi="CMU Serif" w:cs="CMU Serif"/>
+          <w:b/>
+        </w:rPr>
+        <w:t>3. Failure Case (Backend Offline / API Unavailable)</w:t>
+      </w:r>
+    </w:p>
+    <w:p>
+      <w:pPr>
+        <w:rPr>
+          <w:rFonts w:ascii="CMU Serif" w:hAnsi="CMU Serif" w:cs="CMU Serif"/>
+        </w:rPr>
+      </w:pPr>
+      <w:r>
+        <w:rPr>
           <w:rFonts w:ascii="Browallia New" w:hAnsi="Browallia New" w:cs="Browallia New"/>
         </w:rPr>
         <w:t>เมื่อกดปุ่ม</w:t>
@@ -5725,126 +5419,6 @@
         <w:t xml:space="preserve"> Unable to connect to TokTickIT API</w:t>
       </w:r>
     </w:p>
-    <w:tbl>
-      <w:tblPr>
-        <w:tblW w:w="0" w:type="auto"/>
-        <w:jc w:val="center"/>
-        <w:tblLayout w:type="fixed"/>
-        <w:tblLook w:val="04A0" w:firstRow="1" w:lastRow="0" w:firstColumn="1" w:lastColumn="0" w:noHBand="0" w:noVBand="1"/>
-      </w:tblPr>
-      <w:tblGrid>
-        <w:gridCol w:w="9360"/>
-      </w:tblGrid>
-      <w:tr>
-        <w:trPr>
-          <w:jc w:val="center"/>
-        </w:trPr>
-        <w:tc>
-          <w:tcPr>
-            <w:tcW w:w="9360" w:type="dxa"/>
-            <w:tcBorders>
-              <w:top w:val="dashed" w:sz="12" w:space="0" w:color="94A3B8"/>
-              <w:left w:val="dashed" w:sz="12" w:space="0" w:color="94A3B8"/>
-              <w:bottom w:val="dashed" w:sz="12" w:space="0" w:color="94A3B8"/>
-              <w:right w:val="dashed" w:sz="12" w:space="0" w:color="94A3B8"/>
-            </w:tcBorders>
-            <w:shd w:val="clear" w:color="auto" w:fill="F8FAFC"/>
-            <w:tcMar>
-              <w:top w:w="240" w:type="dxa"/>
-              <w:left w:w="200" w:type="dxa"/>
-              <w:bottom w:w="240" w:type="dxa"/>
-              <w:right w:w="200" w:type="dxa"/>
-            </w:tcMar>
-          </w:tcPr>
-          <w:p>
-            <w:pPr>
-              <w:spacing w:before="160" w:after="160"/>
-              <w:jc w:val="center"/>
-              <w:rPr>
-                <w:rFonts w:ascii="CMU Serif" w:hAnsi="CMU Serif" w:cs="CMU Serif"/>
-              </w:rPr>
-            </w:pPr>
-            <w:r>
-              <w:rPr>
-                <w:rFonts w:ascii="Segoe UI Emoji" w:hAnsi="Segoe UI Emoji" w:cs="Segoe UI Emoji"/>
-                <w:sz w:val="28"/>
-              </w:rPr>
-              <w:t>📷</w:t>
-            </w:r>
-            <w:r>
-              <w:rPr>
-                <w:rFonts w:ascii="CMU Serif" w:hAnsi="CMU Serif" w:cs="CMU Serif"/>
-                <w:sz w:val="28"/>
-              </w:rPr>
-              <w:t xml:space="preserve"> </w:t>
-            </w:r>
-            <w:r>
-              <w:rPr>
-                <w:rFonts w:ascii="CMU Serif" w:hAnsi="CMU Serif" w:cs="CMU Serif"/>
-                <w:b/>
-                <w:color w:val="64748B"/>
-                <w:sz w:val="20"/>
-              </w:rPr>
-              <w:t xml:space="preserve">[ </w:t>
-            </w:r>
-            <w:r>
-              <w:rPr>
-                <w:rFonts w:ascii="Browallia New" w:hAnsi="Browallia New" w:cs="Browallia New"/>
-                <w:b/>
-                <w:color w:val="64748B"/>
-                <w:sz w:val="20"/>
-              </w:rPr>
-              <w:t>แนบภาพ</w:t>
-            </w:r>
-            <w:r>
-              <w:rPr>
-                <w:rFonts w:ascii="CMU Serif" w:hAnsi="CMU Serif" w:cs="CMU Serif"/>
-                <w:b/>
-                <w:color w:val="64748B"/>
-                <w:sz w:val="20"/>
-              </w:rPr>
-              <w:t xml:space="preserve"> Screenshot: </w:t>
-            </w:r>
-            <w:r>
-              <w:rPr>
-                <w:rFonts w:ascii="Browallia New" w:hAnsi="Browallia New" w:cs="Browallia New"/>
-                <w:b/>
-                <w:color w:val="64748B"/>
-                <w:sz w:val="20"/>
-              </w:rPr>
-              <w:t>หน้าจอแสดง</w:t>
-            </w:r>
-            <w:r>
-              <w:rPr>
-                <w:rFonts w:ascii="CMU Serif" w:hAnsi="CMU Serif" w:cs="CMU Serif"/>
-                <w:b/>
-                <w:color w:val="64748B"/>
-                <w:sz w:val="20"/>
-              </w:rPr>
-              <w:t xml:space="preserve"> System Status: Offline </w:t>
-            </w:r>
-            <w:r>
-              <w:rPr>
-                <w:rFonts w:ascii="Browallia New" w:hAnsi="Browallia New" w:cs="Browallia New"/>
-                <w:b/>
-                <w:color w:val="64748B"/>
-                <w:sz w:val="20"/>
-              </w:rPr>
-              <w:t>พร้อมข้อความ</w:t>
-            </w:r>
-            <w:r>
-              <w:rPr>
-                <w:rFonts w:ascii="CMU Serif" w:hAnsi="CMU Serif" w:cs="CMU Serif"/>
-                <w:b/>
-                <w:color w:val="64748B"/>
-                <w:sz w:val="20"/>
-              </w:rPr>
-              <w:t xml:space="preserve"> Unable to connect to TokTickIT API ]</w:t>
-            </w:r>
-          </w:p>
-        </w:tc>
-      </w:tr>
-    </w:tbl>
     <w:p>
       <w:pPr>
         <w:rPr>
@@ -6673,7 +6247,6 @@
   <w:style w:type="character" w:default="1" w:styleId="DefaultParagraphFont">
     <w:name w:val="Default Paragraph Font"/>
     <w:uiPriority w:val="1"/>
-    <w:semiHidden/>
     <w:unhideWhenUsed/>
   </w:style>
   <w:style w:type="table" w:default="1" w:styleId="TableNormal">

</xml_diff>

<commit_message>
feat: complete Lab 2 TokTickIT Requester Ticketing MVP implementation and tests
</commit_message>
<xml_diff>
--- a/docs/lab-01/LAB1_SUBMISSION_REPORT.docx
+++ b/docs/lab-01/LAB1_SUBMISSION_REPORT.docx
@@ -178,7 +178,8 @@
             <w:pPr>
               <w:spacing w:before="40" w:after="40"/>
               <w:rPr>
-                <w:rFonts w:ascii="CMU Serif" w:hAnsi="CMU Serif" w:cs="CMU Serif"/>
+                <w:rFonts w:ascii="CMU Serif" w:hAnsi="CMU Serif" w:cs="Cordia New"/>
+                <w:lang w:bidi="th-TH"/>
               </w:rPr>
             </w:pPr>
             <w:r>
@@ -193,7 +194,33 @@
               <w:rPr>
                 <w:rFonts w:ascii="CMU Serif" w:hAnsi="CMU Serif" w:cs="CMU Serif"/>
               </w:rPr>
-              <w:t xml:space="preserve"> Chanya (6707051058, @chanya06)</w:t>
+              <w:t xml:space="preserve"> Chanya (</w:t>
+            </w:r>
+            <w:proofErr w:type="gramStart"/>
+            <w:r>
+              <w:rPr>
+                <w:rFonts w:ascii="CMU Serif" w:hAnsi="CMU Serif" w:cs="CMU Serif"/>
+              </w:rPr>
+              <w:t>670705</w:t>
+            </w:r>
+            <w:r>
+              <w:rPr>
+                <w:rFonts w:ascii="CMU Serif" w:hAnsi="CMU Serif" w:cs="CMU Serif"/>
+              </w:rPr>
+              <w:t>0</w:t>
+            </w:r>
+            <w:r>
+              <w:rPr>
+                <w:rFonts w:ascii="CMU Serif" w:hAnsi="CMU Serif" w:cs="CMU Serif"/>
+              </w:rPr>
+              <w:t>1058, @</w:t>
+            </w:r>
+            <w:proofErr w:type="gramEnd"/>
+            <w:r>
+              <w:rPr>
+                <w:rFonts w:ascii="CMU Serif" w:hAnsi="CMU Serif" w:cs="CMU Serif"/>
+              </w:rPr>
+              <w:t>chanya06)</w:t>
             </w:r>
           </w:p>
         </w:tc>
@@ -225,7 +252,7 @@
     <w:p>
       <w:pPr>
         <w:rPr>
-          <w:rFonts w:ascii="CMU Serif" w:hAnsi="CMU Serif" w:cs="Cordia New" w:hint="cs"/>
+          <w:rFonts w:ascii="CMU Serif" w:hAnsi="CMU Serif" w:cs="Cordia New"/>
           <w:cs/>
           <w:lang w:bidi="th-TH"/>
         </w:rPr>
@@ -602,6 +629,7 @@
       <w:r>
         <w:rPr>
           <w:rFonts w:ascii="CMU Serif" w:hAnsi="CMU Serif" w:cs="CMU Serif"/>
+          <w:noProof/>
         </w:rPr>
         <w:drawing>
           <wp:inline distT="0" distB="0" distL="0" distR="0" wp14:anchorId="72365607" wp14:editId="153555F7">
@@ -871,6 +899,7 @@
       <w:r>
         <w:rPr>
           <w:rFonts w:ascii="CMU Serif" w:hAnsi="CMU Serif" w:cs="CMU Serif"/>
+          <w:noProof/>
         </w:rPr>
         <w:drawing>
           <wp:inline distT="0" distB="0" distL="0" distR="0" wp14:anchorId="4DF259BE" wp14:editId="21C5F0DD">
@@ -966,6 +995,7 @@
       <w:r>
         <w:rPr>
           <w:rFonts w:ascii="CMU Serif" w:hAnsi="CMU Serif" w:cs="CMU Serif"/>
+          <w:noProof/>
         </w:rPr>
         <w:drawing>
           <wp:inline distT="0" distB="0" distL="0" distR="0" wp14:anchorId="55FF2004" wp14:editId="4BF6DCE4">
@@ -1006,6 +1036,7 @@
       <w:r>
         <w:rPr>
           <w:rFonts w:ascii="CMU Serif" w:hAnsi="CMU Serif" w:cs="CMU Serif"/>
+          <w:noProof/>
         </w:rPr>
         <w:drawing>
           <wp:inline distT="0" distB="0" distL="0" distR="0" wp14:anchorId="574B25A1" wp14:editId="2AB90D9B">
@@ -1797,27 +1828,7 @@
           <w:bCs/>
           <w:sz w:val="22"/>
         </w:rPr>
-        <w:t xml:space="preserve">set up </w:t>
-      </w:r>
-      <w:proofErr w:type="spellStart"/>
-      <w:r>
-        <w:rPr>
-          <w:rFonts w:ascii="CMU Serif" w:hAnsi="CMU Serif" w:cs="CMU Serif"/>
-          <w:b/>
-          <w:bCs/>
-          <w:sz w:val="22"/>
-        </w:rPr>
-        <w:t>TokTickIT</w:t>
-      </w:r>
-      <w:proofErr w:type="spellEnd"/>
-      <w:r>
-        <w:rPr>
-          <w:rFonts w:ascii="CMU Serif" w:hAnsi="CMU Serif" w:cs="CMU Serif"/>
-          <w:b/>
-          <w:bCs/>
-          <w:sz w:val="22"/>
-        </w:rPr>
-        <w:t xml:space="preserve"> project foundation (Issue #1)</w:t>
+        <w:t>set up TokTickIT project foundation (Issue #1)</w:t>
       </w:r>
       <w:r>
         <w:rPr>
@@ -1831,6 +1842,7 @@
         <w:rPr>
           <w:rFonts w:ascii="CMU Serif" w:hAnsi="CMU Serif" w:cs="CMU Serif"/>
           <w:i/>
+          <w:noProof/>
         </w:rPr>
         <w:drawing>
           <wp:inline distT="0" distB="0" distL="0" distR="0" wp14:anchorId="3BAE8D1B" wp14:editId="64B13247">
@@ -1886,27 +1898,7 @@
           <w:bCs/>
           <w:sz w:val="22"/>
         </w:rPr>
-        <w:t>Feature 2: Implement GET /</w:t>
-      </w:r>
-      <w:proofErr w:type="spellStart"/>
-      <w:r>
-        <w:rPr>
-          <w:rFonts w:ascii="CMU Serif" w:hAnsi="CMU Serif" w:cs="CMU Serif"/>
-          <w:b/>
-          <w:bCs/>
-          <w:sz w:val="22"/>
-        </w:rPr>
-        <w:t>api</w:t>
-      </w:r>
-      <w:proofErr w:type="spellEnd"/>
-      <w:r>
-        <w:rPr>
-          <w:rFonts w:ascii="CMU Serif" w:hAnsi="CMU Serif" w:cs="CMU Serif"/>
-          <w:b/>
-          <w:bCs/>
-          <w:sz w:val="22"/>
-        </w:rPr>
-        <w:t>/health endpoint (Issue #2)</w:t>
+        <w:t>Feature 2: Implement GET /api/health endpoint (Issue #2)</w:t>
       </w:r>
     </w:p>
     <w:p>
@@ -1921,6 +1913,7 @@
         <w:rPr>
           <w:rFonts w:ascii="CMU Serif" w:hAnsi="CMU Serif" w:cs="CMU Serif"/>
           <w:i/>
+          <w:noProof/>
         </w:rPr>
         <w:drawing>
           <wp:inline distT="0" distB="0" distL="0" distR="0" wp14:anchorId="1D11C7F0" wp14:editId="0BA24C75">
@@ -2001,6 +1994,7 @@
         <w:rPr>
           <w:rFonts w:ascii="CMU Serif" w:hAnsi="CMU Serif" w:cs="CMU Serif"/>
           <w:i/>
+          <w:noProof/>
         </w:rPr>
         <w:drawing>
           <wp:inline distT="0" distB="0" distL="0" distR="0" wp14:anchorId="0F9F302B" wp14:editId="1AF3881F">
@@ -2068,6 +2062,7 @@
         <w:rPr>
           <w:rFonts w:ascii="CMU Serif" w:hAnsi="CMU Serif" w:cs="CMU Serif"/>
           <w:i/>
+          <w:noProof/>
         </w:rPr>
         <w:drawing>
           <wp:inline distT="0" distB="0" distL="0" distR="0" wp14:anchorId="0EE8208C" wp14:editId="1BD5735F">
@@ -2119,15 +2114,16 @@
       <w:pPr>
         <w:spacing w:before="120"/>
         <w:rPr>
-          <w:rFonts w:ascii="CMU Serif" w:hAnsi="CMU Serif" w:cs="CMU Serif"/>
+          <w:rFonts w:ascii="CMU Serif" w:hAnsi="CMU Serif" w:cs="Cordia New"/>
           <w:b/>
-          <w:bCs/>
+          <w:lang w:bidi="th-TH"/>
         </w:rPr>
       </w:pPr>
       <w:r>
         <w:rPr>
           <w:rFonts w:ascii="CMU Serif" w:hAnsi="CMU Serif" w:cs="CMU Serif"/>
           <w:i/>
+          <w:noProof/>
         </w:rPr>
         <w:lastRenderedPageBreak/>
         <w:drawing>
@@ -2208,10 +2204,29 @@
         </w:rPr>
         <w:t>Pull Requests I reviewed for my partner:</w:t>
       </w:r>
-      <w:r>
-        <w:rPr>
-          <w:rFonts w:ascii="CMU Serif" w:hAnsi="CMU Serif" w:cs="CMU Serif"/>
+    </w:p>
+    <w:p>
+      <w:pPr>
+        <w:spacing w:before="120"/>
+        <w:rPr>
+          <w:rFonts w:ascii="CMU Serif" w:hAnsi="CMU Serif" w:cs="Cordia New"/>
           <w:b/>
+          <w:color w:val="4F6228" w:themeColor="accent3" w:themeShade="80"/>
+          <w:lang w:bidi="th-TH"/>
+        </w:rPr>
+      </w:pPr>
+      <w:r>
+        <w:rPr>
+          <w:rFonts w:ascii="CMU Serif" w:hAnsi="CMU Serif" w:cs="CMU Serif"/>
+          <w:b/>
+          <w:color w:val="4F6228" w:themeColor="accent3" w:themeShade="80"/>
+        </w:rPr>
+        <w:t>https://github.com/jejaebubu/toktickit/pull/5</w:t>
+      </w:r>
+      <w:r>
+        <w:rPr>
+          <w:rFonts w:ascii="CMU Serif" w:hAnsi="CMU Serif" w:cs="CMU Serif"/>
+          <w:b/>
         </w:rPr>
         <w:br/>
       </w:r>
@@ -2219,10 +2234,11 @@
         <w:rPr>
           <w:rFonts w:ascii="CMU Serif" w:hAnsi="CMU Serif" w:cs="CMU Serif"/>
           <w:i/>
+          <w:noProof/>
         </w:rPr>
         <w:drawing>
-          <wp:inline distT="0" distB="0" distL="0" distR="0" wp14:anchorId="09AAE8B7" wp14:editId="63FA2369">
-            <wp:extent cx="5321643" cy="2273053"/>
+          <wp:inline distT="0" distB="0" distL="0" distR="0" wp14:anchorId="09AAE8B7" wp14:editId="237D8BEF">
+            <wp:extent cx="4689987" cy="2003251"/>
             <wp:effectExtent l="0" t="0" r="0" b="0"/>
             <wp:docPr id="1251105968" name="Picture 1"/>
             <wp:cNvGraphicFramePr>
@@ -2244,7 +2260,7 @@
                   <pic:spPr>
                     <a:xfrm>
                       <a:off x="0" y="0"/>
-                      <a:ext cx="5327858" cy="2275707"/>
+                      <a:ext cx="4701967" cy="2008368"/>
                     </a:xfrm>
                     <a:prstGeom prst="rect">
                       <a:avLst/>
@@ -2261,19 +2277,75 @@
       <w:pPr>
         <w:spacing w:before="120"/>
         <w:rPr>
-          <w:rFonts w:ascii="CMU Serif" w:hAnsi="CMU Serif" w:cs="CMU Serif"/>
+          <w:rFonts w:ascii="CMU Serif" w:hAnsi="CMU Serif" w:cs="Cordia New"/>
+          <w:b/>
+          <w:bCs/>
+          <w:color w:val="4F6228" w:themeColor="accent3" w:themeShade="80"/>
+          <w:lang w:bidi="th-TH"/>
+        </w:rPr>
+      </w:pPr>
+      <w:r>
+        <w:rPr>
+          <w:rFonts w:ascii="CMU Serif" w:hAnsi="CMU Serif" w:cs="Cordia New"/>
+          <w:b/>
+          <w:bCs/>
+          <w:color w:val="4F6228" w:themeColor="accent3" w:themeShade="80"/>
+          <w:lang w:bidi="th-TH"/>
+        </w:rPr>
+        <w:t>https://github.com/chanya</w:t>
+      </w:r>
+      <w:r>
+        <w:rPr>
+          <w:rFonts w:ascii="CMU Serif" w:hAnsi="CMU Serif" w:cs="Cordia New"/>
+          <w:b/>
+          <w:bCs/>
+          <w:color w:val="4F6228" w:themeColor="accent3" w:themeShade="80"/>
+          <w:cs/>
+          <w:lang w:bidi="th-TH"/>
+        </w:rPr>
+        <w:t>06/</w:t>
+      </w:r>
+      <w:r>
+        <w:rPr>
+          <w:rFonts w:ascii="CMU Serif" w:hAnsi="CMU Serif" w:cs="Cordia New"/>
+          <w:b/>
+          <w:bCs/>
+          <w:color w:val="4F6228" w:themeColor="accent3" w:themeShade="80"/>
+          <w:lang w:bidi="th-TH"/>
+        </w:rPr>
+        <w:t>toktickit/pull/</w:t>
+      </w:r>
+      <w:r>
+        <w:rPr>
+          <w:rFonts w:ascii="CMU Serif" w:hAnsi="CMU Serif" w:cs="Cordia New"/>
+          <w:b/>
+          <w:bCs/>
+          <w:color w:val="4F6228" w:themeColor="accent3" w:themeShade="80"/>
+          <w:cs/>
+          <w:lang w:bidi="th-TH"/>
+        </w:rPr>
+        <w:t>7</w:t>
+      </w:r>
+    </w:p>
+    <w:p>
+      <w:pPr>
+        <w:spacing w:before="120"/>
+        <w:rPr>
+          <w:rFonts w:ascii="CMU Serif" w:hAnsi="CMU Serif" w:cs="Cordia New"/>
           <w:i/>
+          <w:lang w:bidi="th-TH"/>
         </w:rPr>
       </w:pPr>
       <w:r>
         <w:rPr>
           <w:rFonts w:ascii="CMU Serif" w:hAnsi="CMU Serif" w:cs="CMU Serif"/>
           <w:i/>
+          <w:noProof/>
         </w:rPr>
         <w:drawing>
-          <wp:inline distT="0" distB="0" distL="0" distR="0" wp14:anchorId="754410BE" wp14:editId="6A5D6B7F">
-            <wp:extent cx="6309360" cy="2032000"/>
-            <wp:effectExtent l="0" t="0" r="0" b="6350"/>
+          <wp:inline distT="0" distB="0" distL="0" distR="0" wp14:anchorId="754410BE" wp14:editId="10AA8067">
+            <wp:extent cx="4660490" cy="1500963"/>
+            <wp:effectExtent l="0" t="0" r="6985" b="4445"/>
             <wp:docPr id="2132451295" name="Picture 1"/>
             <wp:cNvGraphicFramePr>
               <a:graphicFrameLocks xmlns:a="http://schemas.openxmlformats.org/drawingml/2006/main" noChangeAspect="1"/>
@@ -2294,7 +2366,7 @@
                   <pic:spPr>
                     <a:xfrm>
                       <a:off x="0" y="0"/>
-                      <a:ext cx="6309360" cy="2032000"/>
+                      <a:ext cx="4670143" cy="1504072"/>
                     </a:xfrm>
                     <a:prstGeom prst="rect">
                       <a:avLst/>
@@ -2312,15 +2384,76 @@
         <w:spacing w:before="120"/>
         <w:rPr>
           <w:rFonts w:ascii="CMU Serif" w:hAnsi="CMU Serif" w:cs="CMU Serif"/>
+          <w:b/>
+          <w:bCs/>
+          <w:iCs/>
+          <w:color w:val="4F6228" w:themeColor="accent3" w:themeShade="80"/>
+          <w:lang w:bidi="th-TH"/>
+        </w:rPr>
+      </w:pPr>
+      <w:r>
+        <w:rPr>
+          <w:rFonts w:ascii="CMU Serif" w:hAnsi="CMU Serif" w:cs="CMU Serif"/>
+          <w:b/>
+          <w:bCs/>
+          <w:iCs/>
+          <w:color w:val="4F6228" w:themeColor="accent3" w:themeShade="80"/>
+          <w:lang w:bidi="th-TH"/>
+        </w:rPr>
+        <w:lastRenderedPageBreak/>
+        <w:t>https://github.com/chanya</w:t>
+      </w:r>
+      <w:r>
+        <w:rPr>
+          <w:rFonts w:ascii="CMU Serif" w:hAnsi="CMU Serif" w:cs="CMU Serif"/>
+          <w:b/>
+          <w:bCs/>
+          <w:iCs/>
+          <w:color w:val="4F6228" w:themeColor="accent3" w:themeShade="80"/>
+          <w:cs/>
+          <w:lang w:bidi="th-TH"/>
+        </w:rPr>
+        <w:t>06/</w:t>
+      </w:r>
+      <w:r>
+        <w:rPr>
+          <w:rFonts w:ascii="CMU Serif" w:hAnsi="CMU Serif" w:cs="CMU Serif"/>
+          <w:b/>
+          <w:bCs/>
+          <w:iCs/>
+          <w:color w:val="4F6228" w:themeColor="accent3" w:themeShade="80"/>
+          <w:lang w:bidi="th-TH"/>
+        </w:rPr>
+        <w:t>toktickit/pull/</w:t>
+      </w:r>
+      <w:r>
+        <w:rPr>
+          <w:rFonts w:ascii="CMU Serif" w:hAnsi="CMU Serif" w:cs="CMU Serif"/>
+          <w:b/>
+          <w:bCs/>
+          <w:iCs/>
+          <w:color w:val="4F6228" w:themeColor="accent3" w:themeShade="80"/>
+          <w:cs/>
+          <w:lang w:bidi="th-TH"/>
+        </w:rPr>
+        <w:t>8</w:t>
+      </w:r>
+    </w:p>
+    <w:p>
+      <w:pPr>
+        <w:spacing w:before="120"/>
+        <w:rPr>
+          <w:rFonts w:ascii="CMU Serif" w:hAnsi="CMU Serif" w:cs="Cordia New"/>
           <w:i/>
+          <w:lang w:bidi="th-TH"/>
         </w:rPr>
       </w:pPr>
       <w:r>
         <w:rPr>
           <w:rFonts w:ascii="CMU Serif" w:hAnsi="CMU Serif" w:cs="CMU Serif"/>
           <w:i/>
-        </w:rPr>
-        <w:lastRenderedPageBreak/>
+          <w:noProof/>
+        </w:rPr>
         <w:drawing>
           <wp:inline distT="0" distB="0" distL="0" distR="0" wp14:anchorId="7164ECEF" wp14:editId="1682056A">
             <wp:extent cx="4983891" cy="1890026"/>
@@ -2362,19 +2495,80 @@
       <w:pPr>
         <w:spacing w:before="120"/>
         <w:rPr>
-          <w:rFonts w:ascii="CMU Serif" w:hAnsi="CMU Serif" w:cs="CMU Serif"/>
+          <w:rFonts w:ascii="CMU Serif" w:hAnsi="CMU Serif" w:cs="Cordia New"/>
+          <w:b/>
+          <w:bCs/>
+          <w:iCs/>
+          <w:color w:val="4F6228" w:themeColor="accent3" w:themeShade="80"/>
+          <w:lang w:bidi="th-TH"/>
+        </w:rPr>
+      </w:pPr>
+      <w:r>
+        <w:rPr>
+          <w:rFonts w:ascii="CMU Serif" w:hAnsi="CMU Serif" w:cs="Cordia New"/>
+          <w:b/>
+          <w:bCs/>
+          <w:iCs/>
+          <w:color w:val="4F6228" w:themeColor="accent3" w:themeShade="80"/>
+          <w:lang w:bidi="th-TH"/>
+        </w:rPr>
+        <w:t>https://github.com/Suprawi</w:t>
+      </w:r>
+      <w:r>
+        <w:rPr>
+          <w:rFonts w:ascii="CMU Serif" w:hAnsi="CMU Serif" w:cs="Cordia New"/>
+          <w:b/>
+          <w:bCs/>
+          <w:iCs/>
+          <w:color w:val="4F6228" w:themeColor="accent3" w:themeShade="80"/>
+          <w:cs/>
+          <w:lang w:bidi="th-TH"/>
+        </w:rPr>
+        <w:t>5227/</w:t>
+      </w:r>
+      <w:r>
+        <w:rPr>
+          <w:rFonts w:ascii="CMU Serif" w:hAnsi="CMU Serif" w:cs="Cordia New"/>
+          <w:b/>
+          <w:bCs/>
+          <w:iCs/>
+          <w:color w:val="4F6228" w:themeColor="accent3" w:themeShade="80"/>
+          <w:lang w:bidi="th-TH"/>
+        </w:rPr>
+        <w:t>toktickit/pull/</w:t>
+      </w:r>
+      <w:r>
+        <w:rPr>
+          <w:rFonts w:ascii="CMU Serif" w:hAnsi="CMU Serif" w:cs="Cordia New"/>
+          <w:b/>
+          <w:bCs/>
+          <w:iCs/>
+          <w:color w:val="4F6228" w:themeColor="accent3" w:themeShade="80"/>
+          <w:cs/>
+          <w:lang w:bidi="th-TH"/>
+        </w:rPr>
+        <w:t>6</w:t>
+      </w:r>
+    </w:p>
+    <w:p>
+      <w:pPr>
+        <w:spacing w:before="120"/>
+        <w:rPr>
+          <w:rFonts w:ascii="CMU Serif" w:hAnsi="CMU Serif" w:cs="Cordia New"/>
           <w:i/>
+          <w:lang w:bidi="th-TH"/>
         </w:rPr>
       </w:pPr>
       <w:r>
         <w:rPr>
           <w:rFonts w:ascii="CMU Serif" w:hAnsi="CMU Serif" w:cs="CMU Serif"/>
           <w:i/>
+          <w:noProof/>
         </w:rPr>
         <w:drawing>
-          <wp:inline distT="0" distB="0" distL="0" distR="0" wp14:anchorId="3758060C" wp14:editId="1D22BF84">
-            <wp:extent cx="4786183" cy="1744722"/>
-            <wp:effectExtent l="0" t="0" r="0" b="8255"/>
+          <wp:inline distT="0" distB="0" distL="0" distR="0" wp14:anchorId="3758060C" wp14:editId="3B060AF0">
+            <wp:extent cx="3823307" cy="1393722"/>
+            <wp:effectExtent l="0" t="0" r="6350" b="0"/>
             <wp:docPr id="619359284" name="Picture 1"/>
             <wp:cNvGraphicFramePr>
               <a:graphicFrameLocks xmlns:a="http://schemas.openxmlformats.org/drawingml/2006/main" noChangeAspect="1"/>
@@ -2395,7 +2589,7 @@
                   <pic:spPr>
                     <a:xfrm>
                       <a:off x="0" y="0"/>
-                      <a:ext cx="4805725" cy="1751846"/>
+                      <a:ext cx="3853519" cy="1404735"/>
                     </a:xfrm>
                     <a:prstGeom prst="rect">
                       <a:avLst/>
@@ -2412,14 +2606,52 @@
       <w:pPr>
         <w:spacing w:before="120"/>
         <w:rPr>
-          <w:rFonts w:ascii="CMU Serif" w:hAnsi="CMU Serif" w:cs="CMU Serif"/>
+          <w:rFonts w:ascii="CMU Serif" w:hAnsi="CMU Serif" w:cs="Cordia New"/>
+          <w:b/>
+          <w:bCs/>
+          <w:iCs/>
+          <w:color w:val="4F6228" w:themeColor="accent3" w:themeShade="80"/>
+          <w:lang w:bidi="th-TH"/>
+        </w:rPr>
+      </w:pPr>
+      <w:r>
+        <w:rPr>
+          <w:rFonts w:ascii="CMU Serif" w:hAnsi="CMU Serif" w:cs="Cordia New"/>
+          <w:b/>
+          <w:bCs/>
+          <w:iCs/>
+          <w:color w:val="4F6228" w:themeColor="accent3" w:themeShade="80"/>
+          <w:lang w:bidi="th-TH"/>
+        </w:rPr>
+        <w:t>https://github.com/phatthidawadi/toktickit/pull/</w:t>
+      </w:r>
+      <w:r>
+        <w:rPr>
+          <w:rFonts w:ascii="CMU Serif" w:hAnsi="CMU Serif" w:cs="Cordia New"/>
+          <w:b/>
+          <w:bCs/>
+          <w:iCs/>
+          <w:color w:val="4F6228" w:themeColor="accent3" w:themeShade="80"/>
+          <w:cs/>
+          <w:lang w:bidi="th-TH"/>
+        </w:rPr>
+        <w:t>13</w:t>
+      </w:r>
+    </w:p>
+    <w:p>
+      <w:pPr>
+        <w:spacing w:before="120"/>
+        <w:rPr>
+          <w:rFonts w:ascii="CMU Serif" w:hAnsi="CMU Serif" w:cs="Cordia New"/>
           <w:i/>
+          <w:lang w:bidi="th-TH"/>
         </w:rPr>
       </w:pPr>
       <w:r>
         <w:rPr>
           <w:rFonts w:ascii="CMU Serif" w:hAnsi="CMU Serif" w:cs="CMU Serif"/>
           <w:i/>
+          <w:noProof/>
         </w:rPr>
         <w:drawing>
           <wp:inline distT="0" distB="0" distL="0" distR="0" wp14:anchorId="7AD7F388" wp14:editId="00CDDA69">
@@ -2462,15 +2694,75 @@
       <w:pPr>
         <w:spacing w:before="120"/>
         <w:rPr>
-          <w:rFonts w:ascii="CMU Serif" w:hAnsi="CMU Serif" w:cs="CMU Serif"/>
+          <w:rFonts w:ascii="CMU Serif" w:hAnsi="CMU Serif" w:cs="Cordia New"/>
           <w:b/>
           <w:bCs/>
+          <w:iCs/>
+          <w:color w:val="4F6228" w:themeColor="accent3" w:themeShade="80"/>
+          <w:lang w:bidi="th-TH"/>
         </w:rPr>
       </w:pPr>
       <w:r>
         <w:rPr>
+          <w:rFonts w:ascii="CMU Serif" w:hAnsi="CMU Serif" w:cs="Cordia New"/>
+          <w:b/>
+          <w:bCs/>
+          <w:iCs/>
+          <w:color w:val="4F6228" w:themeColor="accent3" w:themeShade="80"/>
+          <w:lang w:bidi="th-TH"/>
+        </w:rPr>
+        <w:t>https://github.com/chanya</w:t>
+      </w:r>
+      <w:r>
+        <w:rPr>
+          <w:rFonts w:ascii="CMU Serif" w:hAnsi="CMU Serif" w:cs="Cordia New"/>
+          <w:b/>
+          <w:bCs/>
+          <w:iCs/>
+          <w:color w:val="4F6228" w:themeColor="accent3" w:themeShade="80"/>
+          <w:cs/>
+          <w:lang w:bidi="th-TH"/>
+        </w:rPr>
+        <w:t>06/</w:t>
+      </w:r>
+      <w:r>
+        <w:rPr>
+          <w:rFonts w:ascii="CMU Serif" w:hAnsi="CMU Serif" w:cs="Cordia New"/>
+          <w:b/>
+          <w:bCs/>
+          <w:iCs/>
+          <w:color w:val="4F6228" w:themeColor="accent3" w:themeShade="80"/>
+          <w:lang w:bidi="th-TH"/>
+        </w:rPr>
+        <w:t>toktickit/pull/</w:t>
+      </w:r>
+      <w:r>
+        <w:rPr>
+          <w:rFonts w:ascii="CMU Serif" w:hAnsi="CMU Serif" w:cs="Cordia New"/>
+          <w:b/>
+          <w:bCs/>
+          <w:iCs/>
+          <w:color w:val="4F6228" w:themeColor="accent3" w:themeShade="80"/>
+          <w:cs/>
+          <w:lang w:bidi="th-TH"/>
+        </w:rPr>
+        <w:t>10</w:t>
+      </w:r>
+    </w:p>
+    <w:p>
+      <w:pPr>
+        <w:spacing w:before="120"/>
+        <w:rPr>
+          <w:rFonts w:ascii="CMU Serif" w:hAnsi="CMU Serif" w:cs="CMU Serif"/>
+          <w:b/>
+          <w:bCs/>
+        </w:rPr>
+      </w:pPr>
+      <w:r>
+        <w:rPr>
           <w:rFonts w:ascii="CMU Serif" w:hAnsi="CMU Serif" w:cs="CMU Serif"/>
           <w:i/>
+          <w:noProof/>
         </w:rPr>
         <w:drawing>
           <wp:inline distT="0" distB="0" distL="0" distR="0" wp14:anchorId="03A89052" wp14:editId="536BB5D6">
@@ -2527,6 +2819,7 @@
           <w:rFonts w:ascii="CMU Serif" w:hAnsi="CMU Serif" w:cs="CMU Serif"/>
           <w:b/>
         </w:rPr>
+        <w:lastRenderedPageBreak/>
         <w:t>Partner's response:</w:t>
       </w:r>
       <w:r>
@@ -2557,7 +2850,6 @@
           <w:rFonts w:ascii="CMU Serif" w:hAnsi="CMU Serif" w:cs="CMU Serif"/>
           <w:color w:val="0F766E"/>
         </w:rPr>
-        <w:lastRenderedPageBreak/>
         <w:t>Answer Part 2: Tests</w:t>
       </w:r>
     </w:p>
@@ -3536,7 +3828,7 @@
       <w:pPr>
         <w:spacing w:before="40" w:after="120"/>
         <w:rPr>
-          <w:rFonts w:ascii="CMU Serif" w:hAnsi="CMU Serif" w:cs="Cordia New" w:hint="cs"/>
+          <w:rFonts w:ascii="CMU Serif" w:hAnsi="CMU Serif" w:cs="Cordia New"/>
           <w:cs/>
           <w:lang w:bidi="th-TH"/>
         </w:rPr>
@@ -3554,23 +3846,7 @@
           <w:sz w:val="17"/>
         </w:rPr>
         <w:br/>
-        <w:t xml:space="preserve">&gt; </w:t>
-      </w:r>
-      <w:proofErr w:type="spellStart"/>
-      <w:r>
-        <w:rPr>
-          <w:rFonts w:ascii="CMU Serif" w:hAnsi="CMU Serif" w:cs="CMU Serif"/>
-          <w:sz w:val="17"/>
-        </w:rPr>
-        <w:t>vitest</w:t>
-      </w:r>
-      <w:proofErr w:type="spellEnd"/>
-      <w:r>
-        <w:rPr>
-          <w:rFonts w:ascii="CMU Serif" w:hAnsi="CMU Serif" w:cs="CMU Serif"/>
-          <w:sz w:val="17"/>
-        </w:rPr>
-        <w:t xml:space="preserve"> run</w:t>
+        <w:t>&gt; vitest run</w:t>
       </w:r>
       <w:r>
         <w:rPr>
@@ -3599,23 +3875,7 @@
           <w:rFonts w:ascii="CMU Serif" w:hAnsi="CMU Serif" w:cs="CMU Serif"/>
           <w:sz w:val="17"/>
         </w:rPr>
-        <w:t xml:space="preserve"> tests/lab-01/</w:t>
-      </w:r>
-      <w:proofErr w:type="spellStart"/>
-      <w:r>
-        <w:rPr>
-          <w:rFonts w:ascii="CMU Serif" w:hAnsi="CMU Serif" w:cs="CMU Serif"/>
-          <w:sz w:val="17"/>
-        </w:rPr>
-        <w:t>health.test.ts</w:t>
-      </w:r>
-      <w:proofErr w:type="spellEnd"/>
-      <w:r>
-        <w:rPr>
-          <w:rFonts w:ascii="CMU Serif" w:hAnsi="CMU Serif" w:cs="CMU Serif"/>
-          <w:sz w:val="17"/>
-        </w:rPr>
-        <w:t xml:space="preserve"> (1 test) 20ms</w:t>
+        <w:t xml:space="preserve"> tests/lab-01/health.test.ts (1 test) 20ms</w:t>
       </w:r>
       <w:r>
         <w:rPr>
@@ -3637,23 +3897,7 @@
           <w:rFonts w:ascii="CMU Serif" w:hAnsi="CMU Serif" w:cs="CMU Serif"/>
           <w:sz w:val="17"/>
         </w:rPr>
-        <w:t xml:space="preserve"> tests/lab-01/</w:t>
-      </w:r>
-      <w:proofErr w:type="spellStart"/>
-      <w:r>
-        <w:rPr>
-          <w:rFonts w:ascii="CMU Serif" w:hAnsi="CMU Serif" w:cs="CMU Serif"/>
-          <w:sz w:val="17"/>
-        </w:rPr>
-        <w:t>categories.test.ts</w:t>
-      </w:r>
-      <w:proofErr w:type="spellEnd"/>
-      <w:r>
-        <w:rPr>
-          <w:rFonts w:ascii="CMU Serif" w:hAnsi="CMU Serif" w:cs="CMU Serif"/>
-          <w:sz w:val="17"/>
-        </w:rPr>
-        <w:t xml:space="preserve"> (1 test) 194ms</w:t>
+        <w:t xml:space="preserve"> tests/lab-01/categories.test.ts (1 test) 194ms</w:t>
       </w:r>
       <w:r>
         <w:rPr>
@@ -3744,6 +3988,7 @@
       <w:r>
         <w:rPr>
           <w:rFonts w:ascii="CMU Serif" w:hAnsi="CMU Serif" w:cs="Cordia New"/>
+          <w:noProof/>
           <w:cs/>
           <w:lang w:bidi="th-TH"/>
         </w:rPr>
@@ -3920,7 +4165,7 @@
     <w:p>
       <w:pPr>
         <w:rPr>
-          <w:rFonts w:ascii="CMU Serif" w:hAnsi="CMU Serif" w:cs="Cordia New" w:hint="cs"/>
+          <w:rFonts w:ascii="CMU Serif" w:hAnsi="CMU Serif" w:cs="Cordia New"/>
           <w:cs/>
           <w:lang w:bidi="th-TH"/>
         </w:rPr>
@@ -3928,6 +4173,7 @@
       <w:r>
         <w:rPr>
           <w:rFonts w:ascii="CMU Serif" w:hAnsi="CMU Serif" w:cs="Cordia New"/>
+          <w:noProof/>
           <w:cs/>
           <w:lang w:bidi="th-TH"/>
         </w:rPr>
@@ -4264,7 +4510,6 @@
               <w:rPr>
                 <w:rFonts w:ascii="CMU Serif" w:hAnsi="CMU Serif" w:cs="CMU Serif"/>
               </w:rPr>
-              <w:lastRenderedPageBreak/>
               <w:t>2</w:t>
             </w:r>
           </w:p>
@@ -4996,7 +5241,8 @@
       <w:pPr>
         <w:spacing w:before="160"/>
         <w:rPr>
-          <w:rFonts w:ascii="CMU Serif" w:hAnsi="CMU Serif" w:cs="CMU Serif"/>
+          <w:rFonts w:ascii="CMU Serif" w:hAnsi="CMU Serif" w:cs="Cordia New"/>
+          <w:lang w:bidi="th-TH"/>
         </w:rPr>
       </w:pPr>
       <w:r>
@@ -5018,7 +5264,222 @@
           <w:rFonts w:ascii="CMU Serif" w:hAnsi="CMU Serif" w:cs="CMU Serif"/>
           <w:i/>
         </w:rPr>
-        <w:t>“Providing structured prompt contexts with explicit acceptance criteria, expected JSON response formats, and clear Git branch instructions allowed the agent to implement endpoints and test assertions accurately in one shot. When handling Windows PowerShell syntax nuances and database connection configurations, detailing the local environment parameters ensured that database migrations, seed scripts, and test suites executed reliably without errors.”</w:t>
+        <w:t xml:space="preserve">“Providing structured prompt contexts with explicit acceptance criteria, expected JSON response formats, and clear Git branch instructions allowed the agent to implement endpoints and test assertions accurately in one shot. When handling Windows PowerShell syntax nuances and database connection configurations, detailing the local environment parameters ensured that database migrations, seed scripts, and test suites executed reliably without </w:t>
+      </w:r>
+      <w:proofErr w:type="gramStart"/>
+      <w:r>
+        <w:rPr>
+          <w:rFonts w:ascii="CMU Serif" w:hAnsi="CMU Serif" w:cs="CMU Serif"/>
+          <w:i/>
+        </w:rPr>
+        <w:t>errors.”</w:t>
+      </w:r>
+      <w:proofErr w:type="gramEnd"/>
+      <w:r>
+        <w:rPr>
+          <w:rFonts w:ascii="CMU Serif" w:hAnsi="CMU Serif" w:cs="Cordia New"/>
+          <w:cs/>
+          <w:lang w:bidi="th-TH"/>
+        </w:rPr>
+        <w:t xml:space="preserve"> </w:t>
+      </w:r>
+    </w:p>
+    <w:p>
+      <w:pPr>
+        <w:spacing w:before="160"/>
+        <w:rPr>
+          <w:rFonts w:ascii="CMU Serif" w:hAnsi="CMU Serif" w:cs="Cordia New"/>
+          <w:color w:val="4F6228" w:themeColor="accent3" w:themeShade="80"/>
+          <w:lang w:bidi="th-TH"/>
+        </w:rPr>
+      </w:pPr>
+      <w:r>
+        <w:rPr>
+          <w:rFonts w:ascii="CMU Serif" w:hAnsi="CMU Serif" w:cs="Cordia New"/>
+          <w:color w:val="4F6228" w:themeColor="accent3" w:themeShade="80"/>
+          <w:lang w:bidi="th-TH"/>
+        </w:rPr>
+        <w:t>https://github.com/natthakamol</w:t>
+      </w:r>
+      <w:r>
+        <w:rPr>
+          <w:rFonts w:ascii="CMU Serif" w:hAnsi="CMU Serif" w:cs="Cordia New"/>
+          <w:color w:val="4F6228" w:themeColor="accent3" w:themeShade="80"/>
+          <w:cs/>
+          <w:lang w:bidi="th-TH"/>
+        </w:rPr>
+        <w:t>1130/</w:t>
+      </w:r>
+      <w:r>
+        <w:rPr>
+          <w:rFonts w:ascii="CMU Serif" w:hAnsi="CMU Serif" w:cs="Cordia New"/>
+          <w:color w:val="4F6228" w:themeColor="accent3" w:themeShade="80"/>
+          <w:lang w:bidi="th-TH"/>
+        </w:rPr>
+        <w:t>toktickit/blob/lab</w:t>
+      </w:r>
+      <w:r>
+        <w:rPr>
+          <w:rFonts w:ascii="CMU Serif" w:hAnsi="CMU Serif" w:cs="Cordia New"/>
+          <w:color w:val="4F6228" w:themeColor="accent3" w:themeShade="80"/>
+          <w:cs/>
+          <w:lang w:bidi="th-TH"/>
+        </w:rPr>
+        <w:t>1-</w:t>
+      </w:r>
+      <w:r>
+        <w:rPr>
+          <w:rFonts w:ascii="CMU Serif" w:hAnsi="CMU Serif" w:cs="Cordia New"/>
+          <w:color w:val="4F6228" w:themeColor="accent3" w:themeShade="80"/>
+          <w:lang w:bidi="th-TH"/>
+        </w:rPr>
+        <w:t>staging/docs/lab-</w:t>
+      </w:r>
+      <w:r>
+        <w:rPr>
+          <w:rFonts w:ascii="CMU Serif" w:hAnsi="CMU Serif" w:cs="Cordia New"/>
+          <w:color w:val="4F6228" w:themeColor="accent3" w:themeShade="80"/>
+          <w:cs/>
+          <w:lang w:bidi="th-TH"/>
+        </w:rPr>
+        <w:t>01/</w:t>
+      </w:r>
+      <w:r>
+        <w:rPr>
+          <w:rFonts w:ascii="CMU Serif" w:hAnsi="CMU Serif" w:cs="Cordia New"/>
+          <w:color w:val="4F6228" w:themeColor="accent3" w:themeShade="80"/>
+          <w:lang w:bidi="th-TH"/>
+        </w:rPr>
+        <w:t>tests.md</w:t>
+      </w:r>
+    </w:p>
+    <w:p>
+      <w:pPr>
+        <w:spacing w:before="160"/>
+        <w:rPr>
+          <w:rFonts w:ascii="CMU Serif" w:hAnsi="CMU Serif" w:cs="Cordia New"/>
+          <w:i/>
+          <w:lang w:bidi="th-TH"/>
+        </w:rPr>
+      </w:pPr>
+      <w:r>
+        <w:rPr>
+          <w:rFonts w:ascii="CMU Serif" w:hAnsi="CMU Serif" w:cs="Cordia New"/>
+          <w:noProof/>
+          <w:cs/>
+          <w:lang w:bidi="th-TH"/>
+        </w:rPr>
+        <w:drawing>
+          <wp:anchor distT="0" distB="0" distL="114300" distR="114300" simplePos="0" relativeHeight="251660800" behindDoc="1" locked="0" layoutInCell="1" allowOverlap="1" wp14:anchorId="3B44203D" wp14:editId="4862DDD4">
+            <wp:simplePos x="0" y="0"/>
+            <wp:positionH relativeFrom="column">
+              <wp:posOffset>2867</wp:posOffset>
+            </wp:positionH>
+            <wp:positionV relativeFrom="paragraph">
+              <wp:posOffset>11687</wp:posOffset>
+            </wp:positionV>
+            <wp:extent cx="3001645" cy="3089275"/>
+            <wp:effectExtent l="0" t="0" r="8255" b="0"/>
+            <wp:wrapTight wrapText="bothSides">
+              <wp:wrapPolygon edited="0">
+                <wp:start x="0" y="0"/>
+                <wp:lineTo x="0" y="21445"/>
+                <wp:lineTo x="21522" y="21445"/>
+                <wp:lineTo x="21522" y="0"/>
+                <wp:lineTo x="0" y="0"/>
+              </wp:wrapPolygon>
+            </wp:wrapTight>
+            <wp:docPr id="1316883243" name="Picture 1"/>
+            <wp:cNvGraphicFramePr>
+              <a:graphicFrameLocks xmlns:a="http://schemas.openxmlformats.org/drawingml/2006/main" noChangeAspect="1"/>
+            </wp:cNvGraphicFramePr>
+            <a:graphic xmlns:a="http://schemas.openxmlformats.org/drawingml/2006/main">
+              <a:graphicData uri="http://schemas.openxmlformats.org/drawingml/2006/picture">
+                <pic:pic xmlns:pic="http://schemas.openxmlformats.org/drawingml/2006/picture">
+                  <pic:nvPicPr>
+                    <pic:cNvPr id="1316883243" name=""/>
+                    <pic:cNvPicPr/>
+                  </pic:nvPicPr>
+                  <pic:blipFill rotWithShape="1">
+                    <a:blip r:embed="rId22"/>
+                    <a:srcRect r="32106"/>
+                    <a:stretch>
+                      <a:fillRect/>
+                    </a:stretch>
+                  </pic:blipFill>
+                  <pic:spPr bwMode="auto">
+                    <a:xfrm>
+                      <a:off x="0" y="0"/>
+                      <a:ext cx="3001645" cy="3089275"/>
+                    </a:xfrm>
+                    <a:prstGeom prst="rect">
+                      <a:avLst/>
+                    </a:prstGeom>
+                    <a:ln>
+                      <a:noFill/>
+                    </a:ln>
+                    <a:extLst>
+                      <a:ext uri="{53640926-AAD7-44D8-BBD7-CCE9431645EC}">
+                        <a14:shadowObscured xmlns:a14="http://schemas.microsoft.com/office/drawing/2010/main"/>
+                      </a:ext>
+                    </a:extLst>
+                  </pic:spPr>
+                </pic:pic>
+              </a:graphicData>
+            </a:graphic>
+            <wp14:sizeRelH relativeFrom="margin">
+              <wp14:pctWidth>0</wp14:pctWidth>
+            </wp14:sizeRelH>
+            <wp14:sizeRelV relativeFrom="margin">
+              <wp14:pctHeight>0</wp14:pctHeight>
+            </wp14:sizeRelV>
+          </wp:anchor>
+        </w:drawing>
+      </w:r>
+      <w:r>
+        <w:rPr>
+          <w:rFonts w:ascii="CMU Serif" w:hAnsi="CMU Serif" w:cs="Cordia New"/>
+          <w:noProof/>
+          <w:color w:val="0F766E"/>
+          <w:szCs w:val="35"/>
+          <w:cs/>
+          <w:lang w:bidi="th-TH"/>
+        </w:rPr>
+        <w:drawing>
+          <wp:inline distT="0" distB="0" distL="0" distR="0" wp14:anchorId="1001DCAC" wp14:editId="7F296A51">
+            <wp:extent cx="3334008" cy="1363639"/>
+            <wp:effectExtent l="0" t="0" r="0" b="8255"/>
+            <wp:docPr id="1967561722" name="Picture 1"/>
+            <wp:cNvGraphicFramePr>
+              <a:graphicFrameLocks xmlns:a="http://schemas.openxmlformats.org/drawingml/2006/main" noChangeAspect="1"/>
+            </wp:cNvGraphicFramePr>
+            <a:graphic xmlns:a="http://schemas.openxmlformats.org/drawingml/2006/main">
+              <a:graphicData uri="http://schemas.openxmlformats.org/drawingml/2006/picture">
+                <pic:pic xmlns:pic="http://schemas.openxmlformats.org/drawingml/2006/picture">
+                  <pic:nvPicPr>
+                    <pic:cNvPr id="1967561722" name=""/>
+                    <pic:cNvPicPr/>
+                  </pic:nvPicPr>
+                  <pic:blipFill>
+                    <a:blip r:embed="rId23"/>
+                    <a:stretch>
+                      <a:fillRect/>
+                    </a:stretch>
+                  </pic:blipFill>
+                  <pic:spPr>
+                    <a:xfrm>
+                      <a:off x="0" y="0"/>
+                      <a:ext cx="3338378" cy="1365426"/>
+                    </a:xfrm>
+                    <a:prstGeom prst="rect">
+                      <a:avLst/>
+                    </a:prstGeom>
+                  </pic:spPr>
+                </pic:pic>
+              </a:graphicData>
+            </a:graphic>
+          </wp:inline>
+        </w:drawing>
       </w:r>
     </w:p>
     <w:p>
@@ -5026,19 +5487,63 @@
         <w:pStyle w:val="Heading1"/>
         <w:spacing w:before="360" w:after="160"/>
         <w:rPr>
-          <w:rFonts w:ascii="CMU Serif" w:hAnsi="CMU Serif" w:cs="CMU Serif"/>
+          <w:rFonts w:ascii="CMU Serif" w:hAnsi="CMU Serif" w:cs="Cordia New"/>
+          <w:color w:val="0F766E"/>
+          <w:szCs w:val="35"/>
+          <w:lang w:bidi="th-TH"/>
         </w:rPr>
       </w:pPr>
       <w:r>
         <w:rPr>
-          <w:rFonts w:ascii="CMU Serif" w:hAnsi="CMU Serif" w:cs="CMU Serif"/>
+          <w:rFonts w:ascii="CMU Serif" w:hAnsi="CMU Serif" w:cs="Cordia New"/>
+          <w:noProof/>
           <w:color w:val="0F766E"/>
-        </w:rPr>
-        <w:t>Answer Part 4: App Demo</w:t>
+          <w:szCs w:val="35"/>
+          <w:cs/>
+          <w:lang w:bidi="th-TH"/>
+        </w:rPr>
+        <w:lastRenderedPageBreak/>
+        <w:drawing>
+          <wp:inline distT="0" distB="0" distL="0" distR="0" wp14:anchorId="3FD27910" wp14:editId="23B2FB99">
+            <wp:extent cx="4801836" cy="4035359"/>
+            <wp:effectExtent l="0" t="0" r="0" b="3810"/>
+            <wp:docPr id="42215134" name="Picture 1"/>
+            <wp:cNvGraphicFramePr>
+              <a:graphicFrameLocks xmlns:a="http://schemas.openxmlformats.org/drawingml/2006/main" noChangeAspect="1"/>
+            </wp:cNvGraphicFramePr>
+            <a:graphic xmlns:a="http://schemas.openxmlformats.org/drawingml/2006/main">
+              <a:graphicData uri="http://schemas.openxmlformats.org/drawingml/2006/picture">
+                <pic:pic xmlns:pic="http://schemas.openxmlformats.org/drawingml/2006/picture">
+                  <pic:nvPicPr>
+                    <pic:cNvPr id="42215134" name=""/>
+                    <pic:cNvPicPr/>
+                  </pic:nvPicPr>
+                  <pic:blipFill>
+                    <a:blip r:embed="rId24"/>
+                    <a:stretch>
+                      <a:fillRect/>
+                    </a:stretch>
+                  </pic:blipFill>
+                  <pic:spPr>
+                    <a:xfrm>
+                      <a:off x="0" y="0"/>
+                      <a:ext cx="4807196" cy="4039864"/>
+                    </a:xfrm>
+                    <a:prstGeom prst="rect">
+                      <a:avLst/>
+                    </a:prstGeom>
+                  </pic:spPr>
+                </pic:pic>
+              </a:graphicData>
+            </a:graphic>
+          </wp:inline>
+        </w:drawing>
       </w:r>
     </w:p>
     <w:p>
       <w:pPr>
+        <w:pStyle w:val="Heading1"/>
+        <w:spacing w:before="360" w:after="160"/>
         <w:rPr>
           <w:rFonts w:ascii="CMU Serif" w:hAnsi="CMU Serif" w:cs="CMU Serif"/>
         </w:rPr>
@@ -5046,65 +5551,80 @@
       <w:r>
         <w:rPr>
           <w:rFonts w:ascii="CMU Serif" w:hAnsi="CMU Serif" w:cs="CMU Serif"/>
-          <w:b/>
-        </w:rPr>
-        <w:t>1. Initial Screen State</w:t>
+          <w:color w:val="0F766E"/>
+        </w:rPr>
+        <w:t>Answer Part 4: App Demo</w:t>
       </w:r>
     </w:p>
     <w:p>
       <w:pPr>
         <w:rPr>
-          <w:rFonts w:ascii="CMU Serif" w:hAnsi="CMU Serif" w:cs="Cordia New" w:hint="cs"/>
-          <w:lang w:bidi="th-TH"/>
+          <w:rFonts w:ascii="CMU Serif" w:hAnsi="CMU Serif" w:cs="CMU Serif"/>
         </w:rPr>
       </w:pPr>
       <w:r>
         <w:rPr>
-          <w:rFonts w:ascii="Browallia New" w:hAnsi="Browallia New" w:cs="Browallia New"/>
-        </w:rPr>
-        <w:t>หน้าจอเริ่มต้นเมื่อเปิด</w:t>
-      </w:r>
-      <w:r>
-        <w:rPr>
-          <w:rFonts w:ascii="CMU Serif" w:hAnsi="CMU Serif" w:cs="CMU Serif"/>
-        </w:rPr>
-        <w:t xml:space="preserve"> Web Application </w:t>
-      </w:r>
-      <w:r>
-        <w:rPr>
-          <w:rFonts w:ascii="Browallia New" w:hAnsi="Browallia New" w:cs="Browallia New"/>
-        </w:rPr>
-        <w:t>มีข้อความหัวข้อ</w:t>
-      </w:r>
-      <w:r>
-        <w:rPr>
-          <w:rFonts w:ascii="CMU Serif" w:hAnsi="CMU Serif" w:cs="CMU Serif"/>
-        </w:rPr>
-        <w:t xml:space="preserve"> TokTickIT IT Service Desk </w:t>
-      </w:r>
-      <w:r>
-        <w:rPr>
-          <w:rFonts w:ascii="Browallia New" w:hAnsi="Browallia New" w:cs="Browallia New"/>
-        </w:rPr>
-        <w:t>และปุ่ม</w:t>
-      </w:r>
-      <w:r>
-        <w:rPr>
-          <w:rFonts w:ascii="CMU Serif" w:hAnsi="CMU Serif" w:cs="CMU Serif"/>
-        </w:rPr>
-        <w:t xml:space="preserve"> [Check System]</w:t>
+          <w:rFonts w:ascii="CMU Serif" w:hAnsi="CMU Serif" w:cs="CMU Serif"/>
+          <w:b/>
+        </w:rPr>
+        <w:t>1. Initial Screen State</w:t>
       </w:r>
     </w:p>
     <w:p>
       <w:pPr>
         <w:rPr>
-          <w:rFonts w:ascii="CMU Serif" w:hAnsi="CMU Serif" w:cs="Cordia New" w:hint="cs"/>
+          <w:rFonts w:ascii="CMU Serif" w:hAnsi="CMU Serif" w:cs="Cordia New"/>
           <w:lang w:bidi="th-TH"/>
         </w:rPr>
       </w:pPr>
       <w:r>
         <w:rPr>
-          <w:rFonts w:ascii="CMU Serif" w:hAnsi="CMU Serif" w:cs="CMU Serif"/>
+          <w:rFonts w:ascii="Browallia New" w:hAnsi="Browallia New" w:cs="Browallia New"/>
+        </w:rPr>
+        <w:t>หน้าจอเริ่มต้นเมื่อเปิด</w:t>
+      </w:r>
+      <w:r>
+        <w:rPr>
+          <w:rFonts w:ascii="CMU Serif" w:hAnsi="CMU Serif" w:cs="CMU Serif"/>
+        </w:rPr>
+        <w:t xml:space="preserve"> Web Application </w:t>
+      </w:r>
+      <w:r>
+        <w:rPr>
+          <w:rFonts w:ascii="Browallia New" w:hAnsi="Browallia New" w:cs="Browallia New"/>
+        </w:rPr>
+        <w:t>มีข้อความหัวข้อ</w:t>
+      </w:r>
+      <w:r>
+        <w:rPr>
+          <w:rFonts w:ascii="CMU Serif" w:hAnsi="CMU Serif" w:cs="CMU Serif"/>
+        </w:rPr>
+        <w:t xml:space="preserve"> TokTickIT IT Service Desk </w:t>
+      </w:r>
+      <w:r>
+        <w:rPr>
+          <w:rFonts w:ascii="Browallia New" w:hAnsi="Browallia New" w:cs="Browallia New"/>
+        </w:rPr>
+        <w:t>และปุ่ม</w:t>
+      </w:r>
+      <w:r>
+        <w:rPr>
+          <w:rFonts w:ascii="CMU Serif" w:hAnsi="CMU Serif" w:cs="CMU Serif"/>
+        </w:rPr>
+        <w:t xml:space="preserve"> [Check System]</w:t>
+      </w:r>
+    </w:p>
+    <w:p>
+      <w:pPr>
+        <w:rPr>
+          <w:rFonts w:ascii="CMU Serif" w:hAnsi="CMU Serif" w:cs="Cordia New"/>
+          <w:lang w:bidi="th-TH"/>
+        </w:rPr>
+      </w:pPr>
+      <w:r>
+        <w:rPr>
+          <w:rFonts w:ascii="CMU Serif" w:hAnsi="CMU Serif" w:cs="CMU Serif"/>
+          <w:noProof/>
         </w:rPr>
         <w:drawing>
           <wp:inline distT="0" distB="0" distL="0" distR="0" wp14:anchorId="24680F55" wp14:editId="4B538EE3">
@@ -5122,7 +5642,7 @@
                     <pic:cNvPicPr/>
                   </pic:nvPicPr>
                   <pic:blipFill rotWithShape="1">
-                    <a:blip r:embed="rId22"/>
+                    <a:blip r:embed="rId25"/>
                     <a:srcRect t="8225" b="60944"/>
                     <a:stretch>
                       <a:fillRect/>
@@ -5169,10 +5689,10 @@
     <w:p>
       <w:pPr>
         <w:rPr>
-          <w:rFonts w:ascii="CMU Serif" w:hAnsi="CMU Serif" w:cs="CMU Serif"/>
+          <w:rFonts w:ascii="CMU Serif" w:hAnsi="CMU Serif" w:cs="Cordia New"/>
+          <w:lang w:bidi="th-TH"/>
         </w:rPr>
       </w:pPr>
-      <w:proofErr w:type="spellStart"/>
       <w:r>
         <w:rPr>
           <w:rFonts w:ascii="Browallia New" w:hAnsi="Browallia New" w:cs="Browallia New"/>
@@ -5180,14 +5700,12 @@
         </w:rPr>
         <w:t>เมื่อกดปุ่ม</w:t>
       </w:r>
-      <w:proofErr w:type="spellEnd"/>
       <w:r>
         <w:rPr>
           <w:rFonts w:ascii="CMU Serif" w:hAnsi="CMU Serif" w:cs="CMU Serif"/>
         </w:rPr>
         <w:t xml:space="preserve"> [Check System] </w:t>
       </w:r>
-      <w:proofErr w:type="spellStart"/>
       <w:r>
         <w:rPr>
           <w:rFonts w:ascii="Browallia New" w:hAnsi="Browallia New" w:cs="Browallia New"/>
@@ -5195,14 +5713,12 @@
         </w:rPr>
         <w:t>โดยเปิด</w:t>
       </w:r>
-      <w:proofErr w:type="spellEnd"/>
       <w:r>
         <w:rPr>
           <w:rFonts w:ascii="CMU Serif" w:hAnsi="CMU Serif" w:cs="CMU Serif"/>
         </w:rPr>
         <w:t xml:space="preserve"> Backend Server </w:t>
       </w:r>
-      <w:proofErr w:type="spellStart"/>
       <w:r>
         <w:rPr>
           <w:rFonts w:ascii="Browallia New" w:hAnsi="Browallia New" w:cs="Browallia New"/>
@@ -5210,14 +5726,12 @@
         </w:rPr>
         <w:t>และ</w:t>
       </w:r>
-      <w:proofErr w:type="spellEnd"/>
       <w:r>
         <w:rPr>
           <w:rFonts w:ascii="CMU Serif" w:hAnsi="CMU Serif" w:cs="CMU Serif"/>
         </w:rPr>
         <w:t xml:space="preserve"> Database </w:t>
       </w:r>
-      <w:proofErr w:type="spellStart"/>
       <w:r>
         <w:rPr>
           <w:rFonts w:ascii="Browallia New" w:hAnsi="Browallia New" w:cs="Browallia New"/>
@@ -5225,14 +5739,12 @@
         </w:rPr>
         <w:t>ปกติ</w:t>
       </w:r>
-      <w:proofErr w:type="spellEnd"/>
       <w:r>
         <w:rPr>
           <w:rFonts w:ascii="CMU Serif" w:hAnsi="CMU Serif" w:cs="CMU Serif"/>
         </w:rPr>
         <w:t xml:space="preserve"> </w:t>
       </w:r>
-      <w:proofErr w:type="spellStart"/>
       <w:r>
         <w:rPr>
           <w:rFonts w:ascii="Browallia New" w:hAnsi="Browallia New" w:cs="Browallia New"/>
@@ -5240,14 +5752,12 @@
         </w:rPr>
         <w:t>ระบบแสดงผลสถานะ</w:t>
       </w:r>
-      <w:proofErr w:type="spellEnd"/>
       <w:r>
         <w:rPr>
           <w:rFonts w:ascii="CMU Serif" w:hAnsi="CMU Serif" w:cs="CMU Serif"/>
         </w:rPr>
         <w:t xml:space="preserve"> System Status: Online </w:t>
       </w:r>
-      <w:proofErr w:type="spellStart"/>
       <w:r>
         <w:rPr>
           <w:rFonts w:ascii="Browallia New" w:hAnsi="Browallia New" w:cs="Browallia New"/>
@@ -5255,14 +5765,12 @@
         </w:rPr>
         <w:t>พร้อมรายการ</w:t>
       </w:r>
-      <w:proofErr w:type="spellEnd"/>
       <w:r>
         <w:rPr>
           <w:rFonts w:ascii="CMU Serif" w:hAnsi="CMU Serif" w:cs="CMU Serif"/>
         </w:rPr>
         <w:t xml:space="preserve"> 4 </w:t>
       </w:r>
-      <w:proofErr w:type="spellStart"/>
       <w:r>
         <w:rPr>
           <w:rFonts w:ascii="Browallia New" w:hAnsi="Browallia New" w:cs="Browallia New"/>
@@ -5270,29 +5778,35 @@
         </w:rPr>
         <w:t>หมวดหมู่</w:t>
       </w:r>
-      <w:proofErr w:type="spellEnd"/>
       <w:r>
         <w:rPr>
           <w:rFonts w:ascii="CMU Serif" w:hAnsi="CMU Serif" w:cs="CMU Serif"/>
         </w:rPr>
         <w:t xml:space="preserve"> (1. Account and Access, 2. Hardware, 3. Software, 4. Network)</w:t>
+      </w:r>
+      <w:r>
+        <w:rPr>
+          <w:rFonts w:ascii="CMU Serif" w:hAnsi="CMU Serif" w:cs="CMU Serif"/>
+        </w:rPr>
+        <w:t xml:space="preserve"> </w:t>
       </w:r>
     </w:p>
     <w:p>
       <w:pPr>
         <w:rPr>
-          <w:rFonts w:ascii="CMU Serif" w:hAnsi="CMU Serif" w:cs="CMU Serif"/>
+          <w:rFonts w:ascii="CMU Serif" w:hAnsi="CMU Serif" w:cs="Cordia New"/>
+          <w:lang w:bidi="th-TH"/>
         </w:rPr>
       </w:pPr>
       <w:r>
         <w:rPr>
           <w:rFonts w:ascii="CMU Serif" w:hAnsi="CMU Serif" w:cs="CMU Serif"/>
-        </w:rPr>
-        <w:lastRenderedPageBreak/>
+          <w:noProof/>
+        </w:rPr>
         <w:drawing>
-          <wp:inline distT="0" distB="0" distL="0" distR="0" wp14:anchorId="1FFA30E2" wp14:editId="7DB17487">
-            <wp:extent cx="2435311" cy="1977510"/>
-            <wp:effectExtent l="0" t="0" r="3175" b="3810"/>
+          <wp:inline distT="0" distB="0" distL="0" distR="0" wp14:anchorId="673A9ACE" wp14:editId="4070A7A5">
+            <wp:extent cx="2434590" cy="1556542"/>
+            <wp:effectExtent l="0" t="0" r="3810" b="5715"/>
             <wp:docPr id="2011047818" name="Picture 1"/>
             <wp:cNvGraphicFramePr>
               <a:graphicFrameLocks xmlns:a="http://schemas.openxmlformats.org/drawingml/2006/main" noChangeAspect="1"/>
@@ -5304,8 +5818,170 @@
                     <pic:cNvPr id="2011047818" name=""/>
                     <pic:cNvPicPr/>
                   </pic:nvPicPr>
+                  <pic:blipFill rotWithShape="1">
+                    <a:blip r:embed="rId25"/>
+                    <a:srcRect t="9167" b="12098"/>
+                    <a:stretch>
+                      <a:fillRect/>
+                    </a:stretch>
+                  </pic:blipFill>
+                  <pic:spPr bwMode="auto">
+                    <a:xfrm>
+                      <a:off x="0" y="0"/>
+                      <a:ext cx="2445969" cy="1563817"/>
+                    </a:xfrm>
+                    <a:prstGeom prst="rect">
+                      <a:avLst/>
+                    </a:prstGeom>
+                    <a:ln>
+                      <a:noFill/>
+                    </a:ln>
+                    <a:extLst>
+                      <a:ext uri="{53640926-AAD7-44D8-BBD7-CCE9431645EC}">
+                        <a14:shadowObscured xmlns:a14="http://schemas.microsoft.com/office/drawing/2010/main"/>
+                      </a:ext>
+                    </a:extLst>
+                  </pic:spPr>
+                </pic:pic>
+              </a:graphicData>
+            </a:graphic>
+          </wp:inline>
+        </w:drawing>
+      </w:r>
+    </w:p>
+    <w:p>
+      <w:pPr>
+        <w:rPr>
+          <w:rFonts w:ascii="CMU Serif" w:hAnsi="CMU Serif" w:cs="Cordia New"/>
+          <w:lang w:bidi="th-TH"/>
+        </w:rPr>
+      </w:pPr>
+      <w:r>
+        <w:rPr>
+          <w:rFonts w:ascii="CMU Serif" w:hAnsi="CMU Serif" w:cs="Cordia New"/>
+          <w:b/>
+          <w:bCs/>
+          <w:lang w:bidi="th-TH"/>
+        </w:rPr>
+        <w:lastRenderedPageBreak/>
+        <w:t>3. Failure Case (Backend Offline / DB Disconnected)</w:t>
+      </w:r>
+    </w:p>
+    <w:p>
+      <w:pPr>
+        <w:rPr>
+          <w:rFonts w:ascii="CMU Serif" w:hAnsi="CMU Serif" w:cs="Cordia New"/>
+          <w:lang w:bidi="th-TH"/>
+        </w:rPr>
+      </w:pPr>
+      <w:r>
+        <w:rPr>
+          <w:rFonts w:ascii="CMU Serif" w:hAnsi="CMU Serif" w:cs="Cordia New"/>
+          <w:cs/>
+          <w:lang w:bidi="th-TH"/>
+        </w:rPr>
+        <w:t>เมื่อกดปุ่ม</w:t>
+      </w:r>
+      <w:r>
+        <w:rPr>
+          <w:rFonts w:ascii="CMU Serif" w:hAnsi="CMU Serif" w:cs="Cordia New"/>
+          <w:lang w:bidi="th-TH"/>
+        </w:rPr>
+        <w:t xml:space="preserve"> `[Check System]` </w:t>
+      </w:r>
+      <w:r>
+        <w:rPr>
+          <w:rFonts w:ascii="CMU Serif" w:hAnsi="CMU Serif" w:cs="Cordia New"/>
+          <w:cs/>
+          <w:lang w:bidi="th-TH"/>
+        </w:rPr>
+        <w:t xml:space="preserve">ในขณะที่ </w:t>
+      </w:r>
+      <w:r>
+        <w:rPr>
+          <w:rFonts w:ascii="CMU Serif" w:hAnsi="CMU Serif" w:cs="Cordia New"/>
+          <w:lang w:bidi="th-TH"/>
+        </w:rPr>
+        <w:t xml:space="preserve">Backend Server </w:t>
+      </w:r>
+      <w:r>
+        <w:rPr>
+          <w:rFonts w:ascii="CMU Serif" w:hAnsi="CMU Serif" w:cs="Cordia New"/>
+          <w:cs/>
+          <w:lang w:bidi="th-TH"/>
+        </w:rPr>
+        <w:t xml:space="preserve">หรือ </w:t>
+      </w:r>
+      <w:r>
+        <w:rPr>
+          <w:rFonts w:ascii="CMU Serif" w:hAnsi="CMU Serif" w:cs="Cordia New"/>
+          <w:lang w:bidi="th-TH"/>
+        </w:rPr>
+        <w:t xml:space="preserve">Database </w:t>
+      </w:r>
+      <w:r>
+        <w:rPr>
+          <w:rFonts w:ascii="CMU Serif" w:hAnsi="CMU Serif" w:cs="Cordia New"/>
+          <w:cs/>
+          <w:lang w:bidi="th-TH"/>
+        </w:rPr>
+        <w:t>ปิดอยู่ หน้าจอจะแสดงสถานะ</w:t>
+      </w:r>
+      <w:r>
+        <w:rPr>
+          <w:rFonts w:ascii="CMU Serif" w:hAnsi="CMU Serif" w:cs="Cordia New"/>
+          <w:lang w:bidi="th-TH"/>
+        </w:rPr>
+        <w:t xml:space="preserve"> `System Status: Offline` </w:t>
+      </w:r>
+      <w:r>
+        <w:rPr>
+          <w:rFonts w:ascii="CMU Serif" w:hAnsi="CMU Serif" w:cs="Cordia New"/>
+          <w:cs/>
+          <w:lang w:bidi="th-TH"/>
+        </w:rPr>
+        <w:t>พร้อมข้อความแจ้งเตือน</w:t>
+      </w:r>
+      <w:r>
+        <w:rPr>
+          <w:rFonts w:ascii="CMU Serif" w:hAnsi="CMU Serif" w:cs="Cordia New"/>
+          <w:lang w:bidi="th-TH"/>
+        </w:rPr>
+        <w:t xml:space="preserve"> `Unable to connect to TokTickIT API`</w:t>
+      </w:r>
+    </w:p>
+    <w:p>
+      <w:pPr>
+        <w:rPr>
+          <w:rFonts w:ascii="CMU Serif" w:hAnsi="CMU Serif" w:cs="Cordia New"/>
+          <w:cs/>
+          <w:lang w:bidi="th-TH"/>
+        </w:rPr>
+      </w:pPr>
+      <w:r>
+        <w:rPr>
+          <w:rFonts w:ascii="CMU Serif" w:hAnsi="CMU Serif" w:cs="Cordia New"/>
+          <w:noProof/>
+          <w:cs/>
+          <w:lang w:bidi="th-TH"/>
+        </w:rPr>
+        <w:drawing>
+          <wp:inline distT="0" distB="0" distL="0" distR="0" wp14:anchorId="78BE20A1" wp14:editId="6B163806">
+            <wp:extent cx="2779776" cy="1884070"/>
+            <wp:effectExtent l="0" t="0" r="1905" b="1905"/>
+            <wp:docPr id="879670374" name="Picture 1"/>
+            <wp:cNvGraphicFramePr>
+              <a:graphicFrameLocks xmlns:a="http://schemas.openxmlformats.org/drawingml/2006/main" noChangeAspect="1"/>
+            </wp:cNvGraphicFramePr>
+            <a:graphic xmlns:a="http://schemas.openxmlformats.org/drawingml/2006/main">
+              <a:graphicData uri="http://schemas.openxmlformats.org/drawingml/2006/picture">
+                <pic:pic xmlns:pic="http://schemas.openxmlformats.org/drawingml/2006/picture">
+                  <pic:nvPicPr>
+                    <pic:cNvPr id="879670374" name=""/>
+                    <pic:cNvPicPr/>
+                  </pic:nvPicPr>
                   <pic:blipFill>
-                    <a:blip r:embed="rId22"/>
+                    <a:blip r:embed="rId26"/>
                     <a:stretch>
                       <a:fillRect/>
                     </a:stretch>
@@ -5313,7 +5989,7 @@
                   <pic:spPr>
                     <a:xfrm>
                       <a:off x="0" y="0"/>
-                      <a:ext cx="2445969" cy="1986165"/>
+                      <a:ext cx="2781346" cy="1885134"/>
                     </a:xfrm>
                     <a:prstGeom prst="rect">
                       <a:avLst/>
@@ -5325,106 +6001,6 @@
           </wp:inline>
         </w:drawing>
       </w:r>
-    </w:p>
-    <w:p>
-      <w:pPr>
-        <w:rPr>
-          <w:rFonts w:ascii="CMU Serif" w:hAnsi="CMU Serif" w:cs="CMU Serif"/>
-        </w:rPr>
-      </w:pPr>
-      <w:r>
-        <w:rPr>
-          <w:rFonts w:ascii="CMU Serif" w:hAnsi="CMU Serif" w:cs="CMU Serif"/>
-          <w:b/>
-        </w:rPr>
-        <w:t>3. Failure Case (Backend Offline / API Unavailable)</w:t>
-      </w:r>
-    </w:p>
-    <w:p>
-      <w:pPr>
-        <w:rPr>
-          <w:rFonts w:ascii="CMU Serif" w:hAnsi="CMU Serif" w:cs="CMU Serif"/>
-        </w:rPr>
-      </w:pPr>
-      <w:r>
-        <w:rPr>
-          <w:rFonts w:ascii="Browallia New" w:hAnsi="Browallia New" w:cs="Browallia New"/>
-        </w:rPr>
-        <w:t>เมื่อกดปุ่ม</w:t>
-      </w:r>
-      <w:r>
-        <w:rPr>
-          <w:rFonts w:ascii="CMU Serif" w:hAnsi="CMU Serif" w:cs="CMU Serif"/>
-        </w:rPr>
-        <w:t xml:space="preserve"> [Check System] </w:t>
-      </w:r>
-      <w:r>
-        <w:rPr>
-          <w:rFonts w:ascii="Browallia New" w:hAnsi="Browallia New" w:cs="Browallia New"/>
-        </w:rPr>
-        <w:t>ในขณะที่</w:t>
-      </w:r>
-      <w:r>
-        <w:rPr>
-          <w:rFonts w:ascii="CMU Serif" w:hAnsi="CMU Serif" w:cs="CMU Serif"/>
-        </w:rPr>
-        <w:t xml:space="preserve"> Backend Server </w:t>
-      </w:r>
-      <w:r>
-        <w:rPr>
-          <w:rFonts w:ascii="Browallia New" w:hAnsi="Browallia New" w:cs="Browallia New"/>
-        </w:rPr>
-        <w:t>หรือ</w:t>
-      </w:r>
-      <w:r>
-        <w:rPr>
-          <w:rFonts w:ascii="CMU Serif" w:hAnsi="CMU Serif" w:cs="CMU Serif"/>
-        </w:rPr>
-        <w:t xml:space="preserve"> Database </w:t>
-      </w:r>
-      <w:r>
-        <w:rPr>
-          <w:rFonts w:ascii="Browallia New" w:hAnsi="Browallia New" w:cs="Browallia New"/>
-        </w:rPr>
-        <w:t>ปิดอยู่</w:t>
-      </w:r>
-      <w:r>
-        <w:rPr>
-          <w:rFonts w:ascii="CMU Serif" w:hAnsi="CMU Serif" w:cs="CMU Serif"/>
-        </w:rPr>
-        <w:t xml:space="preserve"> </w:t>
-      </w:r>
-      <w:r>
-        <w:rPr>
-          <w:rFonts w:ascii="Browallia New" w:hAnsi="Browallia New" w:cs="Browallia New"/>
-        </w:rPr>
-        <w:t>ระบบแสดงสถานะ</w:t>
-      </w:r>
-      <w:r>
-        <w:rPr>
-          <w:rFonts w:ascii="CMU Serif" w:hAnsi="CMU Serif" w:cs="CMU Serif"/>
-        </w:rPr>
-        <w:t xml:space="preserve"> System Status: Offline </w:t>
-      </w:r>
-      <w:r>
-        <w:rPr>
-          <w:rFonts w:ascii="Browallia New" w:hAnsi="Browallia New" w:cs="Browallia New"/>
-        </w:rPr>
-        <w:t>พร้อมข้อความแจ้งเตือน</w:t>
-      </w:r>
-      <w:r>
-        <w:rPr>
-          <w:rFonts w:ascii="CMU Serif" w:hAnsi="CMU Serif" w:cs="CMU Serif"/>
-        </w:rPr>
-        <w:t xml:space="preserve"> Unable to connect to TokTickIT API</w:t>
-      </w:r>
-    </w:p>
-    <w:p>
-      <w:pPr>
-        <w:rPr>
-          <w:rFonts w:ascii="CMU Serif" w:hAnsi="CMU Serif" w:cs="CMU Serif"/>
-        </w:rPr>
-      </w:pPr>
     </w:p>
     <w:sectPr>
       <w:pgSz w:w="12240" w:h="15840"/>
@@ -6247,6 +6823,7 @@
   <w:style w:type="character" w:default="1" w:styleId="DefaultParagraphFont">
     <w:name w:val="Default Paragraph Font"/>
     <w:uiPriority w:val="1"/>
+    <w:semiHidden/>
     <w:unhideWhenUsed/>
   </w:style>
   <w:style w:type="table" w:default="1" w:styleId="TableNormal">

</xml_diff>